<commit_message>
adding feedback from third parties and changes required to design
</commit_message>
<xml_diff>
--- a/Post-Prototype Refinement of Design.docx
+++ b/Post-Prototype Refinement of Design.docx
@@ -1,8 +1,8 @@
 
 <file path=word/document.xml><?xml version="1.0" encoding="utf-8"?>
-<w:document xmlns:wpc="http://schemas.microsoft.com/office/word/2010/wordprocessingCanvas" xmlns:cx="http://schemas.microsoft.com/office/drawing/2014/chartex" xmlns:cx1="http://schemas.microsoft.com/office/drawing/2015/9/8/chartex" xmlns:cx2="http://schemas.microsoft.com/office/drawing/2015/10/21/chartex" xmlns:cx3="http://schemas.microsoft.com/office/drawing/2016/5/9/chartex" xmlns:cx4="http://schemas.microsoft.com/office/drawing/2016/5/10/chartex" xmlns:cx5="http://schemas.microsoft.com/office/drawing/2016/5/11/chartex" xmlns:cx6="http://schemas.microsoft.com/office/drawing/2016/5/12/chartex" xmlns:cx7="http://schemas.microsoft.com/office/drawing/2016/5/13/chartex" xmlns:cx8="http://schemas.microsoft.com/office/drawing/2016/5/14/chartex" xmlns:mc="http://schemas.openxmlformats.org/markup-compatibility/2006" xmlns:aink="http://schemas.microsoft.com/office/drawing/2016/ink" xmlns:am3d="http://schemas.microsoft.com/office/drawing/2017/model3d" xmlns:o="urn:schemas-microsoft-com:office:office" xmlns:oel="http://schemas.microsoft.com/office/2019/extlst" xmlns:r="http://schemas.openxmlformats.org/officeDocument/2006/relationships" xmlns:m="http://schemas.openxmlformats.org/officeDocument/2006/math" xmlns:v="urn:schemas-microsoft-com:vml" xmlns:wp14="http://schemas.microsoft.com/office/word/2010/wordprocessingDrawing" xmlns:wp="http://schemas.openxmlformats.org/drawingml/2006/wordprocessingDrawing" xmlns:w10="urn:schemas-microsoft-com:office:word" xmlns:w="http://schemas.openxmlformats.org/wordprocessingml/2006/main" xmlns:w14="http://schemas.microsoft.com/office/word/2010/wordml" xmlns:w15="http://schemas.microsoft.com/office/word/2012/wordml" xmlns:w16cex="http://schemas.microsoft.com/office/word/2018/wordml/cex" xmlns:w16cid="http://schemas.microsoft.com/office/word/2016/wordml/cid" xmlns:w16="http://schemas.microsoft.com/office/word/2018/wordml" xmlns:w16du="http://schemas.microsoft.com/office/word/2023/wordml/word16du" xmlns:w16sdtdh="http://schemas.microsoft.com/office/word/2020/wordml/sdtdatahash" xmlns:w16sdtfl="http://schemas.microsoft.com/office/word/2024/wordml/sdtformatlock" xmlns:w16se="http://schemas.microsoft.com/office/word/2015/wordml/symex" xmlns:wpg="http://schemas.microsoft.com/office/word/2010/wordprocessingGroup" xmlns:wpi="http://schemas.microsoft.com/office/word/2010/wordprocessingInk" xmlns:wne="http://schemas.microsoft.com/office/word/2006/wordml" xmlns:wps="http://schemas.microsoft.com/office/word/2010/wordprocessingShape" mc:Ignorable="w14 w15 w16se w16cid w16 w16cex w16sdtdh w16sdtfl w16du wp14">
+<w:document xmlns:ns1="http://schemas.openxmlformats.org/markup-compatibility/2006" xmlns:ns2="http://schemas.microsoft.com/office/word/2010/wordml" xmlns:ns3="http://schemas.openxmlformats.org/officeDocument/2006/relationships" xmlns:w="http://schemas.openxmlformats.org/wordprocessingml/2006/main" ns1:Ignorable="w14 w15 w16se w16cid w16 w16cex w16sdtdh w16sdtfl w16du wp14">
   <w:body>
-    <w:p>
+    <w:p ns2:paraId="122523DE" ns2:textId="77777777">
       <w:pPr>
         <w:pStyle w:val="Heading1"/>
         <w:rPr>
@@ -12,7 +12,6 @@
           <w:color w:val="A02B93" w:themeColor="accent5"/>
         </w:rPr>
       </w:pPr>
-      <w:proofErr w:type="spellStart"/>
       <w:r>
         <w:rPr>
           <w:rFonts w:ascii="Aptos Display" w:eastAsia="Aptos Display" w:hAnsi="Aptos Display" w:cs="Aptos Display"/>
@@ -20,20 +19,10 @@
           <w:bCs/>
           <w:color w:val="A02B93" w:themeColor="accent5"/>
         </w:rPr>
-        <w:t>Filmtopia</w:t>
-      </w:r>
-      <w:proofErr w:type="spellEnd"/>
-      <w:r>
-        <w:rPr>
-          <w:rFonts w:ascii="Aptos Display" w:eastAsia="Aptos Display" w:hAnsi="Aptos Display" w:cs="Aptos Display"/>
-          <w:b/>
-          <w:bCs/>
-          <w:color w:val="A02B93" w:themeColor="accent5"/>
-        </w:rPr>
-        <w:t xml:space="preserve"> Project Post-Prototype Refinement of Design</w:t>
+        <w:t>Filmtopia Project Post-Prototype Refinement of Design</w:t>
       </w:r>
     </w:p>
-    <w:p>
+    <w:p ns2:paraId="35DDB99D" ns2:textId="77777777">
       <w:pPr>
         <w:spacing w:after="160" w:line="276" w:lineRule="auto"/>
       </w:pPr>
@@ -44,7 +33,7 @@
         <w:t>Now that the prototype has been built and evaluated the purpose of this section is to return to the design work carried out in section 3 and refine it in light of everything I have learned since. The original design was written before a single line of the program existed, so it was always going to be an educated guess in places, and building the prototype has shown me quite clearly where those guesses held up and where they did not. This section takes the feedback I gathered from third parties, sets it alongside my own evaluation of the prototype in section 4, and then works back through the same four design sub-headings in the same order so that the design documentation as a whole properly describes the system I am actually going to finish building.</w:t>
       </w:r>
     </w:p>
-    <w:p>
+    <w:p ns2:paraId="16269E32" ns2:textId="77777777">
       <w:pPr>
         <w:spacing w:after="160" w:line="276" w:lineRule="auto"/>
       </w:pPr>
@@ -55,19 +44,34 @@
         <w:t>It is worth being explicit about one thing before going any further. The original design in section 3 has deliberately been left exactly as it was written and none of it has been quietly corrected. This is because that document is a record of what I planned before the prototype existed, and rewriting it now would hide the very thing this section is supposed to show, which is how my understanding of the problem moved on once I had something real sat in front of me. Every change is documented here instead, and where a design decision from section 3 has been overturned I have said so and explained why.</w:t>
       </w:r>
     </w:p>
-    <w:p/>
-    <w:p>
+    <w:p ns2:paraId="628F95B1" ns2:textId="77777777"/>
+    <w:p ns2:paraId="396E839D" ns2:textId="77777777">
       <w:pPr>
         <w:pStyle w:val="Heading2"/>
+        <w:rPr>
+          <w:rFonts w:ascii="Aptos Display" w:eastAsia="Aptos Display" w:hAnsi="Aptos Display" w:cs="Aptos Display"/>
+          <w:b/>
+          <w:bCs/>
+          <w:color w:val="000000" w:themeColor="text1"/>
+        </w:rPr>
       </w:pPr>
+      <w:r>
+        <w:rPr>
+          <w:rFonts w:ascii="Aptos Display" w:eastAsia="Aptos Display" w:hAnsi="Aptos Display" w:cs="Aptos Display"/>
+          <w:b/>
+          <w:bCs/>
+          <w:color w:val="000000" w:themeColor="text1"/>
+        </w:rPr>
+        <w:t>Feedback from Third Parties and Changes Required to Design</w:t>
+      </w:r>
     </w:p>
     <w:sectPr>
-      <w:headerReference w:type="even" r:id="rId7"/>
-      <w:headerReference w:type="default" r:id="rId8"/>
-      <w:footerReference w:type="even" r:id="rId9"/>
-      <w:footerReference w:type="default" r:id="rId10"/>
-      <w:headerReference w:type="first" r:id="rId11"/>
-      <w:footerReference w:type="first" r:id="rId12"/>
+      <w:headerReference w:type="even" ns3:id="rId7"/>
+      <w:headerReference w:type="default" ns3:id="rId8"/>
+      <w:footerReference w:type="even" ns3:id="rId9"/>
+      <w:footerReference w:type="default" ns3:id="rId10"/>
+      <w:headerReference w:type="first" ns3:id="rId11"/>
+      <w:footerReference w:type="first" ns3:id="rId12"/>
       <w:pgSz w:w="12240" w:h="15840"/>
       <w:pgMar w:top="1440" w:right="1440" w:bottom="1440" w:left="1440" w:header="720" w:footer="720" w:gutter="0"/>
       <w:pgBorders w:offsetFrom="page">
@@ -178,7 +182,6 @@
         </w:pPr>
         <w:r>
           <w:rPr>
-            <w:noProof/>
             <w14:ligatures w14:val="none"/>
           </w:rPr>
           <w:pict w14:anchorId="470FE8D0">
@@ -633,6 +636,10 @@
     <w:pPr>
       <w:spacing w:after="0" w:line="240" w:lineRule="auto"/>
     </w:pPr>
+    <w:rPr>
+      <w:noProof/>
+      <w:lang w:val="en-GB"/>
+    </w:rPr>
   </w:style>
   <w:style w:type="paragraph" w:styleId="Heading1">
     <w:name w:val="heading 1"/>
@@ -653,7 +660,6 @@
       <w:color w:val="0F4761" w:themeColor="accent1" w:themeShade="BF"/>
       <w:sz w:val="40"/>
       <w:szCs w:val="40"/>
-      <w:lang w:val="en-GB"/>
     </w:rPr>
   </w:style>
   <w:style w:type="paragraph" w:styleId="Heading2">
@@ -676,7 +682,6 @@
       <w:color w:val="0F4761" w:themeColor="accent1" w:themeShade="BF"/>
       <w:sz w:val="32"/>
       <w:szCs w:val="32"/>
-      <w:lang w:val="en-GB"/>
     </w:rPr>
   </w:style>
   <w:style w:type="paragraph" w:styleId="Heading3">
@@ -699,7 +704,6 @@
       <w:color w:val="0F4761" w:themeColor="accent1" w:themeShade="BF"/>
       <w:sz w:val="28"/>
       <w:szCs w:val="28"/>
-      <w:lang w:val="en-GB"/>
     </w:rPr>
   </w:style>
   <w:style w:type="paragraph" w:styleId="Heading4">
@@ -722,7 +726,6 @@
       <w:i/>
       <w:iCs/>
       <w:color w:val="0F4761" w:themeColor="accent1" w:themeShade="BF"/>
-      <w:lang w:val="en-GB"/>
     </w:rPr>
   </w:style>
   <w:style w:type="paragraph" w:styleId="Heading5">
@@ -743,7 +746,6 @@
     <w:rPr>
       <w:rFonts w:eastAsiaTheme="majorEastAsia" w:cstheme="majorBidi"/>
       <w:color w:val="0F4761" w:themeColor="accent1" w:themeShade="BF"/>
-      <w:lang w:val="en-GB"/>
     </w:rPr>
   </w:style>
   <w:style w:type="paragraph" w:styleId="Heading6">
@@ -767,7 +769,6 @@
       <w:i/>
       <w:iCs/>
       <w:color w:val="595959" w:themeColor="text1" w:themeTint="A6"/>
-      <w:lang w:val="en-GB"/>
     </w:rPr>
   </w:style>
   <w:style w:type="paragraph" w:styleId="Heading7">
@@ -789,7 +790,6 @@
     <w:rPr>
       <w:rFonts w:eastAsiaTheme="majorEastAsia" w:cstheme="majorBidi"/>
       <w:color w:val="595959" w:themeColor="text1" w:themeTint="A6"/>
-      <w:lang w:val="en-GB"/>
     </w:rPr>
   </w:style>
   <w:style w:type="paragraph" w:styleId="Heading8">
@@ -813,7 +813,6 @@
       <w:i/>
       <w:iCs/>
       <w:color w:val="272727" w:themeColor="text1" w:themeTint="D8"/>
-      <w:lang w:val="en-GB"/>
     </w:rPr>
   </w:style>
   <w:style w:type="paragraph" w:styleId="Heading9">
@@ -835,7 +834,6 @@
     <w:rPr>
       <w:rFonts w:eastAsiaTheme="majorEastAsia" w:cstheme="majorBidi"/>
       <w:color w:val="272727" w:themeColor="text1" w:themeTint="D8"/>
-      <w:lang w:val="en-GB"/>
     </w:rPr>
   </w:style>
   <w:style w:type="character" w:default="1" w:styleId="DefaultParagraphFont">
@@ -1007,7 +1005,6 @@
       <w:kern w:val="28"/>
       <w:sz w:val="56"/>
       <w:szCs w:val="56"/>
-      <w:lang w:val="en-GB"/>
     </w:rPr>
   </w:style>
   <w:style w:type="character" w:customStyle="1" w:styleId="TitleChar">
@@ -1045,7 +1042,6 @@
       <w:spacing w:val="15"/>
       <w:sz w:val="28"/>
       <w:szCs w:val="28"/>
-      <w:lang w:val="en-GB"/>
     </w:rPr>
   </w:style>
   <w:style w:type="character" w:customStyle="1" w:styleId="SubtitleChar">
@@ -1079,7 +1075,6 @@
       <w:i/>
       <w:iCs/>
       <w:color w:val="404040" w:themeColor="text1" w:themeTint="BF"/>
-      <w:lang w:val="en-GB"/>
     </w:rPr>
   </w:style>
   <w:style w:type="character" w:customStyle="1" w:styleId="QuoteChar">
@@ -1106,9 +1101,6 @@
       <w:ind w:left="720"/>
       <w:contextualSpacing/>
     </w:pPr>
-    <w:rPr>
-      <w:lang w:val="en-GB"/>
-    </w:rPr>
   </w:style>
   <w:style w:type="character" w:styleId="IntenseEmphasis">
     <w:name w:val="Intense Emphasis"/>
@@ -1143,7 +1135,6 @@
       <w:i/>
       <w:iCs/>
       <w:color w:val="0F4761" w:themeColor="accent1" w:themeShade="BF"/>
-      <w:lang w:val="en-GB"/>
     </w:rPr>
   </w:style>
   <w:style w:type="character" w:customStyle="1" w:styleId="IntenseQuoteChar">
@@ -1243,7 +1234,7 @@
     <w:name w:val="Table Grid"/>
     <w:basedOn w:val="TableNormal"/>
     <w:uiPriority w:val="39"/>
-    <w:rsid w:val="00B20FDD"/>
+    <w:rsid w:val="006E2F09"/>
     <w:pPr>
       <w:spacing w:after="0" w:line="240" w:lineRule="auto"/>
     </w:pPr>

</xml_diff>

<commit_message>
added how the feedback was gathered
</commit_message>
<xml_diff>
--- a/Post-Prototype Refinement of Design.docx
+++ b/Post-Prototype Refinement of Design.docx
@@ -65,6 +65,56 @@
         <w:t>Feedback from Third Parties and Changes Required to Design</w:t>
       </w:r>
     </w:p>
+    <w:p ns2:paraId="5FBBEF7B" ns2:textId="77777777">
+      <w:pPr>
+        <w:pStyle w:val="Heading3"/>
+        <w:rPr>
+          <w:rFonts w:ascii="Aptos Display" w:eastAsia="Aptos Display" w:hAnsi="Aptos Display" w:cs="Aptos Display"/>
+          <w:b/>
+          <w:bCs/>
+          <w:color w:val="000000" w:themeColor="text1"/>
+        </w:rPr>
+      </w:pPr>
+      <w:r>
+        <w:rPr>
+          <w:rFonts w:ascii="Aptos Display" w:eastAsia="Aptos Display" w:hAnsi="Aptos Display" w:cs="Aptos Display"/>
+          <w:b/>
+          <w:bCs/>
+          <w:color w:val="000000" w:themeColor="text1"/>
+        </w:rPr>
+        <w:t>How the Feedback Was Gathered</w:t>
+      </w:r>
+    </w:p>
+    <w:p ns2:paraId="47DF2C88" ns2:textId="77777777">
+      <w:pPr>
+        <w:spacing w:after="160" w:line="276" w:lineRule="auto"/>
+      </w:pPr>
+      <w:r>
+        <w:rPr>
+          <w:rFonts w:ascii="Aptos" w:eastAsia="Aptos" w:hAnsi="Aptos" w:cs="Aptos"/>
+        </w:rPr>
+        <w:t>Once the prototype was working reliably enough to be demonstrated without falling over I arranged three separate sessions so that the feedback came from genuinely different points of view rather than three people telling me the same thing. The first was with my Computer Science teacher, who was looking at the project against the requirements of the specification. The second was with a group of fellow students, who had no knowledge of the cinema at all and were therefore useful for spotting things that only made sense to me because I had written them. The third was with the stakeholders I originally interviewed during the investigation, which mattered most of all because they are the people who would actually be sat in front of this system for a whole shift.</w:t>
+      </w:r>
+    </w:p>
+    <w:p ns2:paraId="57BC37FE" ns2:textId="77777777">
+      <w:pPr>
+        <w:spacing w:after="160" w:line="276" w:lineRule="auto"/>
+      </w:pPr>
+      <w:r>
+        <w:rPr>
+          <w:rFonts w:ascii="Aptos" w:eastAsia="Aptos" w:hAnsi="Aptos" w:cs="Aptos"/>
+        </w:rPr>
+        <w:t xml:space="preserve">In each session I worked through the prototype objective by objective rather than simply handing over the program and asking what people thought, this is because an unstructured demonstration tends to produce vague comments about how it looks rather than useful comments about whether it works. I demonstrated each objective myself first, then let the </w:t>
+      </w:r>
+      <w:r>
+        <w:rPr>
+          <w:rFonts w:ascii="Aptos" w:eastAsia="Aptos" w:hAnsi="Aptos" w:cs="Aptos"/>
+        </w:rPr>
+        <w:lastRenderedPageBreak/>
+        <w:t>person use it themselves on a laptop with a copy of the database loaded with realistic test data, and recorded what they said on a feedback sheet with a column for the objective, a column for the comment and a column for whether it was a problem, a suggestion or simply a question. Letting people drive the system themselves turned out to be by far the most valuable part, because several of the issues below were things nobody would have noticed watching over my shoulder.</w:t>
+      </w:r>
+    </w:p>
+    <w:p ns2:paraId="6ABCFC43" ns2:textId="77777777"/>
     <w:sectPr>
       <w:headerReference w:type="even" ns3:id="rId7"/>
       <w:headerReference w:type="default" ns3:id="rId8"/>

</xml_diff>

<commit_message>
added feedback received and my response
</commit_message>
<xml_diff>
--- a/Post-Prototype Refinement of Design.docx
+++ b/Post-Prototype Refinement of Design.docx
@@ -115,6 +115,1010 @@
       </w:r>
     </w:p>
     <w:p ns2:paraId="6ABCFC43" ns2:textId="77777777"/>
+    <w:p ns2:paraId="6F26933E" ns2:textId="77777777">
+      <w:pPr>
+        <w:pStyle w:val="Heading3"/>
+        <w:rPr>
+          <w:rFonts w:ascii="Aptos Display" w:eastAsia="Aptos Display" w:hAnsi="Aptos Display" w:cs="Aptos Display"/>
+          <w:b/>
+          <w:bCs/>
+          <w:color w:val="000000" w:themeColor="text1"/>
+        </w:rPr>
+      </w:pPr>
+      <w:r>
+        <w:rPr>
+          <w:rFonts w:ascii="Aptos Display" w:eastAsia="Aptos Display" w:hAnsi="Aptos Display" w:cs="Aptos Display"/>
+          <w:b/>
+          <w:bCs/>
+          <w:color w:val="000000" w:themeColor="text1"/>
+        </w:rPr>
+        <w:t>Feedback Received and My Response</w:t>
+      </w:r>
+    </w:p>
+    <w:p ns2:paraId="35EBA9DC" ns2:textId="77777777">
+      <w:pPr>
+        <w:spacing w:after="160" w:line="276" w:lineRule="auto"/>
+      </w:pPr>
+      <w:r>
+        <w:rPr>
+          <w:rFonts w:ascii="Aptos" w:eastAsia="Aptos" w:hAnsi="Aptos" w:cs="Aptos"/>
+        </w:rPr>
+        <w:t>The table below summarises the feedback that led to a change in the design. Comments that were purely positive or that related to things already on my list have been left out so that this section stays focused on what actually altered the design.</w:t>
+      </w:r>
+    </w:p>
+    <w:p ns2:paraId="2CE02BF9" ns2:textId="77777777"/>
+    <w:tbl>
+      <w:tblPr>
+        <w:tblW w:w="9360" w:type="dxa"/>
+        <w:tblBorders>
+          <w:top w:val="single" w:sz="1" w:space="0" w:color="BFBFBF"/>
+          <w:left w:val="single" w:sz="1" w:space="0" w:color="BFBFBF"/>
+          <w:bottom w:val="single" w:sz="1" w:space="0" w:color="BFBFBF"/>
+          <w:right w:val="single" w:sz="1" w:space="0" w:color="BFBFBF"/>
+          <w:insideH w:val="single" w:sz="1" w:space="0" w:color="BFBFBF"/>
+          <w:insideV w:val="single" w:sz="1" w:space="0" w:color="BFBFBF"/>
+        </w:tblBorders>
+        <w:tblCellMar>
+          <w:left w:w="10" w:type="dxa"/>
+          <w:right w:w="10" w:type="dxa"/>
+        </w:tblCellMar>
+        <w:tblLook w:val="04A0" w:firstRow="1" w:lastRow="0" w:firstColumn="1" w:lastColumn="0" w:noHBand="0" w:noVBand="1"/>
+      </w:tblPr>
+      <w:tblGrid>
+        <w:gridCol w:w="1487"/>
+        <w:gridCol w:w="1009"/>
+        <w:gridCol w:w="3547"/>
+        <w:gridCol w:w="3317"/>
+      </w:tblGrid>
+      <w:tr ns2:paraId="132A3902" ns2:textId="77777777">
+        <w:trPr>
+          <w:tblHeader/>
+        </w:trPr>
+        <w:tc>
+          <w:tcPr>
+            <w:tcW w:w="1500" w:type="dxa"/>
+            <w:shd w:val="clear" w:color="auto" w:fill="F2CEED" w:themeFill="accent5" w:themeFillTint="33"/>
+            <w:tcMar>
+              <w:top w:w="50" w:type="dxa"/>
+              <w:left w:w="90" w:type="dxa"/>
+              <w:bottom w:w="50" w:type="dxa"/>
+              <w:right w:w="90" w:type="dxa"/>
+            </w:tcMar>
+          </w:tcPr>
+          <w:p ns2:paraId="2F03BB23" ns2:textId="77777777">
+            <w:r>
+              <w:rPr>
+                <w:b/>
+                <w:bCs/>
+                <w:sz w:val="19"/>
+                <w:szCs w:val="19"/>
+              </w:rPr>
+              <w:t>Source</w:t>
+            </w:r>
+          </w:p>
+        </w:tc>
+        <w:tc>
+          <w:tcPr>
+            <w:tcW w:w="900" w:type="dxa"/>
+            <w:shd w:val="clear" w:color="auto" w:fill="F2CEED" w:themeFill="accent5" w:themeFillTint="33"/>
+            <w:tcMar>
+              <w:top w:w="50" w:type="dxa"/>
+              <w:left w:w="90" w:type="dxa"/>
+              <w:bottom w:w="50" w:type="dxa"/>
+              <w:right w:w="90" w:type="dxa"/>
+            </w:tcMar>
+          </w:tcPr>
+          <w:p ns2:paraId="3D2EF2B9" ns2:textId="77777777">
+            <w:r>
+              <w:rPr>
+                <w:b/>
+                <w:bCs/>
+                <w:sz w:val="19"/>
+                <w:szCs w:val="19"/>
+              </w:rPr>
+              <w:t>Objective</w:t>
+            </w:r>
+          </w:p>
+        </w:tc>
+        <w:tc>
+          <w:tcPr>
+            <w:tcW w:w="3600" w:type="dxa"/>
+            <w:shd w:val="clear" w:color="auto" w:fill="F2CEED" w:themeFill="accent5" w:themeFillTint="33"/>
+            <w:tcMar>
+              <w:top w:w="50" w:type="dxa"/>
+              <w:left w:w="90" w:type="dxa"/>
+              <w:bottom w:w="50" w:type="dxa"/>
+              <w:right w:w="90" w:type="dxa"/>
+            </w:tcMar>
+          </w:tcPr>
+          <w:p ns2:paraId="4D228836" ns2:textId="77777777">
+            <w:r>
+              <w:rPr>
+                <w:b/>
+                <w:bCs/>
+                <w:sz w:val="19"/>
+                <w:szCs w:val="19"/>
+              </w:rPr>
+              <w:t>Feedback received</w:t>
+            </w:r>
+          </w:p>
+        </w:tc>
+        <w:tc>
+          <w:tcPr>
+            <w:tcW w:w="3360" w:type="dxa"/>
+            <w:shd w:val="clear" w:color="auto" w:fill="F2CEED" w:themeFill="accent5" w:themeFillTint="33"/>
+            <w:tcMar>
+              <w:top w:w="50" w:type="dxa"/>
+              <w:left w:w="90" w:type="dxa"/>
+              <w:bottom w:w="50" w:type="dxa"/>
+              <w:right w:w="90" w:type="dxa"/>
+            </w:tcMar>
+          </w:tcPr>
+          <w:p ns2:paraId="40D053C3" ns2:textId="77777777">
+            <w:r>
+              <w:rPr>
+                <w:b/>
+                <w:bCs/>
+                <w:sz w:val="19"/>
+                <w:szCs w:val="19"/>
+              </w:rPr>
+              <w:t>My response and decision</w:t>
+            </w:r>
+          </w:p>
+        </w:tc>
+      </w:tr>
+      <w:tr ns2:paraId="747AC8EE" ns2:textId="77777777">
+        <w:tc>
+          <w:tcPr>
+            <w:tcW w:w="1500" w:type="dxa"/>
+            <w:tcMar>
+              <w:top w:w="50" w:type="dxa"/>
+              <w:left w:w="90" w:type="dxa"/>
+              <w:bottom w:w="50" w:type="dxa"/>
+              <w:right w:w="90" w:type="dxa"/>
+            </w:tcMar>
+          </w:tcPr>
+          <w:p ns2:paraId="55D9BB0C" ns2:textId="77777777">
+            <w:r>
+              <w:rPr>
+                <w:sz w:val="19"/>
+                <w:szCs w:val="19"/>
+              </w:rPr>
+              <w:t>Cinema manager</w:t>
+            </w:r>
+          </w:p>
+        </w:tc>
+        <w:tc>
+          <w:tcPr>
+            <w:tcW w:w="900" w:type="dxa"/>
+            <w:tcMar>
+              <w:top w:w="50" w:type="dxa"/>
+              <w:left w:w="90" w:type="dxa"/>
+              <w:bottom w:w="50" w:type="dxa"/>
+              <w:right w:w="90" w:type="dxa"/>
+            </w:tcMar>
+          </w:tcPr>
+          <w:p ns2:paraId="1CE9937A" ns2:textId="77777777">
+            <w:r>
+              <w:rPr>
+                <w:sz w:val="19"/>
+                <w:szCs w:val="19"/>
+              </w:rPr>
+              <w:t>8</w:t>
+            </w:r>
+          </w:p>
+        </w:tc>
+        <w:tc>
+          <w:tcPr>
+            <w:tcW w:w="3600" w:type="dxa"/>
+            <w:tcMar>
+              <w:top w:w="50" w:type="dxa"/>
+              <w:left w:w="90" w:type="dxa"/>
+              <w:bottom w:w="50" w:type="dxa"/>
+              <w:right w:w="90" w:type="dxa"/>
+            </w:tcMar>
+          </w:tcPr>
+          <w:p ns2:paraId="47CB7A2C" ns2:textId="77777777">
+            <w:r>
+              <w:rPr>
+                <w:sz w:val="19"/>
+                <w:szCs w:val="19"/>
+              </w:rPr>
+              <w:t>The sales report gives a total but not enough to actually run the cinema with. Wanted to know which films were earning and how full screenings were rather than just one revenue figure.</w:t>
+            </w:r>
+          </w:p>
+        </w:tc>
+        <w:tc>
+          <w:tcPr>
+            <w:tcW w:w="3360" w:type="dxa"/>
+            <w:tcMar>
+              <w:top w:w="50" w:type="dxa"/>
+              <w:left w:w="90" w:type="dxa"/>
+              <w:bottom w:w="50" w:type="dxa"/>
+              <w:right w:w="90" w:type="dxa"/>
+            </w:tcMar>
+          </w:tcPr>
+          <w:p ns2:paraId="641AD56E" ns2:textId="77777777">
+            <w:r>
+              <w:rPr>
+                <w:sz w:val="19"/>
+                <w:szCs w:val="19"/>
+              </w:rPr>
+              <w:t>Accepted. The report has been redesigned around a set of headline cards plus breakdowns by film, by screening and by food item, with an occupancy figure alongside the money.</w:t>
+            </w:r>
+          </w:p>
+        </w:tc>
+      </w:tr>
+      <w:tr ns2:paraId="0E36FC27" ns2:textId="77777777">
+        <w:tc>
+          <w:tcPr>
+            <w:tcW w:w="1500" w:type="dxa"/>
+            <w:tcMar>
+              <w:top w:w="50" w:type="dxa"/>
+              <w:left w:w="90" w:type="dxa"/>
+              <w:bottom w:w="50" w:type="dxa"/>
+              <w:right w:w="90" w:type="dxa"/>
+            </w:tcMar>
+          </w:tcPr>
+          <w:p ns2:paraId="257B48D9" ns2:textId="77777777">
+            <w:r>
+              <w:rPr>
+                <w:sz w:val="19"/>
+                <w:szCs w:val="19"/>
+              </w:rPr>
+              <w:t>Cinema manager</w:t>
+            </w:r>
+          </w:p>
+        </w:tc>
+        <w:tc>
+          <w:tcPr>
+            <w:tcW w:w="900" w:type="dxa"/>
+            <w:tcMar>
+              <w:top w:w="50" w:type="dxa"/>
+              <w:left w:w="90" w:type="dxa"/>
+              <w:bottom w:w="50" w:type="dxa"/>
+              <w:right w:w="90" w:type="dxa"/>
+            </w:tcMar>
+          </w:tcPr>
+          <w:p ns2:paraId="05A68660" ns2:textId="77777777">
+            <w:r>
+              <w:rPr>
+                <w:sz w:val="19"/>
+                <w:szCs w:val="19"/>
+              </w:rPr>
+              <w:t>8</w:t>
+            </w:r>
+          </w:p>
+        </w:tc>
+        <w:tc>
+          <w:tcPr>
+            <w:tcW w:w="3600" w:type="dxa"/>
+            <w:tcMar>
+              <w:top w:w="50" w:type="dxa"/>
+              <w:left w:w="90" w:type="dxa"/>
+              <w:bottom w:w="50" w:type="dxa"/>
+              <w:right w:w="90" w:type="dxa"/>
+            </w:tcMar>
+          </w:tcPr>
+          <w:p ns2:paraId="607DC6AC" ns2:textId="77777777">
+            <w:r>
+              <w:rPr>
+                <w:sz w:val="19"/>
+                <w:szCs w:val="19"/>
+              </w:rPr>
+              <w:t>Asked whether a report covering last week meant tickets sold last week or films shown last week, because those are different numbers and she needs both.</w:t>
+            </w:r>
+          </w:p>
+        </w:tc>
+        <w:tc>
+          <w:tcPr>
+            <w:tcW w:w="3360" w:type="dxa"/>
+            <w:tcMar>
+              <w:top w:w="50" w:type="dxa"/>
+              <w:left w:w="90" w:type="dxa"/>
+              <w:bottom w:w="50" w:type="dxa"/>
+              <w:right w:w="90" w:type="dxa"/>
+            </w:tcMar>
+          </w:tcPr>
+          <w:p ns2:paraId="543B9E5B" ns2:textId="77777777">
+            <w:r>
+              <w:rPr>
+                <w:sz w:val="19"/>
+                <w:szCs w:val="19"/>
+              </w:rPr>
+              <w:t>Accepted, and this was the single most useful comment I received. The report now has a switch between measuring on the booking date and measuring on the screening date.</w:t>
+            </w:r>
+          </w:p>
+        </w:tc>
+      </w:tr>
+      <w:tr ns2:paraId="1E4EB30F" ns2:textId="77777777">
+        <w:tc>
+          <w:tcPr>
+            <w:tcW w:w="1500" w:type="dxa"/>
+            <w:tcMar>
+              <w:top w:w="50" w:type="dxa"/>
+              <w:left w:w="90" w:type="dxa"/>
+              <w:bottom w:w="50" w:type="dxa"/>
+              <w:right w:w="90" w:type="dxa"/>
+            </w:tcMar>
+          </w:tcPr>
+          <w:p ns2:paraId="6E7417A4" ns2:textId="77777777">
+            <w:r>
+              <w:rPr>
+                <w:sz w:val="19"/>
+                <w:szCs w:val="19"/>
+              </w:rPr>
+              <w:t>Box office staff</w:t>
+            </w:r>
+          </w:p>
+        </w:tc>
+        <w:tc>
+          <w:tcPr>
+            <w:tcW w:w="900" w:type="dxa"/>
+            <w:tcMar>
+              <w:top w:w="50" w:type="dxa"/>
+              <w:left w:w="90" w:type="dxa"/>
+              <w:bottom w:w="50" w:type="dxa"/>
+              <w:right w:w="90" w:type="dxa"/>
+            </w:tcMar>
+          </w:tcPr>
+          <w:p ns2:paraId="76BBE69C" ns2:textId="77777777">
+            <w:r>
+              <w:rPr>
+                <w:sz w:val="19"/>
+                <w:szCs w:val="19"/>
+              </w:rPr>
+              <w:t>1 and 2</w:t>
+            </w:r>
+          </w:p>
+        </w:tc>
+        <w:tc>
+          <w:tcPr>
+            <w:tcW w:w="3600" w:type="dxa"/>
+            <w:tcMar>
+              <w:top w:w="50" w:type="dxa"/>
+              <w:left w:w="90" w:type="dxa"/>
+              <w:bottom w:w="50" w:type="dxa"/>
+              <w:right w:w="90" w:type="dxa"/>
+            </w:tcMar>
+          </w:tcPr>
+          <w:p ns2:paraId="218AEE94" ns2:textId="77777777">
+            <w:r>
+              <w:rPr>
+                <w:sz w:val="19"/>
+                <w:szCs w:val="19"/>
+              </w:rPr>
+              <w:t>Most customers at the counter do not want to give their name and address just to buy two tickets for the showing that starts in ten minutes.</w:t>
+            </w:r>
+          </w:p>
+        </w:tc>
+        <w:tc>
+          <w:tcPr>
+            <w:tcW w:w="3360" w:type="dxa"/>
+            <w:tcMar>
+              <w:top w:w="50" w:type="dxa"/>
+              <w:left w:w="90" w:type="dxa"/>
+              <w:bottom w:w="50" w:type="dxa"/>
+              <w:right w:w="90" w:type="dxa"/>
+            </w:tcMar>
+          </w:tcPr>
+          <w:p ns2:paraId="69EF59A3" ns2:textId="77777777">
+            <w:r>
+              <w:rPr>
+                <w:sz w:val="19"/>
+                <w:szCs w:val="19"/>
+              </w:rPr>
+              <w:t>Accepted. A walk-in route has been added so a sale can be completed without capturing customer details, using a single shared walk-in customer record.</w:t>
+            </w:r>
+          </w:p>
+        </w:tc>
+      </w:tr>
+      <w:tr ns2:paraId="18E2F23F" ns2:textId="77777777">
+        <w:tc>
+          <w:tcPr>
+            <w:tcW w:w="1500" w:type="dxa"/>
+            <w:tcMar>
+              <w:top w:w="50" w:type="dxa"/>
+              <w:left w:w="90" w:type="dxa"/>
+              <w:bottom w:w="50" w:type="dxa"/>
+              <w:right w:w="90" w:type="dxa"/>
+            </w:tcMar>
+          </w:tcPr>
+          <w:p ns2:paraId="4C380F0E" ns2:textId="77777777">
+            <w:r>
+              <w:rPr>
+                <w:sz w:val="19"/>
+                <w:szCs w:val="19"/>
+              </w:rPr>
+              <w:t>Box office staff</w:t>
+            </w:r>
+          </w:p>
+        </w:tc>
+        <w:tc>
+          <w:tcPr>
+            <w:tcW w:w="900" w:type="dxa"/>
+            <w:tcMar>
+              <w:top w:w="50" w:type="dxa"/>
+              <w:left w:w="90" w:type="dxa"/>
+              <w:bottom w:w="50" w:type="dxa"/>
+              <w:right w:w="90" w:type="dxa"/>
+            </w:tcMar>
+          </w:tcPr>
+          <w:p ns2:paraId="1DA6664D" ns2:textId="77777777">
+            <w:r>
+              <w:rPr>
+                <w:sz w:val="19"/>
+                <w:szCs w:val="19"/>
+              </w:rPr>
+              <w:t>3</w:t>
+            </w:r>
+          </w:p>
+        </w:tc>
+        <w:tc>
+          <w:tcPr>
+            <w:tcW w:w="3600" w:type="dxa"/>
+            <w:tcMar>
+              <w:top w:w="50" w:type="dxa"/>
+              <w:left w:w="90" w:type="dxa"/>
+              <w:bottom w:w="50" w:type="dxa"/>
+              <w:right w:w="90" w:type="dxa"/>
+            </w:tcMar>
+          </w:tcPr>
+          <w:p ns2:paraId="13AF6620" ns2:textId="77777777">
+            <w:r>
+              <w:rPr>
+                <w:sz w:val="19"/>
+                <w:szCs w:val="19"/>
+              </w:rPr>
+              <w:t>Every seat looked the same on the map even though the cinema charges more for the back rows in reality.</w:t>
+            </w:r>
+          </w:p>
+        </w:tc>
+        <w:tc>
+          <w:tcPr>
+            <w:tcW w:w="3360" w:type="dxa"/>
+            <w:tcMar>
+              <w:top w:w="50" w:type="dxa"/>
+              <w:left w:w="90" w:type="dxa"/>
+              <w:bottom w:w="50" w:type="dxa"/>
+              <w:right w:w="90" w:type="dxa"/>
+            </w:tcMar>
+          </w:tcPr>
+          <w:p ns2:paraId="4AED9E69" ns2:textId="77777777">
+            <w:r>
+              <w:rPr>
+                <w:sz w:val="19"/>
+                <w:szCs w:val="19"/>
+              </w:rPr>
+              <w:t>Accepted. Seat types have been introduced with a price multiplier, and the seat map now marks premium, accessible and saver seats differently.</w:t>
+            </w:r>
+          </w:p>
+        </w:tc>
+      </w:tr>
+      <w:tr ns2:paraId="15E6538B" ns2:textId="77777777">
+        <w:tc>
+          <w:tcPr>
+            <w:tcW w:w="1500" w:type="dxa"/>
+            <w:tcMar>
+              <w:top w:w="50" w:type="dxa"/>
+              <w:left w:w="90" w:type="dxa"/>
+              <w:bottom w:w="50" w:type="dxa"/>
+              <w:right w:w="90" w:type="dxa"/>
+            </w:tcMar>
+          </w:tcPr>
+          <w:p ns2:paraId="55741508" ns2:textId="77777777">
+            <w:r>
+              <w:rPr>
+                <w:sz w:val="19"/>
+                <w:szCs w:val="19"/>
+              </w:rPr>
+              <w:t>Box office staff</w:t>
+            </w:r>
+          </w:p>
+        </w:tc>
+        <w:tc>
+          <w:tcPr>
+            <w:tcW w:w="900" w:type="dxa"/>
+            <w:tcMar>
+              <w:top w:w="50" w:type="dxa"/>
+              <w:left w:w="90" w:type="dxa"/>
+              <w:bottom w:w="50" w:type="dxa"/>
+              <w:right w:w="90" w:type="dxa"/>
+            </w:tcMar>
+          </w:tcPr>
+          <w:p ns2:paraId="6157ABF2" ns2:textId="77777777">
+            <w:r>
+              <w:rPr>
+                <w:sz w:val="19"/>
+                <w:szCs w:val="19"/>
+              </w:rPr>
+              <w:t>12 and 18</w:t>
+            </w:r>
+          </w:p>
+        </w:tc>
+        <w:tc>
+          <w:tcPr>
+            <w:tcW w:w="3600" w:type="dxa"/>
+            <w:tcMar>
+              <w:top w:w="50" w:type="dxa"/>
+              <w:left w:w="90" w:type="dxa"/>
+              <w:bottom w:w="50" w:type="dxa"/>
+              <w:right w:w="90" w:type="dxa"/>
+            </w:tcMar>
+          </w:tcPr>
+          <w:p ns2:paraId="7B6C4D29" ns2:textId="77777777">
+            <w:r>
+              <w:rPr>
+                <w:sz w:val="19"/>
+                <w:szCs w:val="19"/>
+              </w:rPr>
+              <w:t>Asked what happens when a customer wants money back for two seats out of four but keeps the rest of the booking.</w:t>
+            </w:r>
+          </w:p>
+        </w:tc>
+        <w:tc>
+          <w:tcPr>
+            <w:tcW w:w="3360" w:type="dxa"/>
+            <w:tcMar>
+              <w:top w:w="50" w:type="dxa"/>
+              <w:left w:w="90" w:type="dxa"/>
+              <w:bottom w:w="50" w:type="dxa"/>
+              <w:right w:w="90" w:type="dxa"/>
+            </w:tcMar>
+          </w:tcPr>
+          <w:p ns2:paraId="04D90D77" ns2:textId="77777777">
+            <w:r>
+              <w:rPr>
+                <w:sz w:val="19"/>
+                <w:szCs w:val="19"/>
+              </w:rPr>
+              <w:t>Accepted, and it changes the objective. Refunds are now processed line by line on an active booking rather than only after a full cancellation.</w:t>
+            </w:r>
+          </w:p>
+        </w:tc>
+      </w:tr>
+      <w:tr ns2:paraId="28DFE94E" ns2:textId="77777777">
+        <w:tc>
+          <w:tcPr>
+            <w:tcW w:w="1500" w:type="dxa"/>
+            <w:tcMar>
+              <w:top w:w="50" w:type="dxa"/>
+              <w:left w:w="90" w:type="dxa"/>
+              <w:bottom w:w="50" w:type="dxa"/>
+              <w:right w:w="90" w:type="dxa"/>
+            </w:tcMar>
+          </w:tcPr>
+          <w:p ns2:paraId="401FAFA6" ns2:textId="77777777">
+            <w:r>
+              <w:rPr>
+                <w:sz w:val="19"/>
+                <w:szCs w:val="19"/>
+              </w:rPr>
+              <w:t>Fellow students</w:t>
+            </w:r>
+          </w:p>
+        </w:tc>
+        <w:tc>
+          <w:tcPr>
+            <w:tcW w:w="900" w:type="dxa"/>
+            <w:tcMar>
+              <w:top w:w="50" w:type="dxa"/>
+              <w:left w:w="90" w:type="dxa"/>
+              <w:bottom w:w="50" w:type="dxa"/>
+              <w:right w:w="90" w:type="dxa"/>
+            </w:tcMar>
+          </w:tcPr>
+          <w:p ns2:paraId="1AA236F8" ns2:textId="77777777">
+            <w:r>
+              <w:rPr>
+                <w:sz w:val="19"/>
+                <w:szCs w:val="19"/>
+              </w:rPr>
+              <w:t>15</w:t>
+            </w:r>
+          </w:p>
+        </w:tc>
+        <w:tc>
+          <w:tcPr>
+            <w:tcW w:w="3600" w:type="dxa"/>
+            <w:tcMar>
+              <w:top w:w="50" w:type="dxa"/>
+              <w:left w:w="90" w:type="dxa"/>
+              <w:bottom w:w="50" w:type="dxa"/>
+              <w:right w:w="90" w:type="dxa"/>
+            </w:tcMar>
+          </w:tcPr>
+          <w:p ns2:paraId="5C237C64" ns2:textId="77777777">
+            <w:r>
+              <w:rPr>
+                <w:sz w:val="19"/>
+                <w:szCs w:val="19"/>
+              </w:rPr>
+              <w:t>The main menu was a plain column of buttons and gave no sense of what the system was for or what state the cinema was in.</w:t>
+            </w:r>
+          </w:p>
+        </w:tc>
+        <w:tc>
+          <w:tcPr>
+            <w:tcW w:w="3360" w:type="dxa"/>
+            <w:tcMar>
+              <w:top w:w="50" w:type="dxa"/>
+              <w:left w:w="90" w:type="dxa"/>
+              <w:bottom w:w="50" w:type="dxa"/>
+              <w:right w:w="90" w:type="dxa"/>
+            </w:tcMar>
+          </w:tcPr>
+          <w:p ns2:paraId="5868004A" ns2:textId="77777777">
+            <w:r>
+              <w:rPr>
+                <w:sz w:val="19"/>
+                <w:szCs w:val="19"/>
+              </w:rPr>
+              <w:t>Accepted. The menu has been redesigned as a sidebar with a dashboard showing live figures for the day.</w:t>
+            </w:r>
+          </w:p>
+        </w:tc>
+      </w:tr>
+      <w:tr ns2:paraId="40A7CC89" ns2:textId="77777777">
+        <w:tc>
+          <w:tcPr>
+            <w:tcW w:w="1500" w:type="dxa"/>
+            <w:tcMar>
+              <w:top w:w="50" w:type="dxa"/>
+              <w:left w:w="90" w:type="dxa"/>
+              <w:bottom w:w="50" w:type="dxa"/>
+              <w:right w:w="90" w:type="dxa"/>
+            </w:tcMar>
+          </w:tcPr>
+          <w:p ns2:paraId="310627AF" ns2:textId="77777777">
+            <w:r>
+              <w:rPr>
+                <w:sz w:val="19"/>
+                <w:szCs w:val="19"/>
+              </w:rPr>
+              <w:t>Fellow students</w:t>
+            </w:r>
+          </w:p>
+        </w:tc>
+        <w:tc>
+          <w:tcPr>
+            <w:tcW w:w="900" w:type="dxa"/>
+            <w:tcMar>
+              <w:top w:w="50" w:type="dxa"/>
+              <w:left w:w="90" w:type="dxa"/>
+              <w:bottom w:w="50" w:type="dxa"/>
+              <w:right w:w="90" w:type="dxa"/>
+            </w:tcMar>
+          </w:tcPr>
+          <w:p ns2:paraId="542D2FF4" ns2:textId="77777777">
+            <w:r>
+              <w:rPr>
+                <w:sz w:val="19"/>
+                <w:szCs w:val="19"/>
+              </w:rPr>
+              <w:t>7</w:t>
+            </w:r>
+          </w:p>
+        </w:tc>
+        <w:tc>
+          <w:tcPr>
+            <w:tcW w:w="3600" w:type="dxa"/>
+            <w:tcMar>
+              <w:top w:w="50" w:type="dxa"/>
+              <w:left w:w="90" w:type="dxa"/>
+              <w:bottom w:w="50" w:type="dxa"/>
+              <w:right w:w="90" w:type="dxa"/>
+            </w:tcMar>
+          </w:tcPr>
+          <w:p ns2:paraId="64957323" ns2:textId="77777777">
+            <w:r>
+              <w:rPr>
+                <w:sz w:val="19"/>
+                <w:szCs w:val="19"/>
+              </w:rPr>
+              <w:t xml:space="preserve">Working out the finish time of a screening by hand to avoid clashing with the next </w:t>
+            </w:r>
+            <w:r>
+              <w:rPr>
+                <w:sz w:val="19"/>
+                <w:szCs w:val="19"/>
+              </w:rPr>
+              <w:lastRenderedPageBreak/>
+              <w:t>one was described as tedious and easy to get wrong.</w:t>
+            </w:r>
+          </w:p>
+        </w:tc>
+        <w:tc>
+          <w:tcPr>
+            <w:tcW w:w="3360" w:type="dxa"/>
+            <w:tcMar>
+              <w:top w:w="50" w:type="dxa"/>
+              <w:left w:w="90" w:type="dxa"/>
+              <w:bottom w:w="50" w:type="dxa"/>
+              <w:right w:w="90" w:type="dxa"/>
+            </w:tcMar>
+          </w:tcPr>
+          <w:p ns2:paraId="546EFB34" ns2:textId="77777777">
+            <w:r>
+              <w:rPr>
+                <w:sz w:val="19"/>
+                <w:szCs w:val="19"/>
+              </w:rPr>
+              <w:lastRenderedPageBreak/>
+              <w:t xml:space="preserve">Accepted. The screening form now calculates the end time from the film duration plus trailer and turnaround </w:t>
+            </w:r>
+            <w:r>
+              <w:rPr>
+                <w:sz w:val="19"/>
+                <w:szCs w:val="19"/>
+              </w:rPr>
+              <w:lastRenderedPageBreak/>
+              <w:t>allowances and offers the next free slot.</w:t>
+            </w:r>
+          </w:p>
+        </w:tc>
+      </w:tr>
+      <w:tr ns2:paraId="38211D47" ns2:textId="77777777">
+        <w:tc>
+          <w:tcPr>
+            <w:tcW w:w="1500" w:type="dxa"/>
+            <w:tcMar>
+              <w:top w:w="50" w:type="dxa"/>
+              <w:left w:w="90" w:type="dxa"/>
+              <w:bottom w:w="50" w:type="dxa"/>
+              <w:right w:w="90" w:type="dxa"/>
+            </w:tcMar>
+          </w:tcPr>
+          <w:p ns2:paraId="005E8B06" ns2:textId="77777777">
+            <w:r>
+              <w:rPr>
+                <w:sz w:val="19"/>
+                <w:szCs w:val="19"/>
+              </w:rPr>
+              <w:lastRenderedPageBreak/>
+              <w:t>Teacher</w:t>
+            </w:r>
+          </w:p>
+        </w:tc>
+        <w:tc>
+          <w:tcPr>
+            <w:tcW w:w="900" w:type="dxa"/>
+            <w:tcMar>
+              <w:top w:w="50" w:type="dxa"/>
+              <w:left w:w="90" w:type="dxa"/>
+              <w:bottom w:w="50" w:type="dxa"/>
+              <w:right w:w="90" w:type="dxa"/>
+            </w:tcMar>
+          </w:tcPr>
+          <w:p ns2:paraId="46082432" ns2:textId="77777777">
+            <w:r>
+              <w:rPr>
+                <w:sz w:val="19"/>
+                <w:szCs w:val="19"/>
+              </w:rPr>
+              <w:t>6</w:t>
+            </w:r>
+          </w:p>
+        </w:tc>
+        <w:tc>
+          <w:tcPr>
+            <w:tcW w:w="3600" w:type="dxa"/>
+            <w:tcMar>
+              <w:top w:w="50" w:type="dxa"/>
+              <w:left w:w="90" w:type="dxa"/>
+              <w:bottom w:w="50" w:type="dxa"/>
+              <w:right w:w="90" w:type="dxa"/>
+            </w:tcMar>
+          </w:tcPr>
+          <w:p ns2:paraId="416162CA" ns2:textId="77777777">
+            <w:r>
+              <w:rPr>
+                <w:sz w:val="19"/>
+                <w:szCs w:val="19"/>
+              </w:rPr>
+              <w:t>Pointed out that typing a description for every film by hand would not scale and asked how a real cinema would populate its catalogue.</w:t>
+            </w:r>
+          </w:p>
+        </w:tc>
+        <w:tc>
+          <w:tcPr>
+            <w:tcW w:w="3360" w:type="dxa"/>
+            <w:tcMar>
+              <w:top w:w="50" w:type="dxa"/>
+              <w:left w:w="90" w:type="dxa"/>
+              <w:bottom w:w="50" w:type="dxa"/>
+              <w:right w:w="90" w:type="dxa"/>
+            </w:tcMar>
+          </w:tcPr>
+          <w:p ns2:paraId="5017B254" ns2:textId="77777777">
+            <w:r>
+              <w:rPr>
+                <w:sz w:val="19"/>
+                <w:szCs w:val="19"/>
+              </w:rPr>
+              <w:t>Accepted in part. Film details can now be imported in bulk from a data file and posters fetched automatically, but the manual route has been kept for one-off additions.</w:t>
+            </w:r>
+          </w:p>
+        </w:tc>
+      </w:tr>
+      <w:tr ns2:paraId="2FCA609A" ns2:textId="77777777">
+        <w:tc>
+          <w:tcPr>
+            <w:tcW w:w="1500" w:type="dxa"/>
+            <w:tcMar>
+              <w:top w:w="50" w:type="dxa"/>
+              <w:left w:w="90" w:type="dxa"/>
+              <w:bottom w:w="50" w:type="dxa"/>
+              <w:right w:w="90" w:type="dxa"/>
+            </w:tcMar>
+          </w:tcPr>
+          <w:p ns2:paraId="696D01AF" ns2:textId="77777777">
+            <w:r>
+              <w:rPr>
+                <w:sz w:val="19"/>
+                <w:szCs w:val="19"/>
+              </w:rPr>
+              <w:t>Teacher</w:t>
+            </w:r>
+          </w:p>
+        </w:tc>
+        <w:tc>
+          <w:tcPr>
+            <w:tcW w:w="900" w:type="dxa"/>
+            <w:tcMar>
+              <w:top w:w="50" w:type="dxa"/>
+              <w:left w:w="90" w:type="dxa"/>
+              <w:bottom w:w="50" w:type="dxa"/>
+              <w:right w:w="90" w:type="dxa"/>
+            </w:tcMar>
+          </w:tcPr>
+          <w:p ns2:paraId="15E68F10" ns2:textId="77777777">
+            <w:r>
+              <w:rPr>
+                <w:sz w:val="19"/>
+                <w:szCs w:val="19"/>
+              </w:rPr>
+              <w:t>10</w:t>
+            </w:r>
+          </w:p>
+        </w:tc>
+        <w:tc>
+          <w:tcPr>
+            <w:tcW w:w="3600" w:type="dxa"/>
+            <w:tcMar>
+              <w:top w:w="50" w:type="dxa"/>
+              <w:left w:w="90" w:type="dxa"/>
+              <w:bottom w:w="50" w:type="dxa"/>
+              <w:right w:w="90" w:type="dxa"/>
+            </w:tcMar>
+          </w:tcPr>
+          <w:p ns2:paraId="490B0F49" ns2:textId="77777777">
+            <w:r>
+              <w:rPr>
+                <w:sz w:val="19"/>
+                <w:szCs w:val="19"/>
+              </w:rPr>
+              <w:t>Asked what stops a customer at the kiosk from pressing the staff exit and landing in the manager's account.</w:t>
+            </w:r>
+          </w:p>
+        </w:tc>
+        <w:tc>
+          <w:tcPr>
+            <w:tcW w:w="3360" w:type="dxa"/>
+            <w:tcMar>
+              <w:top w:w="50" w:type="dxa"/>
+              <w:left w:w="90" w:type="dxa"/>
+              <w:bottom w:w="50" w:type="dxa"/>
+              <w:right w:w="90" w:type="dxa"/>
+            </w:tcMar>
+          </w:tcPr>
+          <w:p ns2:paraId="48563F62" ns2:textId="77777777">
+            <w:r>
+              <w:rPr>
+                <w:sz w:val="19"/>
+                <w:szCs w:val="19"/>
+              </w:rPr>
+              <w:t>Accepted. Leaving kiosk mode now requires the password of the account that started it rather than a simple confirmation.</w:t>
+            </w:r>
+          </w:p>
+        </w:tc>
+      </w:tr>
+      <w:tr ns2:paraId="7D8882B2" ns2:textId="77777777">
+        <w:tc>
+          <w:tcPr>
+            <w:tcW w:w="1500" w:type="dxa"/>
+            <w:tcMar>
+              <w:top w:w="50" w:type="dxa"/>
+              <w:left w:w="90" w:type="dxa"/>
+              <w:bottom w:w="50" w:type="dxa"/>
+              <w:right w:w="90" w:type="dxa"/>
+            </w:tcMar>
+          </w:tcPr>
+          <w:p ns2:paraId="01E8D129" ns2:textId="77777777">
+            <w:r>
+              <w:rPr>
+                <w:sz w:val="19"/>
+                <w:szCs w:val="19"/>
+              </w:rPr>
+              <w:t>Teacher</w:t>
+            </w:r>
+          </w:p>
+        </w:tc>
+        <w:tc>
+          <w:tcPr>
+            <w:tcW w:w="900" w:type="dxa"/>
+            <w:tcMar>
+              <w:top w:w="50" w:type="dxa"/>
+              <w:left w:w="90" w:type="dxa"/>
+              <w:bottom w:w="50" w:type="dxa"/>
+              <w:right w:w="90" w:type="dxa"/>
+            </w:tcMar>
+          </w:tcPr>
+          <w:p ns2:paraId="5BACC3DF" ns2:textId="77777777">
+            <w:r>
+              <w:rPr>
+                <w:sz w:val="19"/>
+                <w:szCs w:val="19"/>
+              </w:rPr>
+              <w:t>14</w:t>
+            </w:r>
+          </w:p>
+        </w:tc>
+        <w:tc>
+          <w:tcPr>
+            <w:tcW w:w="3600" w:type="dxa"/>
+            <w:tcMar>
+              <w:top w:w="50" w:type="dxa"/>
+              <w:left w:w="90" w:type="dxa"/>
+              <w:bottom w:w="50" w:type="dxa"/>
+              <w:right w:w="90" w:type="dxa"/>
+            </w:tcMar>
+          </w:tcPr>
+          <w:p ns2:paraId="0DE321C7" ns2:textId="77777777">
+            <w:r>
+              <w:rPr>
+                <w:sz w:val="19"/>
+                <w:szCs w:val="19"/>
+              </w:rPr>
+              <w:t>Asked whether the colour scheme was fixed in code and what would happen if the cinema wanted it changed.</w:t>
+            </w:r>
+          </w:p>
+        </w:tc>
+        <w:tc>
+          <w:tcPr>
+            <w:tcW w:w="3360" w:type="dxa"/>
+            <w:tcMar>
+              <w:top w:w="50" w:type="dxa"/>
+              <w:left w:w="90" w:type="dxa"/>
+              <w:bottom w:w="50" w:type="dxa"/>
+              <w:right w:w="90" w:type="dxa"/>
+            </w:tcMar>
+          </w:tcPr>
+          <w:p ns2:paraId="5D9378A7" ns2:textId="77777777">
+            <w:r>
+              <w:rPr>
+                <w:sz w:val="19"/>
+                <w:szCs w:val="19"/>
+              </w:rPr>
+              <w:t>Accepted. Colours are now applied from a single shared palette at runtime, which also made a dark mode option possible.</w:t>
+            </w:r>
+          </w:p>
+        </w:tc>
+      </w:tr>
+    </w:tbl>
+    <w:p ns2:paraId="790AD34F" ns2:textId="77777777"/>
+    <w:p ns2:paraId="2F59663A" ns2:textId="77777777">
+      <w:pPr>
+        <w:spacing w:after="160" w:line="276" w:lineRule="auto"/>
+      </w:pPr>
+      <w:r>
+        <w:rPr>
+          <w:rFonts w:ascii="Aptos" w:eastAsia="Aptos" w:hAnsi="Aptos" w:cs="Aptos"/>
+        </w:rPr>
+        <w:t>Two suggestions have been discounted and it is only fair to justify that rather than quietly ignore them. The first was a suggestion from the student group that the system should email a customer their ticket once a booking is taken. I have decided against this because it would mean either relying on an external mail server or building an SMTP client into the program, and neither belongs in a system that is meant to run on a single machine behind a box office counter with no guarantee of a network connection. It has been recorded as a future improvement instead. The second was a request from the manager for the system to handle staff rotas as well as bookings, which I have discounted on scope grounds, this is because rota management shares almost no data with ticketing and would effectively be a second project bolted onto the side of this one.</w:t>
+      </w:r>
+    </w:p>
+    <w:p ns2:paraId="13B38189" ns2:textId="77777777"/>
     <w:sectPr>
       <w:headerReference w:type="even" ns3:id="rId7"/>
       <w:headerReference w:type="default" ns3:id="rId8"/>

</xml_diff>

<commit_message>
added summary of the changes required to the design
</commit_message>
<xml_diff>
--- a/Post-Prototype Refinement of Design.docx
+++ b/Post-Prototype Refinement of Design.docx
@@ -1119,6 +1119,38 @@
       </w:r>
     </w:p>
     <w:p ns2:paraId="13B38189" ns2:textId="77777777"/>
+    <w:p ns2:paraId="687D1CAA" ns2:textId="77777777">
+      <w:pPr>
+        <w:pStyle w:val="Heading3"/>
+        <w:rPr>
+          <w:rFonts w:ascii="Aptos Display" w:eastAsia="Aptos Display" w:hAnsi="Aptos Display" w:cs="Aptos Display"/>
+          <w:b/>
+          <w:bCs/>
+          <w:color w:val="000000" w:themeColor="text1"/>
+        </w:rPr>
+      </w:pPr>
+      <w:r>
+        <w:rPr>
+          <w:rFonts w:ascii="Aptos Display" w:eastAsia="Aptos Display" w:hAnsi="Aptos Display" w:cs="Aptos Display"/>
+          <w:b/>
+          <w:bCs/>
+          <w:color w:val="000000" w:themeColor="text1"/>
+        </w:rPr>
+        <w:t>Summary of the Changes Required to the Design</w:t>
+      </w:r>
+    </w:p>
+    <w:p ns2:paraId="22C192EE" ns2:textId="77777777">
+      <w:pPr>
+        <w:spacing w:after="160" w:line="276" w:lineRule="auto"/>
+      </w:pPr>
+      <w:r>
+        <w:rPr>
+          <w:rFonts w:ascii="Aptos" w:eastAsia="Aptos" w:hAnsi="Aptos" w:cs="Aptos"/>
+        </w:rPr>
+        <w:t>Pulling all of that together alongside my own evaluation in section 4, the changes fall into four groups. There are changes to the interface, where forms have been redesigned or entirely new forms added. There are changes to the data, where the feedback has forced new tables and new fields that the original design never anticipated. There are changes to the processing, where routines have had to be broken down differently to support things like partial refunds. Finally there are changes to validation, where the prototype exposed inputs I had simply not thought to protect. The rest of this section works through each of those in turn using the same sub-headings as section 3.</w:t>
+      </w:r>
+    </w:p>
+    <w:p ns2:paraId="772E80E2" ns2:textId="77777777"/>
     <w:sectPr>
       <w:headerReference w:type="even" ns3:id="rId7"/>
       <w:headerReference w:type="default" ns3:id="rId8"/>

</xml_diff>

<commit_message>
adding post-prototype inputs, outputs and user interface design
</commit_message>
<xml_diff>
--- a/Post-Prototype Refinement of Design.docx
+++ b/Post-Prototype Refinement of Design.docx
@@ -1151,6 +1151,50 @@
       </w:r>
     </w:p>
     <w:p ns2:paraId="772E80E2" ns2:textId="77777777"/>
+    <w:p ns2:paraId="4E1368CB" ns2:textId="77777777">
+      <w:pPr>
+        <w:pStyle w:val="Heading2"/>
+        <w:rPr>
+          <w:rFonts w:ascii="Aptos Display" w:eastAsia="Aptos Display" w:hAnsi="Aptos Display" w:cs="Aptos Display"/>
+          <w:b/>
+          <w:bCs/>
+          <w:color w:val="000000" w:themeColor="text1"/>
+        </w:rPr>
+      </w:pPr>
+      <w:r>
+        <w:rPr>
+          <w:rFonts w:ascii="Aptos Display" w:eastAsia="Aptos Display" w:hAnsi="Aptos Display" w:cs="Aptos Display"/>
+          <w:b/>
+          <w:bCs/>
+          <w:color w:val="000000" w:themeColor="text1"/>
+        </w:rPr>
+        <w:lastRenderedPageBreak/>
+        <w:t>Post-Prototype Inputs, Outputs and User Interface Design</w:t>
+      </w:r>
+    </w:p>
+    <w:p ns2:paraId="59A815FA" ns2:textId="77777777">
+      <w:pPr>
+        <w:spacing w:after="160" w:line="276" w:lineRule="auto"/>
+      </w:pPr>
+      <w:r>
+        <w:rPr>
+          <w:rFonts w:ascii="Aptos" w:eastAsia="Aptos" w:hAnsi="Aptos" w:cs="Aptos"/>
+        </w:rPr>
+        <w:t>The purpose of this sub-section is to describe how the interface design has changed since section 3. Almost every form in Filmtopia has moved since the prototype, either because a new objective demanded it or because using the prototype for a few weeks showed up something clumsy, so rather than picking out only the largest changes I have gone through the objectives in order and set out what is different for each. The handful whose interface genuinely has not moved have been left out rather than padded with a paragraph saying nothing has happened.</w:t>
+      </w:r>
+    </w:p>
+    <w:p ns2:paraId="205FF6AF" ns2:textId="77777777">
+      <w:pPr>
+        <w:spacing w:after="160" w:line="276" w:lineRule="auto"/>
+      </w:pPr>
+      <w:r>
+        <w:rPr>
+          <w:rFonts w:ascii="Aptos" w:eastAsia="Aptos" w:hAnsi="Aptos" w:cs="Aptos"/>
+        </w:rPr>
+        <w:t>Two decisions apply across every form and are worth setting out once here instead of repeating them twenty six times. The first is colour. In section 3 I said I would settle the layout first and deal with colour after the prototype, and that is exactly what has happened, so every form now asks a single shared palette for its colours as it opens rather than carrying its own. The second is that every list in the system now has an Export to CSV button in the same place, so the user learns it once. Neither is repeated below except where a form does something unusual with them.</w:t>
+      </w:r>
+    </w:p>
+    <w:p ns2:paraId="1C874967" ns2:textId="77777777"/>
     <w:sectPr>
       <w:headerReference w:type="even" ns3:id="rId7"/>
       <w:headerReference w:type="default" ns3:id="rId8"/>

</xml_diff>

<commit_message>
added adding food and drink to an order (objective 5)
</commit_message>
<xml_diff>
--- a/Post-Prototype Refinement of Design.docx
+++ b/Post-Prototype Refinement of Design.docx
@@ -11114,6 +11114,4221 @@
         <w:t>The price shown is also the price stored. Once a sale is complete the figures on it never move again, even if a manager raises the ticket price the following week, and the refund screen later hands back exactly what appears on this screen rather than recalculating from current prices.</w:t>
       </w:r>
     </w:p>
+    <w:p ns2:paraId="16E95641" ns2:textId="77777777">
+      <w:pPr>
+        <w:pStyle w:val="Heading3"/>
+        <w:rPr>
+          <w:rFonts w:ascii="Aptos Display" w:eastAsia="Aptos Display" w:hAnsi="Aptos Display" w:cs="Aptos Display"/>
+          <w:b/>
+          <w:bCs/>
+          <w:color w:val="000000" w:themeColor="text1"/>
+        </w:rPr>
+      </w:pPr>
+      <w:r>
+        <w:rPr>
+          <w:rFonts w:ascii="Aptos Display" w:eastAsia="Aptos Display" w:hAnsi="Aptos Display" w:cs="Aptos Display"/>
+          <w:b/>
+          <w:bCs/>
+          <w:color w:val="000000" w:themeColor="text1"/>
+        </w:rPr>
+        <w:t>Adding Food and Drink to an Order (Objective 5)</w:t>
+      </w:r>
+    </w:p>
+    <w:p ns2:paraId="109EAC18" ns2:textId="77777777">
+      <w:pPr>
+        <w:spacing w:after="160" w:line="276" w:lineRule="auto"/>
+      </w:pPr>
+      <w:r>
+        <w:rPr>
+          <w:rFonts w:ascii="Aptos" w:eastAsia="Aptos" w:hAnsi="Aptos" w:cs="Aptos"/>
+        </w:rPr>
+        <w:t>The food order screen has gained a picture against each item, which matters far more on the kiosk than at the counter but is shared between the two so there is only one list to maintain. Items withdrawn from sale no longer appear at all, while bookings that already include them continue to display correctly. The form also gained a route in from an existing booking, headed Edit Food On A Past Booking, so a customer who comes back to the counter for more popcorn can have it added to their original sale rather than being given a second unrelated one.</w:t>
+      </w:r>
+    </w:p>
+    <w:p ns2:paraId="323CDC34" ns2:textId="77777777">
+      <w:pPr>
+        <w:keepNext/>
+        <w:pBdr>
+          <w:top w:val="single" w:sz="6" w:space="6" w:color="A02B93"/>
+          <w:left w:val="single" w:sz="6" w:space="0" w:color="A02B93"/>
+          <w:bottom w:val="single" w:sz="6" w:space="6" w:color="A02B93"/>
+          <w:right w:val="single" w:sz="6" w:space="0" w:color="A02B93"/>
+        </w:pBdr>
+        <w:shd w:val="clear" w:color="auto" w:fill="F7E9F3"/>
+        <w:spacing w:before="120" w:after="200"/>
+        <w:rPr>
+          <w:rFonts w:ascii="Aptos" w:eastAsia="Aptos" w:hAnsi="Aptos" w:cs="Aptos"/>
+          <w:b/>
+          <w:bCs/>
+          <w:color w:val="A02B93"/>
+          <w:sz w:val="22"/>
+          <w:szCs w:val="22"/>
+        </w:rPr>
+      </w:pPr>
+      <w:r>
+        <w:rPr>
+          <w:rFonts w:ascii="Aptos" w:eastAsia="Aptos" w:hAnsi="Aptos" w:cs="Aptos"/>
+          <w:b/>
+          <w:bCs/>
+          <w:color w:val="A02B93"/>
+          <w:sz w:val="22"/>
+          <w:szCs w:val="22"/>
+        </w:rPr>
+        <w:lastRenderedPageBreak/>
+        <w:t>Food Order Form (frmFoodOrder)</w:t>
+      </w:r>
+    </w:p>
+    <w:p ns2:paraId="63D8754E" ns2:textId="77777777">
+      <w:pPr>
+        <w:pBdr>
+          <w:top w:val="single" w:sz="6" w:space="6" w:color="A02B93"/>
+          <w:left w:val="single" w:sz="6" w:space="0" w:color="A02B93"/>
+          <w:bottom w:val="single" w:sz="6" w:space="6" w:color="A02B93"/>
+          <w:right w:val="single" w:sz="6" w:space="0" w:color="A02B93"/>
+        </w:pBdr>
+        <w:shd w:val="clear" w:color="auto" w:fill="F7E9F3"/>
+        <w:spacing w:before="120" w:after="200"/>
+      </w:pPr>
+      <w:r>
+        <ns1:AlternateContent>
+          <ns1:Choice Requires="wpc">
+            <w:drawing>
+              <ns3:inline distT="0" distB="0" distL="0" distR="0" ns4:anchorId="413ED887" ns4:editId="23057ECC">
+                <ns3:extent cx="5832764" cy="4344703"/>
+                <ns3:effectExtent l="0" t="0" r="0" b="0"/>
+                <ns3:docPr id="1399402498" name="Food Order Form (frmFoodOrder)"/>
+                <ns3:cNvGraphicFramePr/>
+                <ns5:graphic>
+                  <ns5:graphicData uri="http://schemas.microsoft.com/office/word/2010/wordprocessingCanvas">
+                    <ns6:wpc>
+                      <ns6:bg>
+                        <ns5:solidFill>
+                          <ns5:prstClr val="white"/>
+                        </ns5:solidFill>
+                      </ns6:bg>
+                      <ns6:whole/>
+                      <ns7:wsp>
+                        <ns7:cNvPr id="1207544813" name="Window 7000137"/>
+                        <ns7:cNvSpPr/>
+                        <ns7:spPr>
+                          <ns5:xfrm>
+                            <ns5:off x="0" y="0"/>
+                            <ns5:ext cx="5832764" cy="4344703"/>
+                          </ns5:xfrm>
+                          <ns5:prstGeom prst="rect">
+                            <ns5:avLst/>
+                          </ns5:prstGeom>
+                          <ns5:solidFill>
+                            <ns5:srgbClr val="F0F0F0"/>
+                          </ns5:solidFill>
+                          <ns5:ln>
+                            <ns5:noFill/>
+                          </ns5:ln>
+                        </ns7:spPr>
+                        <ns7:style>
+                          <ns5:lnRef idx="2">
+                            <ns5:schemeClr val="dk1"/>
+                          </ns5:lnRef>
+                          <ns5:fillRef idx="0">
+                            <ns5:schemeClr val="lt1"/>
+                          </ns5:fillRef>
+                          <ns5:effectRef idx="0">
+                            <ns5:schemeClr val="dk1"/>
+                          </ns5:effectRef>
+                          <ns5:fontRef idx="minor">
+                            <ns5:schemeClr val="dk1"/>
+                          </ns5:fontRef>
+                        </ns7:style>
+                        <ns7:bodyPr rot="0" spcFirstLastPara="0" vertOverflow="overflow" horzOverflow="overflow" vert="horz" wrap="square" lIns="43447" tIns="0" rIns="43447" bIns="0" numCol="1" spcCol="0" rtlCol="0" fromWordArt="0" anchor="ctr" anchorCtr="0" forceAA="0" compatLnSpc="1">
+                          <ns5:noAutofit/>
+                        </ns7:bodyPr>
+                      </ns7:wsp>
+                      <ns7:wsp>
+                        <ns7:cNvPr id="1555535744" name="Label 7000274"/>
+                        <ns7:cNvSpPr/>
+                        <ns7:spPr>
+                          <ns5:xfrm>
+                            <ns5:off x="130341" y="119479"/>
+                            <ns5:ext cx="5648114" cy="218864"/>
+                          </ns5:xfrm>
+                          <ns5:prstGeom prst="rect">
+                            <ns5:avLst/>
+                          </ns5:prstGeom>
+                          <ns5:noFill/>
+                          <ns5:ln>
+                            <ns5:noFill/>
+                          </ns5:ln>
+                        </ns7:spPr>
+                        <ns7:style>
+                          <ns5:lnRef idx="2">
+                            <ns5:schemeClr val="dk1"/>
+                          </ns5:lnRef>
+                          <ns5:fillRef idx="0">
+                            <ns5:schemeClr val="lt1"/>
+                          </ns5:fillRef>
+                          <ns5:effectRef idx="0">
+                            <ns5:schemeClr val="dk1"/>
+                          </ns5:effectRef>
+                          <ns5:fontRef idx="minor">
+                            <ns5:schemeClr val="dk1"/>
+                          </ns5:fontRef>
+                        </ns7:style>
+                        <ns7:txbx>
+                          <w:txbxContent>
+                            <w:p ns2:paraId="6F36CCBC" ns2:textId="77777777">
+                              <w:pPr>
+                                <w:rPr>
+                                  <w:b/>
+                                  <w:bCs/>
+                                  <w:color w:val="000000"/>
+                                  <w:sz w:val="22"/>
+                                  <w:szCs w:val="22"/>
+                                </w:rPr>
+                              </w:pPr>
+                              <w:r>
+                                <w:rPr>
+                                  <w:b/>
+                                  <w:bCs/>
+                                  <w:color w:val="000000"/>
+                                  <w:sz w:val="22"/>
+                                  <w:szCs w:val="22"/>
+                                </w:rPr>
+                                <w:t>Booking #78  -  Walk-in Customer  -  The Dark Knight (21/08/2026 21:14)</w:t>
+                              </w:r>
+                            </w:p>
+                          </w:txbxContent>
+                        </ns7:txbx>
+                        <ns7:bodyPr rot="0" spcFirstLastPara="0" vertOverflow="overflow" horzOverflow="overflow" vert="horz" wrap="square" lIns="0" tIns="0" rIns="0" bIns="0" numCol="1" spcCol="0" rtlCol="0" fromWordArt="0" anchor="ctr" anchorCtr="0" forceAA="0" compatLnSpc="1">
+                          <ns5:noAutofit/>
+                        </ns7:bodyPr>
+                      </ns7:wsp>
+                      <ns7:wsp>
+                        <ns7:cNvPr id="887463338" name="Label 7000411"/>
+                        <ns7:cNvSpPr/>
+                        <ns7:spPr>
+                          <ns5:xfrm>
+                            <ns5:off x="130341" y="477917"/>
+                            <ns5:ext cx="651705" cy="185193"/>
+                          </ns5:xfrm>
+                          <ns5:prstGeom prst="rect">
+                            <ns5:avLst/>
+                          </ns5:prstGeom>
+                          <ns5:noFill/>
+                          <ns5:ln>
+                            <ns5:noFill/>
+                          </ns5:ln>
+                        </ns7:spPr>
+                        <ns7:style>
+                          <ns5:lnRef idx="2">
+                            <ns5:schemeClr val="dk1"/>
+                          </ns5:lnRef>
+                          <ns5:fillRef idx="0">
+                            <ns5:schemeClr val="lt1"/>
+                          </ns5:fillRef>
+                          <ns5:effectRef idx="0">
+                            <ns5:schemeClr val="dk1"/>
+                          </ns5:effectRef>
+                          <ns5:fontRef idx="minor">
+                            <ns5:schemeClr val="dk1"/>
+                          </ns5:fontRef>
+                        </ns7:style>
+                        <ns7:txbx>
+                          <w:txbxContent>
+                            <w:p ns2:paraId="0F2574ED" ns2:textId="77777777">
+                              <w:pPr>
+                                <w:rPr>
+                                  <w:color w:val="000000"/>
+                                  <w:sz w:val="19"/>
+                                  <w:szCs w:val="19"/>
+                                </w:rPr>
+                              </w:pPr>
+                              <w:r>
+                                <w:rPr>
+                                  <w:color w:val="000000"/>
+                                  <w:sz w:val="19"/>
+                                  <w:szCs w:val="19"/>
+                                </w:rPr>
+                                <w:t>Food Item</w:t>
+                              </w:r>
+                            </w:p>
+                          </w:txbxContent>
+                        </ns7:txbx>
+                        <ns7:bodyPr rot="0" spcFirstLastPara="0" vertOverflow="overflow" horzOverflow="overflow" vert="horz" wrap="square" lIns="0" tIns="0" rIns="0" bIns="0" numCol="1" spcCol="0" rtlCol="0" fromWordArt="0" anchor="ctr" anchorCtr="0" forceAA="0" compatLnSpc="1">
+                          <ns5:noAutofit/>
+                        </ns7:bodyPr>
+                      </ns7:wsp>
+                      <ns7:wsp>
+                        <ns7:cNvPr id="457727108" name="ComboBox 7000548"/>
+                        <ns7:cNvSpPr/>
+                        <ns7:spPr>
+                          <ns5:xfrm>
+                            <ns5:off x="890664" y="456194"/>
+                            <ns5:ext cx="2454757" cy="217235"/>
+                          </ns5:xfrm>
+                          <ns5:prstGeom prst="rect">
+                            <ns5:avLst/>
+                          </ns5:prstGeom>
+                          <ns5:solidFill>
+                            <ns5:srgbClr val="FFFFFF"/>
+                          </ns5:solidFill>
+                          <ns5:ln w="6350">
+                            <ns5:solidFill>
+                              <ns5:srgbClr val="B4B4B4"/>
+                            </ns5:solidFill>
+                          </ns5:ln>
+                        </ns7:spPr>
+                        <ns7:style>
+                          <ns5:lnRef idx="2">
+                            <ns5:schemeClr val="dk1"/>
+                          </ns5:lnRef>
+                          <ns5:fillRef idx="0">
+                            <ns5:schemeClr val="lt1"/>
+                          </ns5:fillRef>
+                          <ns5:effectRef idx="0">
+                            <ns5:schemeClr val="dk1"/>
+                          </ns5:effectRef>
+                          <ns5:fontRef idx="minor">
+                            <ns5:schemeClr val="dk1"/>
+                          </ns5:fontRef>
+                        </ns7:style>
+                        <ns7:txbx>
+                          <w:txbxContent>
+                            <w:p ns2:paraId="391F5C1F" ns2:textId="77777777">
+                              <w:pPr>
+                                <w:rPr>
+                                  <w:color w:val="000000"/>
+                                  <w:sz w:val="19"/>
+                                  <w:szCs w:val="19"/>
+                                </w:rPr>
+                              </w:pPr>
+                              <w:r>
+                                <w:rPr>
+                                  <w:color w:val="000000"/>
+                                  <w:sz w:val="19"/>
+                                  <w:szCs w:val="19"/>
+                                </w:rPr>
+                                <w:t>Large Popcorn</w:t>
+                              </w:r>
+                            </w:p>
+                          </w:txbxContent>
+                        </ns7:txbx>
+                        <ns7:bodyPr rot="0" spcFirstLastPara="0" vertOverflow="overflow" horzOverflow="overflow" vert="horz" wrap="square" lIns="43447" tIns="0" rIns="43447" bIns="0" numCol="1" spcCol="0" rtlCol="0" fromWordArt="0" anchor="ctr" anchorCtr="0" forceAA="0" compatLnSpc="1">
+                          <ns5:noAutofit/>
+                        </ns7:bodyPr>
+                      </ns7:wsp>
+                      <ns7:wsp>
+                        <ns7:cNvPr id="1859278868" name="ComboArrow 7000685"/>
+                        <ns7:cNvSpPr/>
+                        <ns7:spPr>
+                          <ns5:xfrm>
+                            <ns5:off x="3189012" y="547433"/>
+                            <ns5:ext cx="91239" cy="52136"/>
+                          </ns5:xfrm>
+                          <ns5:prstGeom prst="triangle">
+                            <ns5:avLst/>
+                          </ns5:prstGeom>
+                          <ns5:solidFill>
+                            <ns5:srgbClr val="595959"/>
+                          </ns5:solidFill>
+                          <ns5:ln>
+                            <ns5:noFill/>
+                          </ns5:ln>
+                        </ns7:spPr>
+                        <ns7:style>
+                          <ns5:lnRef idx="2">
+                            <ns5:schemeClr val="dk1"/>
+                          </ns5:lnRef>
+                          <ns5:fillRef idx="0">
+                            <ns5:schemeClr val="lt1"/>
+                          </ns5:fillRef>
+                          <ns5:effectRef idx="0">
+                            <ns5:schemeClr val="dk1"/>
+                          </ns5:effectRef>
+                          <ns5:fontRef idx="minor">
+                            <ns5:schemeClr val="dk1"/>
+                          </ns5:fontRef>
+                        </ns7:style>
+                        <ns7:bodyPr rot="0" spcFirstLastPara="0" vertOverflow="overflow" horzOverflow="overflow" vert="horz" wrap="square" lIns="43447" tIns="0" rIns="43447" bIns="0" numCol="1" spcCol="0" rtlCol="0" fromWordArt="0" anchor="ctr" anchorCtr="0" forceAA="0" compatLnSpc="1">
+                          <ns5:noAutofit/>
+                        </ns7:bodyPr>
+                      </ns7:wsp>
+                      <ns7:wsp>
+                        <ns7:cNvPr id="1227701465" name="Label 7000822"/>
+                        <ns7:cNvSpPr/>
+                        <ns7:spPr>
+                          <ns5:xfrm>
+                            <ns5:off x="3421454" y="477917"/>
+                            <ns5:ext cx="651705" cy="185193"/>
+                          </ns5:xfrm>
+                          <ns5:prstGeom prst="rect">
+                            <ns5:avLst/>
+                          </ns5:prstGeom>
+                          <ns5:noFill/>
+                          <ns5:ln>
+                            <ns5:noFill/>
+                          </ns5:ln>
+                        </ns7:spPr>
+                        <ns7:style>
+                          <ns5:lnRef idx="2">
+                            <ns5:schemeClr val="dk1"/>
+                          </ns5:lnRef>
+                          <ns5:fillRef idx="0">
+                            <ns5:schemeClr val="lt1"/>
+                          </ns5:fillRef>
+                          <ns5:effectRef idx="0">
+                            <ns5:schemeClr val="dk1"/>
+                          </ns5:effectRef>
+                          <ns5:fontRef idx="minor">
+                            <ns5:schemeClr val="dk1"/>
+                          </ns5:fontRef>
+                        </ns7:style>
+                        <ns7:txbx>
+                          <w:txbxContent>
+                            <w:p ns2:paraId="2BBD4E0B" ns2:textId="77777777">
+                              <w:pPr>
+                                <w:rPr>
+                                  <w:b/>
+                                  <w:bCs/>
+                                  <w:color w:val="000000"/>
+                                  <w:sz w:val="19"/>
+                                  <w:szCs w:val="19"/>
+                                </w:rPr>
+                              </w:pPr>
+                              <w:r>
+                                <w:rPr>
+                                  <w:b/>
+                                  <w:bCs/>
+                                  <w:color w:val="000000"/>
+                                  <w:sz w:val="19"/>
+                                  <w:szCs w:val="19"/>
+                                </w:rPr>
+                                <w:t>£4.99</w:t>
+                              </w:r>
+                            </w:p>
+                          </w:txbxContent>
+                        </ns7:txbx>
+                        <ns7:bodyPr rot="0" spcFirstLastPara="0" vertOverflow="overflow" horzOverflow="overflow" vert="horz" wrap="square" lIns="0" tIns="0" rIns="0" bIns="0" numCol="1" spcCol="0" rtlCol="0" fromWordArt="0" anchor="ctr" anchorCtr="0" forceAA="0" compatLnSpc="1">
+                          <ns5:noAutofit/>
+                        </ns7:bodyPr>
+                      </ns7:wsp>
+                      <ns7:wsp>
+                        <ns7:cNvPr id="1646023474" name="Label 7000959"/>
+                        <ns7:cNvSpPr/>
+                        <ns7:spPr>
+                          <ns5:xfrm>
+                            <ns5:off x="3421454" y="673429"/>
+                            <ns5:ext cx="977558" cy="168357"/>
+                          </ns5:xfrm>
+                          <ns5:prstGeom prst="rect">
+                            <ns5:avLst/>
+                          </ns5:prstGeom>
+                          <ns5:noFill/>
+                          <ns5:ln>
+                            <ns5:noFill/>
+                          </ns5:ln>
+                        </ns7:spPr>
+                        <ns7:style>
+                          <ns5:lnRef idx="2">
+                            <ns5:schemeClr val="dk1"/>
+                          </ns5:lnRef>
+                          <ns5:fillRef idx="0">
+                            <ns5:schemeClr val="lt1"/>
+                          </ns5:fillRef>
+                          <ns5:effectRef idx="0">
+                            <ns5:schemeClr val="dk1"/>
+                          </ns5:effectRef>
+                          <ns5:fontRef idx="minor">
+                            <ns5:schemeClr val="dk1"/>
+                          </ns5:fontRef>
+                        </ns7:style>
+                        <ns7:txbx>
+                          <w:txbxContent>
+                            <w:p ns2:paraId="61B74499" ns2:textId="77777777">
+                              <w:pPr>
+                                <w:rPr>
+                                  <w:color w:val="808080"/>
+                                  <w:sz w:val="17"/>
+                                  <w:szCs w:val="17"/>
+                                </w:rPr>
+                              </w:pPr>
+                              <w:r>
+                                <w:rPr>
+                                  <w:color w:val="808080"/>
+                                  <w:sz w:val="17"/>
+                                  <w:szCs w:val="17"/>
+                                </w:rPr>
+                                <w:t>Snacks</w:t>
+                              </w:r>
+                            </w:p>
+                          </w:txbxContent>
+                        </ns7:txbx>
+                        <ns7:bodyPr rot="0" spcFirstLastPara="0" vertOverflow="overflow" horzOverflow="overflow" vert="horz" wrap="square" lIns="0" tIns="0" rIns="0" bIns="0" numCol="1" spcCol="0" rtlCol="0" fromWordArt="0" anchor="ctr" anchorCtr="0" forceAA="0" compatLnSpc="1">
+                          <ns5:noAutofit/>
+                        </ns7:bodyPr>
+                      </ns7:wsp>
+                      <ns7:wsp>
+                        <ns7:cNvPr id="979858543" name="picFoodItem 7001096"/>
+                        <ns7:cNvSpPr/>
+                        <ns7:spPr>
+                          <ns5:xfrm>
+                            <ns5:off x="4887791" y="228097"/>
+                            <ns5:ext cx="782047" cy="847217"/>
+                          </ns5:xfrm>
+                          <ns5:prstGeom prst="rect">
+                            <ns5:avLst/>
+                          </ns5:prstGeom>
+                          <ns5:solidFill>
+                            <ns5:srgbClr val="FFFFFF"/>
+                          </ns5:solidFill>
+                          <ns5:ln w="6350">
+                            <ns5:solidFill>
+                              <ns5:srgbClr val="B4B4B4"/>
+                            </ns5:solidFill>
+                          </ns5:ln>
+                        </ns7:spPr>
+                        <ns7:style>
+                          <ns5:lnRef idx="2">
+                            <ns5:schemeClr val="dk1"/>
+                          </ns5:lnRef>
+                          <ns5:fillRef idx="0">
+                            <ns5:schemeClr val="lt1"/>
+                          </ns5:fillRef>
+                          <ns5:effectRef idx="0">
+                            <ns5:schemeClr val="dk1"/>
+                          </ns5:effectRef>
+                          <ns5:fontRef idx="minor">
+                            <ns5:schemeClr val="dk1"/>
+                          </ns5:fontRef>
+                        </ns7:style>
+                        <ns7:bodyPr rot="0" spcFirstLastPara="0" vertOverflow="overflow" horzOverflow="overflow" vert="horz" wrap="square" lIns="43447" tIns="0" rIns="43447" bIns="0" numCol="1" spcCol="0" rtlCol="0" fromWordArt="0" anchor="ctr" anchorCtr="0" forceAA="0" compatLnSpc="1">
+                          <ns5:noAutofit/>
+                        </ns7:bodyPr>
+                      </ns7:wsp>
+                      <ns7:wsp>
+                        <ns7:cNvPr id="324317492" name="Label 7001233"/>
+                        <ns7:cNvSpPr/>
+                        <ns7:spPr>
+                          <ns5:xfrm>
+                            <ns5:off x="4909515" y="564811"/>
+                            <ns5:ext cx="738600" cy="151522"/>
+                          </ns5:xfrm>
+                          <ns5:prstGeom prst="rect">
+                            <ns5:avLst/>
+                          </ns5:prstGeom>
+                          <ns5:noFill/>
+                          <ns5:ln>
+                            <ns5:noFill/>
+                          </ns5:ln>
+                        </ns7:spPr>
+                        <ns7:style>
+                          <ns5:lnRef idx="2">
+                            <ns5:schemeClr val="dk1"/>
+                          </ns5:lnRef>
+                          <ns5:fillRef idx="0">
+                            <ns5:schemeClr val="lt1"/>
+                          </ns5:fillRef>
+                          <ns5:effectRef idx="0">
+                            <ns5:schemeClr val="dk1"/>
+                          </ns5:effectRef>
+                          <ns5:fontRef idx="minor">
+                            <ns5:schemeClr val="dk1"/>
+                          </ns5:fontRef>
+                        </ns7:style>
+                        <ns7:txbx>
+                          <w:txbxContent>
+                            <w:p ns2:paraId="0AEC56D2" ns2:textId="77777777">
+                              <w:pPr>
+                                <w:jc w:val="center"/>
+                                <w:rPr>
+                                  <w:color w:val="808080"/>
+                                  <w:sz w:val="15"/>
+                                  <w:szCs w:val="15"/>
+                                </w:rPr>
+                              </w:pPr>
+                              <w:r>
+                                <w:rPr>
+                                  <w:color w:val="808080"/>
+                                  <w:sz w:val="15"/>
+                                  <w:szCs w:val="15"/>
+                                </w:rPr>
+                                <w:t>picture of</w:t>
+                              </w:r>
+                            </w:p>
+                          </w:txbxContent>
+                        </ns7:txbx>
+                        <ns7:bodyPr rot="0" spcFirstLastPara="0" vertOverflow="overflow" horzOverflow="overflow" vert="horz" wrap="square" lIns="0" tIns="0" rIns="0" bIns="0" numCol="1" spcCol="0" rtlCol="0" fromWordArt="0" anchor="ctr" anchorCtr="0" forceAA="0" compatLnSpc="1">
+                          <ns5:noAutofit/>
+                        </ns7:bodyPr>
+                      </ns7:wsp>
+                      <ns7:wsp>
+                        <ns7:cNvPr id="1664795577" name="Label 7001370"/>
+                        <ns7:cNvSpPr/>
+                        <ns7:spPr>
+                          <ns5:xfrm>
+                            <ns5:off x="4909515" y="695153"/>
+                            <ns5:ext cx="738600" cy="151522"/>
+                          </ns5:xfrm>
+                          <ns5:prstGeom prst="rect">
+                            <ns5:avLst/>
+                          </ns5:prstGeom>
+                          <ns5:noFill/>
+                          <ns5:ln>
+                            <ns5:noFill/>
+                          </ns5:ln>
+                        </ns7:spPr>
+                        <ns7:style>
+                          <ns5:lnRef idx="2">
+                            <ns5:schemeClr val="dk1"/>
+                          </ns5:lnRef>
+                          <ns5:fillRef idx="0">
+                            <ns5:schemeClr val="lt1"/>
+                          </ns5:fillRef>
+                          <ns5:effectRef idx="0">
+                            <ns5:schemeClr val="dk1"/>
+                          </ns5:effectRef>
+                          <ns5:fontRef idx="minor">
+                            <ns5:schemeClr val="dk1"/>
+                          </ns5:fontRef>
+                        </ns7:style>
+                        <ns7:txbx>
+                          <w:txbxContent>
+                            <w:p ns2:paraId="427FCC0C" ns2:textId="77777777">
+                              <w:pPr>
+                                <w:jc w:val="center"/>
+                                <w:rPr>
+                                  <w:color w:val="808080"/>
+                                  <w:sz w:val="15"/>
+                                  <w:szCs w:val="15"/>
+                                </w:rPr>
+                              </w:pPr>
+                              <w:r>
+                                <w:rPr>
+                                  <w:color w:val="808080"/>
+                                  <w:sz w:val="15"/>
+                                  <w:szCs w:val="15"/>
+                                </w:rPr>
+                                <w:t>the item</w:t>
+                              </w:r>
+                            </w:p>
+                          </w:txbxContent>
+                        </ns7:txbx>
+                        <ns7:bodyPr rot="0" spcFirstLastPara="0" vertOverflow="overflow" horzOverflow="overflow" vert="horz" wrap="square" lIns="0" tIns="0" rIns="0" bIns="0" numCol="1" spcCol="0" rtlCol="0" fromWordArt="0" anchor="ctr" anchorCtr="0" forceAA="0" compatLnSpc="1">
+                          <ns5:noAutofit/>
+                        </ns7:bodyPr>
+                      </ns7:wsp>
+                      <ns7:wsp>
+                        <ns7:cNvPr id="862552940" name="Label 7001507"/>
+                        <ns7:cNvSpPr/>
+                        <ns7:spPr>
+                          <ns5:xfrm>
+                            <ns5:off x="130341" y="792908"/>
+                            <ns5:ext cx="651705" cy="185193"/>
+                          </ns5:xfrm>
+                          <ns5:prstGeom prst="rect">
+                            <ns5:avLst/>
+                          </ns5:prstGeom>
+                          <ns5:noFill/>
+                          <ns5:ln>
+                            <ns5:noFill/>
+                          </ns5:ln>
+                        </ns7:spPr>
+                        <ns7:style>
+                          <ns5:lnRef idx="2">
+                            <ns5:schemeClr val="dk1"/>
+                          </ns5:lnRef>
+                          <ns5:fillRef idx="0">
+                            <ns5:schemeClr val="lt1"/>
+                          </ns5:fillRef>
+                          <ns5:effectRef idx="0">
+                            <ns5:schemeClr val="dk1"/>
+                          </ns5:effectRef>
+                          <ns5:fontRef idx="minor">
+                            <ns5:schemeClr val="dk1"/>
+                          </ns5:fontRef>
+                        </ns7:style>
+                        <ns7:txbx>
+                          <w:txbxContent>
+                            <w:p ns2:paraId="5EFB3BD6" ns2:textId="77777777">
+                              <w:pPr>
+                                <w:rPr>
+                                  <w:color w:val="000000"/>
+                                  <w:sz w:val="19"/>
+                                  <w:szCs w:val="19"/>
+                                </w:rPr>
+                              </w:pPr>
+                              <w:r>
+                                <w:rPr>
+                                  <w:color w:val="000000"/>
+                                  <w:sz w:val="19"/>
+                                  <w:szCs w:val="19"/>
+                                </w:rPr>
+                                <w:t>Quantity</w:t>
+                              </w:r>
+                            </w:p>
+                          </w:txbxContent>
+                        </ns7:txbx>
+                        <ns7:bodyPr rot="0" spcFirstLastPara="0" vertOverflow="overflow" horzOverflow="overflow" vert="horz" wrap="square" lIns="0" tIns="0" rIns="0" bIns="0" numCol="1" spcCol="0" rtlCol="0" fromWordArt="0" anchor="ctr" anchorCtr="0" forceAA="0" compatLnSpc="1">
+                          <ns5:noAutofit/>
+                        </ns7:bodyPr>
+                      </ns7:wsp>
+                      <ns7:wsp>
+                        <ns7:cNvPr id="937849089" name="TextBox 7001644"/>
+                        <ns7:cNvSpPr/>
+                        <ns7:spPr>
+                          <ns5:xfrm>
+                            <ns5:off x="890664" y="771185"/>
+                            <ns5:ext cx="499641" cy="217235"/>
+                          </ns5:xfrm>
+                          <ns5:prstGeom prst="rect">
+                            <ns5:avLst/>
+                          </ns5:prstGeom>
+                          <ns5:solidFill>
+                            <ns5:srgbClr val="FFFFFF"/>
+                          </ns5:solidFill>
+                          <ns5:ln w="6350">
+                            <ns5:solidFill>
+                              <ns5:srgbClr val="B4B4B4"/>
+                            </ns5:solidFill>
+                          </ns5:ln>
+                        </ns7:spPr>
+                        <ns7:style>
+                          <ns5:lnRef idx="2">
+                            <ns5:schemeClr val="dk1"/>
+                          </ns5:lnRef>
+                          <ns5:fillRef idx="0">
+                            <ns5:schemeClr val="lt1"/>
+                          </ns5:fillRef>
+                          <ns5:effectRef idx="0">
+                            <ns5:schemeClr val="dk1"/>
+                          </ns5:effectRef>
+                          <ns5:fontRef idx="minor">
+                            <ns5:schemeClr val="dk1"/>
+                          </ns5:fontRef>
+                        </ns7:style>
+                        <ns7:txbx>
+                          <w:txbxContent>
+                            <w:p ns2:paraId="3BECAC59" ns2:textId="77777777">
+                              <w:pPr>
+                                <w:rPr>
+                                  <w:color w:val="000000"/>
+                                  <w:sz w:val="19"/>
+                                  <w:szCs w:val="19"/>
+                                </w:rPr>
+                              </w:pPr>
+                              <w:r>
+                                <w:rPr>
+                                  <w:color w:val="000000"/>
+                                  <w:sz w:val="19"/>
+                                  <w:szCs w:val="19"/>
+                                </w:rPr>
+                                <w:t>1</w:t>
+                              </w:r>
+                            </w:p>
+                          </w:txbxContent>
+                        </ns7:txbx>
+                        <ns7:bodyPr rot="0" spcFirstLastPara="0" vertOverflow="overflow" horzOverflow="overflow" vert="horz" wrap="square" lIns="43447" tIns="0" rIns="43447" bIns="0" numCol="1" spcCol="0" rtlCol="0" fromWordArt="0" anchor="ctr" anchorCtr="0" forceAA="0" compatLnSpc="1">
+                          <ns5:noAutofit/>
+                        </ns7:bodyPr>
+                      </ns7:wsp>
+                      <ns7:wsp>
+                        <ns7:cNvPr id="1843568769" name="Button 7001781"/>
+                        <ns7:cNvSpPr/>
+                        <ns7:spPr>
+                          <ns5:xfrm>
+                            <ns5:off x="1498923" y="760323"/>
+                            <ns5:ext cx="1140485" cy="238959"/>
+                          </ns5:xfrm>
+                          <ns5:prstGeom prst="rect">
+                            <ns5:avLst/>
+                          </ns5:prstGeom>
+                          <ns5:solidFill>
+                            <ns5:srgbClr val="F0F0F0"/>
+                          </ns5:solidFill>
+                          <ns5:ln w="6350">
+                            <ns5:solidFill>
+                              <ns5:srgbClr val="B4B4B4"/>
+                            </ns5:solidFill>
+                          </ns5:ln>
+                        </ns7:spPr>
+                        <ns7:style>
+                          <ns5:lnRef idx="2">
+                            <ns5:schemeClr val="dk1"/>
+                          </ns5:lnRef>
+                          <ns5:fillRef idx="0">
+                            <ns5:schemeClr val="lt1"/>
+                          </ns5:fillRef>
+                          <ns5:effectRef idx="0">
+                            <ns5:schemeClr val="dk1"/>
+                          </ns5:effectRef>
+                          <ns5:fontRef idx="minor">
+                            <ns5:schemeClr val="dk1"/>
+                          </ns5:fontRef>
+                        </ns7:style>
+                        <ns7:txbx>
+                          <w:txbxContent>
+                            <w:p ns2:paraId="71EAACA3" ns2:textId="77777777">
+                              <w:pPr>
+                                <w:jc w:val="center"/>
+                                <w:rPr>
+                                  <w:color w:val="000000"/>
+                                  <w:sz w:val="19"/>
+                                  <w:szCs w:val="19"/>
+                                </w:rPr>
+                              </w:pPr>
+                              <w:r>
+                                <w:rPr>
+                                  <w:color w:val="000000"/>
+                                  <w:sz w:val="19"/>
+                                  <w:szCs w:val="19"/>
+                                </w:rPr>
+                                <w:t>Add To Order</w:t>
+                              </w:r>
+                            </w:p>
+                          </w:txbxContent>
+                        </ns7:txbx>
+                        <ns7:bodyPr rot="0" spcFirstLastPara="0" vertOverflow="overflow" horzOverflow="overflow" vert="horz" wrap="square" lIns="21724" tIns="0" rIns="21724" bIns="0" numCol="1" spcCol="0" rtlCol="0" fromWordArt="0" anchor="ctr" anchorCtr="0" forceAA="0" compatLnSpc="1">
+                          <ns5:noAutofit/>
+                        </ns7:bodyPr>
+                      </ns7:wsp>
+                      <ns7:wsp>
+                        <ns7:cNvPr id="1325258286" name="dgvOrderItemsFrame 7001918"/>
+                        <ns7:cNvSpPr/>
+                        <ns7:spPr>
+                          <ns5:xfrm>
+                            <ns5:off x="130341" y="1238240"/>
+                            <ns5:ext cx="5593805" cy="2172352"/>
+                          </ns5:xfrm>
+                          <ns5:prstGeom prst="rect">
+                            <ns5:avLst/>
+                          </ns5:prstGeom>
+                          <ns5:solidFill>
+                            <ns5:srgbClr val="FFFFFF"/>
+                          </ns5:solidFill>
+                          <ns5:ln w="6350">
+                            <ns5:solidFill>
+                              <ns5:srgbClr val="B4B4B4"/>
+                            </ns5:solidFill>
+                          </ns5:ln>
+                        </ns7:spPr>
+                        <ns7:style>
+                          <ns5:lnRef idx="2">
+                            <ns5:schemeClr val="dk1"/>
+                          </ns5:lnRef>
+                          <ns5:fillRef idx="0">
+                            <ns5:schemeClr val="lt1"/>
+                          </ns5:fillRef>
+                          <ns5:effectRef idx="0">
+                            <ns5:schemeClr val="dk1"/>
+                          </ns5:effectRef>
+                          <ns5:fontRef idx="minor">
+                            <ns5:schemeClr val="dk1"/>
+                          </ns5:fontRef>
+                        </ns7:style>
+                        <ns7:bodyPr rot="0" spcFirstLastPara="0" vertOverflow="overflow" horzOverflow="overflow" vert="horz" wrap="square" lIns="43447" tIns="0" rIns="43447" bIns="0" numCol="1" spcCol="0" rtlCol="0" fromWordArt="0" anchor="ctr" anchorCtr="0" forceAA="0" compatLnSpc="1">
+                          <ns5:noAutofit/>
+                        </ns7:bodyPr>
+                      </ns7:wsp>
+                      <ns7:wsp>
+                        <ns7:cNvPr id="1937013599" name="dgvOrderItemsHeader 7002055"/>
+                        <ns7:cNvSpPr/>
+                        <ns7:spPr>
+                          <ns5:xfrm>
+                            <ns5:off x="130341" y="1238240"/>
+                            <ns5:ext cx="5593805" cy="227011"/>
+                          </ns5:xfrm>
+                          <ns5:prstGeom prst="rect">
+                            <ns5:avLst/>
+                          </ns5:prstGeom>
+                          <ns5:solidFill>
+                            <ns5:srgbClr val="400040"/>
+                          </ns5:solidFill>
+                          <ns5:ln>
+                            <ns5:noFill/>
+                          </ns5:ln>
+                        </ns7:spPr>
+                        <ns7:style>
+                          <ns5:lnRef idx="2">
+                            <ns5:schemeClr val="dk1"/>
+                          </ns5:lnRef>
+                          <ns5:fillRef idx="0">
+                            <ns5:schemeClr val="lt1"/>
+                          </ns5:fillRef>
+                          <ns5:effectRef idx="0">
+                            <ns5:schemeClr val="dk1"/>
+                          </ns5:effectRef>
+                          <ns5:fontRef idx="minor">
+                            <ns5:schemeClr val="dk1"/>
+                          </ns5:fontRef>
+                        </ns7:style>
+                        <ns7:bodyPr rot="0" spcFirstLastPara="0" vertOverflow="overflow" horzOverflow="overflow" vert="horz" wrap="square" lIns="43447" tIns="0" rIns="43447" bIns="0" numCol="1" spcCol="0" rtlCol="0" fromWordArt="0" anchor="ctr" anchorCtr="0" forceAA="0" compatLnSpc="1">
+                          <ns5:noAutofit/>
+                        </ns7:bodyPr>
+                      </ns7:wsp>
+                      <ns7:wsp>
+                        <ns7:cNvPr id="168235132" name="dgvOrderItemsAlt 7002192"/>
+                        <ns7:cNvSpPr/>
+                        <ns7:spPr>
+                          <ns5:xfrm>
+                            <ns5:off x="141203" y="1686288"/>
+                            <ns5:ext cx="5572082" cy="221037"/>
+                          </ns5:xfrm>
+                          <ns5:prstGeom prst="rect">
+                            <ns5:avLst/>
+                          </ns5:prstGeom>
+                          <ns5:solidFill>
+                            <ns5:srgbClr val="F5F5F8"/>
+                          </ns5:solidFill>
+                          <ns5:ln>
+                            <ns5:noFill/>
+                          </ns5:ln>
+                        </ns7:spPr>
+                        <ns7:style>
+                          <ns5:lnRef idx="2">
+                            <ns5:schemeClr val="dk1"/>
+                          </ns5:lnRef>
+                          <ns5:fillRef idx="0">
+                            <ns5:schemeClr val="lt1"/>
+                          </ns5:fillRef>
+                          <ns5:effectRef idx="0">
+                            <ns5:schemeClr val="dk1"/>
+                          </ns5:effectRef>
+                          <ns5:fontRef idx="minor">
+                            <ns5:schemeClr val="dk1"/>
+                          </ns5:fontRef>
+                        </ns7:style>
+                        <ns7:bodyPr rot="0" spcFirstLastPara="0" vertOverflow="overflow" horzOverflow="overflow" vert="horz" wrap="square" lIns="43447" tIns="0" rIns="43447" bIns="0" numCol="1" spcCol="0" rtlCol="0" fromWordArt="0" anchor="ctr" anchorCtr="0" forceAA="0" compatLnSpc="1">
+                          <ns5:noAutofit/>
+                        </ns7:bodyPr>
+                      </ns7:wsp>
+                      <ns7:wsp>
+                        <ns7:cNvPr id="1431034716" name="dgvOrderItemsAlt 7002329"/>
+                        <ns7:cNvSpPr/>
+                        <ns7:spPr>
+                          <ns5:xfrm>
+                            <ns5:off x="141203" y="2128361"/>
+                            <ns5:ext cx="5572082" cy="221037"/>
+                          </ns5:xfrm>
+                          <ns5:prstGeom prst="rect">
+                            <ns5:avLst/>
+                          </ns5:prstGeom>
+                          <ns5:solidFill>
+                            <ns5:srgbClr val="F5F5F8"/>
+                          </ns5:solidFill>
+                          <ns5:ln>
+                            <ns5:noFill/>
+                          </ns5:ln>
+                        </ns7:spPr>
+                        <ns7:style>
+                          <ns5:lnRef idx="2">
+                            <ns5:schemeClr val="dk1"/>
+                          </ns5:lnRef>
+                          <ns5:fillRef idx="0">
+                            <ns5:schemeClr val="lt1"/>
+                          </ns5:fillRef>
+                          <ns5:effectRef idx="0">
+                            <ns5:schemeClr val="dk1"/>
+                          </ns5:effectRef>
+                          <ns5:fontRef idx="minor">
+                            <ns5:schemeClr val="dk1"/>
+                          </ns5:fontRef>
+                        </ns7:style>
+                        <ns7:bodyPr rot="0" spcFirstLastPara="0" vertOverflow="overflow" horzOverflow="overflow" vert="horz" wrap="square" lIns="43447" tIns="0" rIns="43447" bIns="0" numCol="1" spcCol="0" rtlCol="0" fromWordArt="0" anchor="ctr" anchorCtr="0" forceAA="0" compatLnSpc="1">
+                          <ns5:noAutofit/>
+                        </ns7:bodyPr>
+                      </ns7:wsp>
+                      <ns7:wsp>
+                        <ns7:cNvPr id="1157358141" name="dgvOrderItemsAlt 7002466"/>
+                        <ns7:cNvSpPr/>
+                        <ns7:spPr>
+                          <ns5:xfrm>
+                            <ns5:off x="141203" y="2570435"/>
+                            <ns5:ext cx="5572082" cy="221037"/>
+                          </ns5:xfrm>
+                          <ns5:prstGeom prst="rect">
+                            <ns5:avLst/>
+                          </ns5:prstGeom>
+                          <ns5:solidFill>
+                            <ns5:srgbClr val="F5F5F8"/>
+                          </ns5:solidFill>
+                          <ns5:ln>
+                            <ns5:noFill/>
+                          </ns5:ln>
+                        </ns7:spPr>
+                        <ns7:style>
+                          <ns5:lnRef idx="2">
+                            <ns5:schemeClr val="dk1"/>
+                          </ns5:lnRef>
+                          <ns5:fillRef idx="0">
+                            <ns5:schemeClr val="lt1"/>
+                          </ns5:fillRef>
+                          <ns5:effectRef idx="0">
+                            <ns5:schemeClr val="dk1"/>
+                          </ns5:effectRef>
+                          <ns5:fontRef idx="minor">
+                            <ns5:schemeClr val="dk1"/>
+                          </ns5:fontRef>
+                        </ns7:style>
+                        <ns7:bodyPr rot="0" spcFirstLastPara="0" vertOverflow="overflow" horzOverflow="overflow" vert="horz" wrap="square" lIns="43447" tIns="0" rIns="43447" bIns="0" numCol="1" spcCol="0" rtlCol="0" fromWordArt="0" anchor="ctr" anchorCtr="0" forceAA="0" compatLnSpc="1">
+                          <ns5:noAutofit/>
+                        </ns7:bodyPr>
+                      </ns7:wsp>
+                      <ns7:wsp>
+                        <ns7:cNvPr id="1183325024" name="dgvOrderItemsHead 7002603"/>
+                        <ns7:cNvSpPr/>
+                        <ns7:spPr>
+                          <ns5:xfrm>
+                            <ns5:off x="173788" y="1238240"/>
+                            <ns5:ext cx="2556886" cy="227011"/>
+                          </ns5:xfrm>
+                          <ns5:prstGeom prst="rect">
+                            <ns5:avLst/>
+                          </ns5:prstGeom>
+                          <ns5:noFill/>
+                          <ns5:ln>
+                            <ns5:noFill/>
+                          </ns5:ln>
+                        </ns7:spPr>
+                        <ns7:style>
+                          <ns5:lnRef idx="2">
+                            <ns5:schemeClr val="dk1"/>
+                          </ns5:lnRef>
+                          <ns5:fillRef idx="0">
+                            <ns5:schemeClr val="lt1"/>
+                          </ns5:fillRef>
+                          <ns5:effectRef idx="0">
+                            <ns5:schemeClr val="dk1"/>
+                          </ns5:effectRef>
+                          <ns5:fontRef idx="minor">
+                            <ns5:schemeClr val="dk1"/>
+                          </ns5:fontRef>
+                        </ns7:style>
+                        <ns7:txbx>
+                          <w:txbxContent>
+                            <w:p ns2:paraId="0AEA1921" ns2:textId="77777777">
+                              <w:pPr>
+                                <w:rPr>
+                                  <w:b/>
+                                  <w:bCs/>
+                                  <w:color w:val="FFFFFF"/>
+                                  <w:sz w:val="19"/>
+                                  <w:szCs w:val="19"/>
+                                </w:rPr>
+                              </w:pPr>
+                              <w:r>
+                                <w:rPr>
+                                  <w:b/>
+                                  <w:bCs/>
+                                  <w:color w:val="FFFFFF"/>
+                                  <w:sz w:val="19"/>
+                                  <w:szCs w:val="19"/>
+                                </w:rPr>
+                                <w:t>Item</w:t>
+                              </w:r>
+                            </w:p>
+                          </w:txbxContent>
+                        </ns7:txbx>
+                        <ns7:bodyPr rot="0" spcFirstLastPara="0" vertOverflow="overflow" horzOverflow="overflow" vert="horz" wrap="square" lIns="0" tIns="0" rIns="0" bIns="0" numCol="1" spcCol="0" rtlCol="0" fromWordArt="0" anchor="ctr" anchorCtr="0" forceAA="0" compatLnSpc="1">
+                          <ns5:noAutofit/>
+                        </ns7:bodyPr>
+                      </ns7:wsp>
+                      <ns7:wsp>
+                        <ns7:cNvPr id="130280870" name="dgvOrderItemsCell 7002740"/>
+                        <ns7:cNvSpPr/>
+                        <ns7:spPr>
+                          <ns5:xfrm>
+                            <ns5:off x="173788" y="1465251"/>
+                            <ns5:ext cx="2491715" cy="221037"/>
+                          </ns5:xfrm>
+                          <ns5:prstGeom prst="rect">
+                            <ns5:avLst/>
+                          </ns5:prstGeom>
+                          <ns5:noFill/>
+                          <ns5:ln>
+                            <ns5:noFill/>
+                          </ns5:ln>
+                        </ns7:spPr>
+                        <ns7:style>
+                          <ns5:lnRef idx="2">
+                            <ns5:schemeClr val="dk1"/>
+                          </ns5:lnRef>
+                          <ns5:fillRef idx="0">
+                            <ns5:schemeClr val="lt1"/>
+                          </ns5:fillRef>
+                          <ns5:effectRef idx="0">
+                            <ns5:schemeClr val="dk1"/>
+                          </ns5:effectRef>
+                          <ns5:fontRef idx="minor">
+                            <ns5:schemeClr val="dk1"/>
+                          </ns5:fontRef>
+                        </ns7:style>
+                        <ns7:txbx>
+                          <w:txbxContent>
+                            <w:p ns2:paraId="1ACFA9D9" ns2:textId="77777777">
+                              <w:pPr>
+                                <w:rPr>
+                                  <w:color w:val="000000"/>
+                                  <w:sz w:val="19"/>
+                                  <w:szCs w:val="19"/>
+                                </w:rPr>
+                              </w:pPr>
+                              <w:r>
+                                <w:rPr>
+                                  <w:color w:val="000000"/>
+                                  <w:sz w:val="19"/>
+                                  <w:szCs w:val="19"/>
+                                </w:rPr>
+                                <w:t>Large Popcorn</w:t>
+                              </w:r>
+                            </w:p>
+                          </w:txbxContent>
+                        </ns7:txbx>
+                        <ns7:bodyPr rot="0" spcFirstLastPara="0" vertOverflow="overflow" horzOverflow="overflow" vert="horz" wrap="square" lIns="0" tIns="0" rIns="0" bIns="0" numCol="1" spcCol="0" rtlCol="0" fromWordArt="0" anchor="ctr" anchorCtr="0" forceAA="0" compatLnSpc="1">
+                          <ns5:noAutofit/>
+                        </ns7:bodyPr>
+                      </ns7:wsp>
+                      <ns7:wsp>
+                        <ns7:cNvPr id="1061950326" name="dgvOrderItemsCell 7002877"/>
+                        <ns7:cNvSpPr/>
+                        <ns7:spPr>
+                          <ns5:xfrm>
+                            <ns5:off x="173788" y="1686288"/>
+                            <ns5:ext cx="2491715" cy="221037"/>
+                          </ns5:xfrm>
+                          <ns5:prstGeom prst="rect">
+                            <ns5:avLst/>
+                          </ns5:prstGeom>
+                          <ns5:noFill/>
+                          <ns5:ln>
+                            <ns5:noFill/>
+                          </ns5:ln>
+                        </ns7:spPr>
+                        <ns7:style>
+                          <ns5:lnRef idx="2">
+                            <ns5:schemeClr val="dk1"/>
+                          </ns5:lnRef>
+                          <ns5:fillRef idx="0">
+                            <ns5:schemeClr val="lt1"/>
+                          </ns5:fillRef>
+                          <ns5:effectRef idx="0">
+                            <ns5:schemeClr val="dk1"/>
+                          </ns5:effectRef>
+                          <ns5:fontRef idx="minor">
+                            <ns5:schemeClr val="dk1"/>
+                          </ns5:fontRef>
+                        </ns7:style>
+                        <ns7:txbx>
+                          <w:txbxContent>
+                            <w:p ns2:paraId="24FFCD5D" ns2:textId="77777777">
+                              <w:pPr>
+                                <w:rPr>
+                                  <w:color w:val="000000"/>
+                                  <w:sz w:val="19"/>
+                                  <w:szCs w:val="19"/>
+                                </w:rPr>
+                              </w:pPr>
+                              <w:r>
+                                <w:rPr>
+                                  <w:color w:val="000000"/>
+                                  <w:sz w:val="19"/>
+                                  <w:szCs w:val="19"/>
+                                </w:rPr>
+                                <w:t>Medium Popcorn</w:t>
+                              </w:r>
+                            </w:p>
+                          </w:txbxContent>
+                        </ns7:txbx>
+                        <ns7:bodyPr rot="0" spcFirstLastPara="0" vertOverflow="overflow" horzOverflow="overflow" vert="horz" wrap="square" lIns="0" tIns="0" rIns="0" bIns="0" numCol="1" spcCol="0" rtlCol="0" fromWordArt="0" anchor="ctr" anchorCtr="0" forceAA="0" compatLnSpc="1">
+                          <ns5:noAutofit/>
+                        </ns7:bodyPr>
+                      </ns7:wsp>
+                      <ns7:wsp>
+                        <ns7:cNvPr id="1191642318" name="dgvOrderItemsCell 7003014"/>
+                        <ns7:cNvSpPr/>
+                        <ns7:spPr>
+                          <ns5:xfrm>
+                            <ns5:off x="173788" y="1907325"/>
+                            <ns5:ext cx="2491715" cy="221037"/>
+                          </ns5:xfrm>
+                          <ns5:prstGeom prst="rect">
+                            <ns5:avLst/>
+                          </ns5:prstGeom>
+                          <ns5:noFill/>
+                          <ns5:ln>
+                            <ns5:noFill/>
+                          </ns5:ln>
+                        </ns7:spPr>
+                        <ns7:style>
+                          <ns5:lnRef idx="2">
+                            <ns5:schemeClr val="dk1"/>
+                          </ns5:lnRef>
+                          <ns5:fillRef idx="0">
+                            <ns5:schemeClr val="lt1"/>
+                          </ns5:fillRef>
+                          <ns5:effectRef idx="0">
+                            <ns5:schemeClr val="dk1"/>
+                          </ns5:effectRef>
+                          <ns5:fontRef idx="minor">
+                            <ns5:schemeClr val="dk1"/>
+                          </ns5:fontRef>
+                        </ns7:style>
+                        <ns7:txbx>
+                          <w:txbxContent>
+                            <w:p ns2:paraId="45EFBC6E" ns2:textId="77777777">
+                              <w:pPr>
+                                <w:rPr>
+                                  <w:color w:val="000000"/>
+                                  <w:sz w:val="19"/>
+                                  <w:szCs w:val="19"/>
+                                </w:rPr>
+                              </w:pPr>
+                              <w:r>
+                                <w:rPr>
+                                  <w:color w:val="000000"/>
+                                  <w:sz w:val="19"/>
+                                  <w:szCs w:val="19"/>
+                                </w:rPr>
+                                <w:t>Coca Cola</w:t>
+                              </w:r>
+                            </w:p>
+                          </w:txbxContent>
+                        </ns7:txbx>
+                        <ns7:bodyPr rot="0" spcFirstLastPara="0" vertOverflow="overflow" horzOverflow="overflow" vert="horz" wrap="square" lIns="0" tIns="0" rIns="0" bIns="0" numCol="1" spcCol="0" rtlCol="0" fromWordArt="0" anchor="ctr" anchorCtr="0" forceAA="0" compatLnSpc="1">
+                          <ns5:noAutofit/>
+                        </ns7:bodyPr>
+                      </ns7:wsp>
+                      <ns7:wsp>
+                        <ns7:cNvPr id="2090878358" name="dgvOrderItemsCell 7003151"/>
+                        <ns7:cNvSpPr/>
+                        <ns7:spPr>
+                          <ns5:xfrm>
+                            <ns5:off x="173788" y="2128361"/>
+                            <ns5:ext cx="2491715" cy="221037"/>
+                          </ns5:xfrm>
+                          <ns5:prstGeom prst="rect">
+                            <ns5:avLst/>
+                          </ns5:prstGeom>
+                          <ns5:noFill/>
+                          <ns5:ln>
+                            <ns5:noFill/>
+                          </ns5:ln>
+                        </ns7:spPr>
+                        <ns7:style>
+                          <ns5:lnRef idx="2">
+                            <ns5:schemeClr val="dk1"/>
+                          </ns5:lnRef>
+                          <ns5:fillRef idx="0">
+                            <ns5:schemeClr val="lt1"/>
+                          </ns5:fillRef>
+                          <ns5:effectRef idx="0">
+                            <ns5:schemeClr val="dk1"/>
+                          </ns5:effectRef>
+                          <ns5:fontRef idx="minor">
+                            <ns5:schemeClr val="dk1"/>
+                          </ns5:fontRef>
+                        </ns7:style>
+                        <ns7:txbx>
+                          <w:txbxContent>
+                            <w:p ns2:paraId="793EB53D" ns2:textId="77777777">
+                              <w:pPr>
+                                <w:rPr>
+                                  <w:color w:val="000000"/>
+                                  <w:sz w:val="19"/>
+                                  <w:szCs w:val="19"/>
+                                </w:rPr>
+                              </w:pPr>
+                              <w:r>
+                                <w:rPr>
+                                  <w:color w:val="000000"/>
+                                  <w:sz w:val="19"/>
+                                  <w:szCs w:val="19"/>
+                                </w:rPr>
+                                <w:t>Water</w:t>
+                              </w:r>
+                            </w:p>
+                          </w:txbxContent>
+                        </ns7:txbx>
+                        <ns7:bodyPr rot="0" spcFirstLastPara="0" vertOverflow="overflow" horzOverflow="overflow" vert="horz" wrap="square" lIns="0" tIns="0" rIns="0" bIns="0" numCol="1" spcCol="0" rtlCol="0" fromWordArt="0" anchor="ctr" anchorCtr="0" forceAA="0" compatLnSpc="1">
+                          <ns5:noAutofit/>
+                        </ns7:bodyPr>
+                      </ns7:wsp>
+                      <ns7:wsp>
+                        <ns7:cNvPr id="1824024305" name="dgvOrderItemsCell 7003288"/>
+                        <ns7:cNvSpPr/>
+                        <ns7:spPr>
+                          <ns5:xfrm>
+                            <ns5:off x="173788" y="2349398"/>
+                            <ns5:ext cx="2491715" cy="221037"/>
+                          </ns5:xfrm>
+                          <ns5:prstGeom prst="rect">
+                            <ns5:avLst/>
+                          </ns5:prstGeom>
+                          <ns5:noFill/>
+                          <ns5:ln>
+                            <ns5:noFill/>
+                          </ns5:ln>
+                        </ns7:spPr>
+                        <ns7:style>
+                          <ns5:lnRef idx="2">
+                            <ns5:schemeClr val="dk1"/>
+                          </ns5:lnRef>
+                          <ns5:fillRef idx="0">
+                            <ns5:schemeClr val="lt1"/>
+                          </ns5:fillRef>
+                          <ns5:effectRef idx="0">
+                            <ns5:schemeClr val="dk1"/>
+                          </ns5:effectRef>
+                          <ns5:fontRef idx="minor">
+                            <ns5:schemeClr val="dk1"/>
+                          </ns5:fontRef>
+                        </ns7:style>
+                        <ns7:txbx>
+                          <w:txbxContent>
+                            <w:p ns2:paraId="429D6681" ns2:textId="77777777">
+                              <w:pPr>
+                                <w:rPr>
+                                  <w:color w:val="000000"/>
+                                  <w:sz w:val="19"/>
+                                  <w:szCs w:val="19"/>
+                                </w:rPr>
+                              </w:pPr>
+                              <w:r>
+                                <w:rPr>
+                                  <w:color w:val="000000"/>
+                                  <w:sz w:val="19"/>
+                                  <w:szCs w:val="19"/>
+                                </w:rPr>
+                                <w:t>Nachos</w:t>
+                              </w:r>
+                            </w:p>
+                          </w:txbxContent>
+                        </ns7:txbx>
+                        <ns7:bodyPr rot="0" spcFirstLastPara="0" vertOverflow="overflow" horzOverflow="overflow" vert="horz" wrap="square" lIns="0" tIns="0" rIns="0" bIns="0" numCol="1" spcCol="0" rtlCol="0" fromWordArt="0" anchor="ctr" anchorCtr="0" forceAA="0" compatLnSpc="1">
+                          <ns5:noAutofit/>
+                        </ns7:bodyPr>
+                      </ns7:wsp>
+                      <ns7:wsp>
+                        <ns7:cNvPr id="203492248" name="dgvOrderItemsCell 7003425"/>
+                        <ns7:cNvSpPr/>
+                        <ns7:spPr>
+                          <ns5:xfrm>
+                            <ns5:off x="173788" y="2570435"/>
+                            <ns5:ext cx="2491715" cy="221037"/>
+                          </ns5:xfrm>
+                          <ns5:prstGeom prst="rect">
+                            <ns5:avLst/>
+                          </ns5:prstGeom>
+                          <ns5:noFill/>
+                          <ns5:ln>
+                            <ns5:noFill/>
+                          </ns5:ln>
+                        </ns7:spPr>
+                        <ns7:style>
+                          <ns5:lnRef idx="2">
+                            <ns5:schemeClr val="dk1"/>
+                          </ns5:lnRef>
+                          <ns5:fillRef idx="0">
+                            <ns5:schemeClr val="lt1"/>
+                          </ns5:fillRef>
+                          <ns5:effectRef idx="0">
+                            <ns5:schemeClr val="dk1"/>
+                          </ns5:effectRef>
+                          <ns5:fontRef idx="minor">
+                            <ns5:schemeClr val="dk1"/>
+                          </ns5:fontRef>
+                        </ns7:style>
+                        <ns7:txbx>
+                          <w:txbxContent>
+                            <w:p ns2:paraId="567EAEDB" ns2:textId="77777777">
+                              <w:pPr>
+                                <w:rPr>
+                                  <w:color w:val="000000"/>
+                                  <w:sz w:val="19"/>
+                                  <w:szCs w:val="19"/>
+                                </w:rPr>
+                              </w:pPr>
+                              <w:r>
+                                <w:rPr>
+                                  <w:color w:val="000000"/>
+                                  <w:sz w:val="19"/>
+                                  <w:szCs w:val="19"/>
+                                </w:rPr>
+                                <w:t>Small Popcorn</w:t>
+                              </w:r>
+                            </w:p>
+                          </w:txbxContent>
+                        </ns7:txbx>
+                        <ns7:bodyPr rot="0" spcFirstLastPara="0" vertOverflow="overflow" horzOverflow="overflow" vert="horz" wrap="square" lIns="0" tIns="0" rIns="0" bIns="0" numCol="1" spcCol="0" rtlCol="0" fromWordArt="0" anchor="ctr" anchorCtr="0" forceAA="0" compatLnSpc="1">
+                          <ns5:noAutofit/>
+                        </ns7:bodyPr>
+                      </ns7:wsp>
+                      <ns7:wsp>
+                        <ns7:cNvPr id="1758580154" name="dgvOrderItemsHead 7003562"/>
+                        <ns7:cNvSpPr/>
+                        <ns7:spPr>
+                          <ns5:xfrm>
+                            <ns5:off x="2730674" y="1238240"/>
+                            <ns5:ext cx="1085470" cy="227011"/>
+                          </ns5:xfrm>
+                          <ns5:prstGeom prst="rect">
+                            <ns5:avLst/>
+                          </ns5:prstGeom>
+                          <ns5:noFill/>
+                          <ns5:ln>
+                            <ns5:noFill/>
+                          </ns5:ln>
+                        </ns7:spPr>
+                        <ns7:style>
+                          <ns5:lnRef idx="2">
+                            <ns5:schemeClr val="dk1"/>
+                          </ns5:lnRef>
+                          <ns5:fillRef idx="0">
+                            <ns5:schemeClr val="lt1"/>
+                          </ns5:fillRef>
+                          <ns5:effectRef idx="0">
+                            <ns5:schemeClr val="dk1"/>
+                          </ns5:effectRef>
+                          <ns5:fontRef idx="minor">
+                            <ns5:schemeClr val="dk1"/>
+                          </ns5:fontRef>
+                        </ns7:style>
+                        <ns7:txbx>
+                          <w:txbxContent>
+                            <w:p ns2:paraId="085765CF" ns2:textId="77777777">
+                              <w:pPr>
+                                <w:rPr>
+                                  <w:b/>
+                                  <w:bCs/>
+                                  <w:color w:val="FFFFFF"/>
+                                  <w:sz w:val="19"/>
+                                  <w:szCs w:val="19"/>
+                                </w:rPr>
+                              </w:pPr>
+                              <w:r>
+                                <w:rPr>
+                                  <w:b/>
+                                  <w:bCs/>
+                                  <w:color w:val="FFFFFF"/>
+                                  <w:sz w:val="19"/>
+                                  <w:szCs w:val="19"/>
+                                </w:rPr>
+                                <w:t>Price</w:t>
+                              </w:r>
+                            </w:p>
+                          </w:txbxContent>
+                        </ns7:txbx>
+                        <ns7:bodyPr rot="0" spcFirstLastPara="0" vertOverflow="overflow" horzOverflow="overflow" vert="horz" wrap="square" lIns="0" tIns="0" rIns="0" bIns="0" numCol="1" spcCol="0" rtlCol="0" fromWordArt="0" anchor="ctr" anchorCtr="0" forceAA="0" compatLnSpc="1">
+                          <ns5:noAutofit/>
+                        </ns7:bodyPr>
+                      </ns7:wsp>
+                      <ns7:wsp>
+                        <ns7:cNvPr id="1479699857" name="dgvOrderItemsCell 7003699"/>
+                        <ns7:cNvSpPr/>
+                        <ns7:spPr>
+                          <ns5:xfrm>
+                            <ns5:off x="2730674" y="1465251"/>
+                            <ns5:ext cx="1020300" cy="221037"/>
+                          </ns5:xfrm>
+                          <ns5:prstGeom prst="rect">
+                            <ns5:avLst/>
+                          </ns5:prstGeom>
+                          <ns5:noFill/>
+                          <ns5:ln>
+                            <ns5:noFill/>
+                          </ns5:ln>
+                        </ns7:spPr>
+                        <ns7:style>
+                          <ns5:lnRef idx="2">
+                            <ns5:schemeClr val="dk1"/>
+                          </ns5:lnRef>
+                          <ns5:fillRef idx="0">
+                            <ns5:schemeClr val="lt1"/>
+                          </ns5:fillRef>
+                          <ns5:effectRef idx="0">
+                            <ns5:schemeClr val="dk1"/>
+                          </ns5:effectRef>
+                          <ns5:fontRef idx="minor">
+                            <ns5:schemeClr val="dk1"/>
+                          </ns5:fontRef>
+                        </ns7:style>
+                        <ns7:txbx>
+                          <w:txbxContent>
+                            <w:p ns2:paraId="678A40DC" ns2:textId="77777777">
+                              <w:pPr>
+                                <w:rPr>
+                                  <w:color w:val="000000"/>
+                                  <w:sz w:val="19"/>
+                                  <w:szCs w:val="19"/>
+                                </w:rPr>
+                              </w:pPr>
+                              <w:r>
+                                <w:rPr>
+                                  <w:color w:val="000000"/>
+                                  <w:sz w:val="19"/>
+                                  <w:szCs w:val="19"/>
+                                </w:rPr>
+                                <w:t>£4.99</w:t>
+                              </w:r>
+                            </w:p>
+                          </w:txbxContent>
+                        </ns7:txbx>
+                        <ns7:bodyPr rot="0" spcFirstLastPara="0" vertOverflow="overflow" horzOverflow="overflow" vert="horz" wrap="square" lIns="0" tIns="0" rIns="0" bIns="0" numCol="1" spcCol="0" rtlCol="0" fromWordArt="0" anchor="ctr" anchorCtr="0" forceAA="0" compatLnSpc="1">
+                          <ns5:noAutofit/>
+                        </ns7:bodyPr>
+                      </ns7:wsp>
+                      <ns7:wsp>
+                        <ns7:cNvPr id="319845551" name="dgvOrderItemsCell 7003836"/>
+                        <ns7:cNvSpPr/>
+                        <ns7:spPr>
+                          <ns5:xfrm>
+                            <ns5:off x="2730674" y="1686288"/>
+                            <ns5:ext cx="1020300" cy="221037"/>
+                          </ns5:xfrm>
+                          <ns5:prstGeom prst="rect">
+                            <ns5:avLst/>
+                          </ns5:prstGeom>
+                          <ns5:noFill/>
+                          <ns5:ln>
+                            <ns5:noFill/>
+                          </ns5:ln>
+                        </ns7:spPr>
+                        <ns7:style>
+                          <ns5:lnRef idx="2">
+                            <ns5:schemeClr val="dk1"/>
+                          </ns5:lnRef>
+                          <ns5:fillRef idx="0">
+                            <ns5:schemeClr val="lt1"/>
+                          </ns5:fillRef>
+                          <ns5:effectRef idx="0">
+                            <ns5:schemeClr val="dk1"/>
+                          </ns5:effectRef>
+                          <ns5:fontRef idx="minor">
+                            <ns5:schemeClr val="dk1"/>
+                          </ns5:fontRef>
+                        </ns7:style>
+                        <ns7:txbx>
+                          <w:txbxContent>
+                            <w:p ns2:paraId="65C66A52" ns2:textId="77777777">
+                              <w:pPr>
+                                <w:rPr>
+                                  <w:color w:val="000000"/>
+                                  <w:sz w:val="19"/>
+                                  <w:szCs w:val="19"/>
+                                </w:rPr>
+                              </w:pPr>
+                              <w:r>
+                                <w:rPr>
+                                  <w:color w:val="000000"/>
+                                  <w:sz w:val="19"/>
+                                  <w:szCs w:val="19"/>
+                                </w:rPr>
+                                <w:t>£3.99</w:t>
+                              </w:r>
+                            </w:p>
+                          </w:txbxContent>
+                        </ns7:txbx>
+                        <ns7:bodyPr rot="0" spcFirstLastPara="0" vertOverflow="overflow" horzOverflow="overflow" vert="horz" wrap="square" lIns="0" tIns="0" rIns="0" bIns="0" numCol="1" spcCol="0" rtlCol="0" fromWordArt="0" anchor="ctr" anchorCtr="0" forceAA="0" compatLnSpc="1">
+                          <ns5:noAutofit/>
+                        </ns7:bodyPr>
+                      </ns7:wsp>
+                      <ns7:wsp>
+                        <ns7:cNvPr id="1368868341" name="dgvOrderItemsCell 7003973"/>
+                        <ns7:cNvSpPr/>
+                        <ns7:spPr>
+                          <ns5:xfrm>
+                            <ns5:off x="2730674" y="1907325"/>
+                            <ns5:ext cx="1020300" cy="221037"/>
+                          </ns5:xfrm>
+                          <ns5:prstGeom prst="rect">
+                            <ns5:avLst/>
+                          </ns5:prstGeom>
+                          <ns5:noFill/>
+                          <ns5:ln>
+                            <ns5:noFill/>
+                          </ns5:ln>
+                        </ns7:spPr>
+                        <ns7:style>
+                          <ns5:lnRef idx="2">
+                            <ns5:schemeClr val="dk1"/>
+                          </ns5:lnRef>
+                          <ns5:fillRef idx="0">
+                            <ns5:schemeClr val="lt1"/>
+                          </ns5:fillRef>
+                          <ns5:effectRef idx="0">
+                            <ns5:schemeClr val="dk1"/>
+                          </ns5:effectRef>
+                          <ns5:fontRef idx="minor">
+                            <ns5:schemeClr val="dk1"/>
+                          </ns5:fontRef>
+                        </ns7:style>
+                        <ns7:txbx>
+                          <w:txbxContent>
+                            <w:p ns2:paraId="29B1E118" ns2:textId="77777777">
+                              <w:pPr>
+                                <w:rPr>
+                                  <w:color w:val="000000"/>
+                                  <w:sz w:val="19"/>
+                                  <w:szCs w:val="19"/>
+                                </w:rPr>
+                              </w:pPr>
+                              <w:r>
+                                <w:rPr>
+                                  <w:color w:val="000000"/>
+                                  <w:sz w:val="19"/>
+                                  <w:szCs w:val="19"/>
+                                </w:rPr>
+                                <w:t>£2.99</w:t>
+                              </w:r>
+                            </w:p>
+                          </w:txbxContent>
+                        </ns7:txbx>
+                        <ns7:bodyPr rot="0" spcFirstLastPara="0" vertOverflow="overflow" horzOverflow="overflow" vert="horz" wrap="square" lIns="0" tIns="0" rIns="0" bIns="0" numCol="1" spcCol="0" rtlCol="0" fromWordArt="0" anchor="ctr" anchorCtr="0" forceAA="0" compatLnSpc="1">
+                          <ns5:noAutofit/>
+                        </ns7:bodyPr>
+                      </ns7:wsp>
+                      <ns7:wsp>
+                        <ns7:cNvPr id="1132224169" name="dgvOrderItemsCell 7004110"/>
+                        <ns7:cNvSpPr/>
+                        <ns7:spPr>
+                          <ns5:xfrm>
+                            <ns5:off x="2730674" y="2128361"/>
+                            <ns5:ext cx="1020300" cy="221037"/>
+                          </ns5:xfrm>
+                          <ns5:prstGeom prst="rect">
+                            <ns5:avLst/>
+                          </ns5:prstGeom>
+                          <ns5:noFill/>
+                          <ns5:ln>
+                            <ns5:noFill/>
+                          </ns5:ln>
+                        </ns7:spPr>
+                        <ns7:style>
+                          <ns5:lnRef idx="2">
+                            <ns5:schemeClr val="dk1"/>
+                          </ns5:lnRef>
+                          <ns5:fillRef idx="0">
+                            <ns5:schemeClr val="lt1"/>
+                          </ns5:fillRef>
+                          <ns5:effectRef idx="0">
+                            <ns5:schemeClr val="dk1"/>
+                          </ns5:effectRef>
+                          <ns5:fontRef idx="minor">
+                            <ns5:schemeClr val="dk1"/>
+                          </ns5:fontRef>
+                        </ns7:style>
+                        <ns7:txbx>
+                          <w:txbxContent>
+                            <w:p ns2:paraId="4B9B42FD" ns2:textId="77777777">
+                              <w:pPr>
+                                <w:rPr>
+                                  <w:color w:val="000000"/>
+                                  <w:sz w:val="19"/>
+                                  <w:szCs w:val="19"/>
+                                </w:rPr>
+                              </w:pPr>
+                              <w:r>
+                                <w:rPr>
+                                  <w:color w:val="000000"/>
+                                  <w:sz w:val="19"/>
+                                  <w:szCs w:val="19"/>
+                                </w:rPr>
+                                <w:t>£1.99</w:t>
+                              </w:r>
+                            </w:p>
+                          </w:txbxContent>
+                        </ns7:txbx>
+                        <ns7:bodyPr rot="0" spcFirstLastPara="0" vertOverflow="overflow" horzOverflow="overflow" vert="horz" wrap="square" lIns="0" tIns="0" rIns="0" bIns="0" numCol="1" spcCol="0" rtlCol="0" fromWordArt="0" anchor="ctr" anchorCtr="0" forceAA="0" compatLnSpc="1">
+                          <ns5:noAutofit/>
+                        </ns7:bodyPr>
+                      </ns7:wsp>
+                      <ns7:wsp>
+                        <ns7:cNvPr id="113250449" name="dgvOrderItemsCell 7004247"/>
+                        <ns7:cNvSpPr/>
+                        <ns7:spPr>
+                          <ns5:xfrm>
+                            <ns5:off x="2730674" y="2349398"/>
+                            <ns5:ext cx="1020300" cy="221037"/>
+                          </ns5:xfrm>
+                          <ns5:prstGeom prst="rect">
+                            <ns5:avLst/>
+                          </ns5:prstGeom>
+                          <ns5:noFill/>
+                          <ns5:ln>
+                            <ns5:noFill/>
+                          </ns5:ln>
+                        </ns7:spPr>
+                        <ns7:style>
+                          <ns5:lnRef idx="2">
+                            <ns5:schemeClr val="dk1"/>
+                          </ns5:lnRef>
+                          <ns5:fillRef idx="0">
+                            <ns5:schemeClr val="lt1"/>
+                          </ns5:fillRef>
+                          <ns5:effectRef idx="0">
+                            <ns5:schemeClr val="dk1"/>
+                          </ns5:effectRef>
+                          <ns5:fontRef idx="minor">
+                            <ns5:schemeClr val="dk1"/>
+                          </ns5:fontRef>
+                        </ns7:style>
+                        <ns7:txbx>
+                          <w:txbxContent>
+                            <w:p ns2:paraId="411EB58F" ns2:textId="77777777">
+                              <w:pPr>
+                                <w:rPr>
+                                  <w:color w:val="000000"/>
+                                  <w:sz w:val="19"/>
+                                  <w:szCs w:val="19"/>
+                                </w:rPr>
+                              </w:pPr>
+                              <w:r>
+                                <w:rPr>
+                                  <w:color w:val="000000"/>
+                                  <w:sz w:val="19"/>
+                                  <w:szCs w:val="19"/>
+                                </w:rPr>
+                                <w:t>£4.49</w:t>
+                              </w:r>
+                            </w:p>
+                          </w:txbxContent>
+                        </ns7:txbx>
+                        <ns7:bodyPr rot="0" spcFirstLastPara="0" vertOverflow="overflow" horzOverflow="overflow" vert="horz" wrap="square" lIns="0" tIns="0" rIns="0" bIns="0" numCol="1" spcCol="0" rtlCol="0" fromWordArt="0" anchor="ctr" anchorCtr="0" forceAA="0" compatLnSpc="1">
+                          <ns5:noAutofit/>
+                        </ns7:bodyPr>
+                      </ns7:wsp>
+                      <ns7:wsp>
+                        <ns7:cNvPr id="1623362419" name="dgvOrderItemsCell 7004384"/>
+                        <ns7:cNvSpPr/>
+                        <ns7:spPr>
+                          <ns5:xfrm>
+                            <ns5:off x="2730674" y="2570435"/>
+                            <ns5:ext cx="1020300" cy="221037"/>
+                          </ns5:xfrm>
+                          <ns5:prstGeom prst="rect">
+                            <ns5:avLst/>
+                          </ns5:prstGeom>
+                          <ns5:noFill/>
+                          <ns5:ln>
+                            <ns5:noFill/>
+                          </ns5:ln>
+                        </ns7:spPr>
+                        <ns7:style>
+                          <ns5:lnRef idx="2">
+                            <ns5:schemeClr val="dk1"/>
+                          </ns5:lnRef>
+                          <ns5:fillRef idx="0">
+                            <ns5:schemeClr val="lt1"/>
+                          </ns5:fillRef>
+                          <ns5:effectRef idx="0">
+                            <ns5:schemeClr val="dk1"/>
+                          </ns5:effectRef>
+                          <ns5:fontRef idx="minor">
+                            <ns5:schemeClr val="dk1"/>
+                          </ns5:fontRef>
+                        </ns7:style>
+                        <ns7:txbx>
+                          <w:txbxContent>
+                            <w:p ns2:paraId="64B24161" ns2:textId="77777777">
+                              <w:pPr>
+                                <w:rPr>
+                                  <w:color w:val="000000"/>
+                                  <w:sz w:val="19"/>
+                                  <w:szCs w:val="19"/>
+                                </w:rPr>
+                              </w:pPr>
+                              <w:r>
+                                <w:rPr>
+                                  <w:color w:val="000000"/>
+                                  <w:sz w:val="19"/>
+                                  <w:szCs w:val="19"/>
+                                </w:rPr>
+                                <w:t>£1.99</w:t>
+                              </w:r>
+                            </w:p>
+                          </w:txbxContent>
+                        </ns7:txbx>
+                        <ns7:bodyPr rot="0" spcFirstLastPara="0" vertOverflow="overflow" horzOverflow="overflow" vert="horz" wrap="square" lIns="0" tIns="0" rIns="0" bIns="0" numCol="1" spcCol="0" rtlCol="0" fromWordArt="0" anchor="ctr" anchorCtr="0" forceAA="0" compatLnSpc="1">
+                          <ns5:noAutofit/>
+                        </ns7:bodyPr>
+                      </ns7:wsp>
+                      <ns7:wsp>
+                        <ns7:cNvPr id="445870705" name="dgvOrderItemsVLine 7004521"/>
+                        <ns7:cNvSpPr/>
+                        <ns7:spPr>
+                          <ns5:xfrm>
+                            <ns5:off x="2687227" y="1465251"/>
+                            <ns5:ext cx="8689" cy="1326221"/>
+                          </ns5:xfrm>
+                          <ns5:prstGeom prst="rect">
+                            <ns5:avLst/>
+                          </ns5:prstGeom>
+                          <ns5:solidFill>
+                            <ns5:srgbClr val="D2D2D2"/>
+                          </ns5:solidFill>
+                          <ns5:ln>
+                            <ns5:noFill/>
+                          </ns5:ln>
+                        </ns7:spPr>
+                        <ns7:style>
+                          <ns5:lnRef idx="2">
+                            <ns5:schemeClr val="dk1"/>
+                          </ns5:lnRef>
+                          <ns5:fillRef idx="0">
+                            <ns5:schemeClr val="lt1"/>
+                          </ns5:fillRef>
+                          <ns5:effectRef idx="0">
+                            <ns5:schemeClr val="dk1"/>
+                          </ns5:effectRef>
+                          <ns5:fontRef idx="minor">
+                            <ns5:schemeClr val="dk1"/>
+                          </ns5:fontRef>
+                        </ns7:style>
+                        <ns7:bodyPr rot="0" spcFirstLastPara="0" vertOverflow="overflow" horzOverflow="overflow" vert="horz" wrap="square" lIns="43447" tIns="0" rIns="43447" bIns="0" numCol="1" spcCol="0" rtlCol="0" fromWordArt="0" anchor="ctr" anchorCtr="0" forceAA="0" compatLnSpc="1">
+                          <ns5:noAutofit/>
+                        </ns7:bodyPr>
+                      </ns7:wsp>
+                      <ns7:wsp>
+                        <ns7:cNvPr id="1064539135" name="dgvOrderItemsHead 7004658"/>
+                        <ns7:cNvSpPr/>
+                        <ns7:spPr>
+                          <ns5:xfrm>
+                            <ns5:off x="3816145" y="1238240"/>
+                            <ns5:ext cx="723647" cy="227011"/>
+                          </ns5:xfrm>
+                          <ns5:prstGeom prst="rect">
+                            <ns5:avLst/>
+                          </ns5:prstGeom>
+                          <ns5:noFill/>
+                          <ns5:ln>
+                            <ns5:noFill/>
+                          </ns5:ln>
+                        </ns7:spPr>
+                        <ns7:style>
+                          <ns5:lnRef idx="2">
+                            <ns5:schemeClr val="dk1"/>
+                          </ns5:lnRef>
+                          <ns5:fillRef idx="0">
+                            <ns5:schemeClr val="lt1"/>
+                          </ns5:fillRef>
+                          <ns5:effectRef idx="0">
+                            <ns5:schemeClr val="dk1"/>
+                          </ns5:effectRef>
+                          <ns5:fontRef idx="minor">
+                            <ns5:schemeClr val="dk1"/>
+                          </ns5:fontRef>
+                        </ns7:style>
+                        <ns7:txbx>
+                          <w:txbxContent>
+                            <w:p ns2:paraId="32F393E6" ns2:textId="77777777">
+                              <w:pPr>
+                                <w:rPr>
+                                  <w:b/>
+                                  <w:bCs/>
+                                  <w:color w:val="FFFFFF"/>
+                                  <w:sz w:val="19"/>
+                                  <w:szCs w:val="19"/>
+                                </w:rPr>
+                              </w:pPr>
+                              <w:r>
+                                <w:rPr>
+                                  <w:b/>
+                                  <w:bCs/>
+                                  <w:color w:val="FFFFFF"/>
+                                  <w:sz w:val="19"/>
+                                  <w:szCs w:val="19"/>
+                                </w:rPr>
+                                <w:t>Qty</w:t>
+                              </w:r>
+                            </w:p>
+                          </w:txbxContent>
+                        </ns7:txbx>
+                        <ns7:bodyPr rot="0" spcFirstLastPara="0" vertOverflow="overflow" horzOverflow="overflow" vert="horz" wrap="square" lIns="0" tIns="0" rIns="0" bIns="0" numCol="1" spcCol="0" rtlCol="0" fromWordArt="0" anchor="ctr" anchorCtr="0" forceAA="0" compatLnSpc="1">
+                          <ns5:noAutofit/>
+                        </ns7:bodyPr>
+                      </ns7:wsp>
+                      <ns7:wsp>
+                        <ns7:cNvPr id="1554706727" name="dgvOrderItemsCell 7004795"/>
+                        <ns7:cNvSpPr/>
+                        <ns7:spPr>
+                          <ns5:xfrm>
+                            <ns5:off x="3816145" y="1465251"/>
+                            <ns5:ext cx="658476" cy="221037"/>
+                          </ns5:xfrm>
+                          <ns5:prstGeom prst="rect">
+                            <ns5:avLst/>
+                          </ns5:prstGeom>
+                          <ns5:noFill/>
+                          <ns5:ln>
+                            <ns5:noFill/>
+                          </ns5:ln>
+                        </ns7:spPr>
+                        <ns7:style>
+                          <ns5:lnRef idx="2">
+                            <ns5:schemeClr val="dk1"/>
+                          </ns5:lnRef>
+                          <ns5:fillRef idx="0">
+                            <ns5:schemeClr val="lt1"/>
+                          </ns5:fillRef>
+                          <ns5:effectRef idx="0">
+                            <ns5:schemeClr val="dk1"/>
+                          </ns5:effectRef>
+                          <ns5:fontRef idx="minor">
+                            <ns5:schemeClr val="dk1"/>
+                          </ns5:fontRef>
+                        </ns7:style>
+                        <ns7:txbx>
+                          <w:txbxContent>
+                            <w:p ns2:paraId="7EFBBBB1" ns2:textId="77777777">
+                              <w:pPr>
+                                <w:rPr>
+                                  <w:color w:val="000000"/>
+                                  <w:sz w:val="19"/>
+                                  <w:szCs w:val="19"/>
+                                </w:rPr>
+                              </w:pPr>
+                              <w:r>
+                                <w:rPr>
+                                  <w:color w:val="000000"/>
+                                  <w:sz w:val="19"/>
+                                  <w:szCs w:val="19"/>
+                                </w:rPr>
+                                <w:t>4</w:t>
+                              </w:r>
+                            </w:p>
+                          </w:txbxContent>
+                        </ns7:txbx>
+                        <ns7:bodyPr rot="0" spcFirstLastPara="0" vertOverflow="overflow" horzOverflow="overflow" vert="horz" wrap="square" lIns="0" tIns="0" rIns="0" bIns="0" numCol="1" spcCol="0" rtlCol="0" fromWordArt="0" anchor="ctr" anchorCtr="0" forceAA="0" compatLnSpc="1">
+                          <ns5:noAutofit/>
+                        </ns7:bodyPr>
+                      </ns7:wsp>
+                      <ns7:wsp>
+                        <ns7:cNvPr id="1155260092" name="dgvOrderItemsCell 7004932"/>
+                        <ns7:cNvSpPr/>
+                        <ns7:spPr>
+                          <ns5:xfrm>
+                            <ns5:off x="3816145" y="1686288"/>
+                            <ns5:ext cx="658476" cy="221037"/>
+                          </ns5:xfrm>
+                          <ns5:prstGeom prst="rect">
+                            <ns5:avLst/>
+                          </ns5:prstGeom>
+                          <ns5:noFill/>
+                          <ns5:ln>
+                            <ns5:noFill/>
+                          </ns5:ln>
+                        </ns7:spPr>
+                        <ns7:style>
+                          <ns5:lnRef idx="2">
+                            <ns5:schemeClr val="dk1"/>
+                          </ns5:lnRef>
+                          <ns5:fillRef idx="0">
+                            <ns5:schemeClr val="lt1"/>
+                          </ns5:fillRef>
+                          <ns5:effectRef idx="0">
+                            <ns5:schemeClr val="dk1"/>
+                          </ns5:effectRef>
+                          <ns5:fontRef idx="minor">
+                            <ns5:schemeClr val="dk1"/>
+                          </ns5:fontRef>
+                        </ns7:style>
+                        <ns7:txbx>
+                          <w:txbxContent>
+                            <w:p ns2:paraId="69D5136F" ns2:textId="77777777">
+                              <w:pPr>
+                                <w:rPr>
+                                  <w:color w:val="000000"/>
+                                  <w:sz w:val="19"/>
+                                  <w:szCs w:val="19"/>
+                                </w:rPr>
+                              </w:pPr>
+                              <w:r>
+                                <w:rPr>
+                                  <w:color w:val="000000"/>
+                                  <w:sz w:val="19"/>
+                                  <w:szCs w:val="19"/>
+                                </w:rPr>
+                                <w:t>2</w:t>
+                              </w:r>
+                            </w:p>
+                          </w:txbxContent>
+                        </ns7:txbx>
+                        <ns7:bodyPr rot="0" spcFirstLastPara="0" vertOverflow="overflow" horzOverflow="overflow" vert="horz" wrap="square" lIns="0" tIns="0" rIns="0" bIns="0" numCol="1" spcCol="0" rtlCol="0" fromWordArt="0" anchor="ctr" anchorCtr="0" forceAA="0" compatLnSpc="1">
+                          <ns5:noAutofit/>
+                        </ns7:bodyPr>
+                      </ns7:wsp>
+                      <ns7:wsp>
+                        <ns7:cNvPr id="1215506469" name="dgvOrderItemsCell 7005069"/>
+                        <ns7:cNvSpPr/>
+                        <ns7:spPr>
+                          <ns5:xfrm>
+                            <ns5:off x="3816145" y="1907325"/>
+                            <ns5:ext cx="658476" cy="221037"/>
+                          </ns5:xfrm>
+                          <ns5:prstGeom prst="rect">
+                            <ns5:avLst/>
+                          </ns5:prstGeom>
+                          <ns5:noFill/>
+                          <ns5:ln>
+                            <ns5:noFill/>
+                          </ns5:ln>
+                        </ns7:spPr>
+                        <ns7:style>
+                          <ns5:lnRef idx="2">
+                            <ns5:schemeClr val="dk1"/>
+                          </ns5:lnRef>
+                          <ns5:fillRef idx="0">
+                            <ns5:schemeClr val="lt1"/>
+                          </ns5:fillRef>
+                          <ns5:effectRef idx="0">
+                            <ns5:schemeClr val="dk1"/>
+                          </ns5:effectRef>
+                          <ns5:fontRef idx="minor">
+                            <ns5:schemeClr val="dk1"/>
+                          </ns5:fontRef>
+                        </ns7:style>
+                        <ns7:txbx>
+                          <w:txbxContent>
+                            <w:p ns2:paraId="6BE298A4" ns2:textId="77777777">
+                              <w:pPr>
+                                <w:rPr>
+                                  <w:color w:val="000000"/>
+                                  <w:sz w:val="19"/>
+                                  <w:szCs w:val="19"/>
+                                </w:rPr>
+                              </w:pPr>
+                              <w:r>
+                                <w:rPr>
+                                  <w:color w:val="000000"/>
+                                  <w:sz w:val="19"/>
+                                  <w:szCs w:val="19"/>
+                                </w:rPr>
+                                <w:t>2</w:t>
+                              </w:r>
+                            </w:p>
+                          </w:txbxContent>
+                        </ns7:txbx>
+                        <ns7:bodyPr rot="0" spcFirstLastPara="0" vertOverflow="overflow" horzOverflow="overflow" vert="horz" wrap="square" lIns="0" tIns="0" rIns="0" bIns="0" numCol="1" spcCol="0" rtlCol="0" fromWordArt="0" anchor="ctr" anchorCtr="0" forceAA="0" compatLnSpc="1">
+                          <ns5:noAutofit/>
+                        </ns7:bodyPr>
+                      </ns7:wsp>
+                      <ns7:wsp>
+                        <ns7:cNvPr id="2003092024" name="dgvOrderItemsCell 7005206"/>
+                        <ns7:cNvSpPr/>
+                        <ns7:spPr>
+                          <ns5:xfrm>
+                            <ns5:off x="3816145" y="2128361"/>
+                            <ns5:ext cx="658476" cy="221037"/>
+                          </ns5:xfrm>
+                          <ns5:prstGeom prst="rect">
+                            <ns5:avLst/>
+                          </ns5:prstGeom>
+                          <ns5:noFill/>
+                          <ns5:ln>
+                            <ns5:noFill/>
+                          </ns5:ln>
+                        </ns7:spPr>
+                        <ns7:style>
+                          <ns5:lnRef idx="2">
+                            <ns5:schemeClr val="dk1"/>
+                          </ns5:lnRef>
+                          <ns5:fillRef idx="0">
+                            <ns5:schemeClr val="lt1"/>
+                          </ns5:fillRef>
+                          <ns5:effectRef idx="0">
+                            <ns5:schemeClr val="dk1"/>
+                          </ns5:effectRef>
+                          <ns5:fontRef idx="minor">
+                            <ns5:schemeClr val="dk1"/>
+                          </ns5:fontRef>
+                        </ns7:style>
+                        <ns7:txbx>
+                          <w:txbxContent>
+                            <w:p ns2:paraId="6EDF1634" ns2:textId="77777777">
+                              <w:pPr>
+                                <w:rPr>
+                                  <w:color w:val="000000"/>
+                                  <w:sz w:val="19"/>
+                                  <w:szCs w:val="19"/>
+                                </w:rPr>
+                              </w:pPr>
+                              <w:r>
+                                <w:rPr>
+                                  <w:color w:val="000000"/>
+                                  <w:sz w:val="19"/>
+                                  <w:szCs w:val="19"/>
+                                </w:rPr>
+                                <w:t>2</w:t>
+                              </w:r>
+                            </w:p>
+                          </w:txbxContent>
+                        </ns7:txbx>
+                        <ns7:bodyPr rot="0" spcFirstLastPara="0" vertOverflow="overflow" horzOverflow="overflow" vert="horz" wrap="square" lIns="0" tIns="0" rIns="0" bIns="0" numCol="1" spcCol="0" rtlCol="0" fromWordArt="0" anchor="ctr" anchorCtr="0" forceAA="0" compatLnSpc="1">
+                          <ns5:noAutofit/>
+                        </ns7:bodyPr>
+                      </ns7:wsp>
+                      <ns7:wsp>
+                        <ns7:cNvPr id="450946613" name="dgvOrderItemsCell 7005343"/>
+                        <ns7:cNvSpPr/>
+                        <ns7:spPr>
+                          <ns5:xfrm>
+                            <ns5:off x="3816145" y="2349398"/>
+                            <ns5:ext cx="658476" cy="221037"/>
+                          </ns5:xfrm>
+                          <ns5:prstGeom prst="rect">
+                            <ns5:avLst/>
+                          </ns5:prstGeom>
+                          <ns5:noFill/>
+                          <ns5:ln>
+                            <ns5:noFill/>
+                          </ns5:ln>
+                        </ns7:spPr>
+                        <ns7:style>
+                          <ns5:lnRef idx="2">
+                            <ns5:schemeClr val="dk1"/>
+                          </ns5:lnRef>
+                          <ns5:fillRef idx="0">
+                            <ns5:schemeClr val="lt1"/>
+                          </ns5:fillRef>
+                          <ns5:effectRef idx="0">
+                            <ns5:schemeClr val="dk1"/>
+                          </ns5:effectRef>
+                          <ns5:fontRef idx="minor">
+                            <ns5:schemeClr val="dk1"/>
+                          </ns5:fontRef>
+                        </ns7:style>
+                        <ns7:txbx>
+                          <w:txbxContent>
+                            <w:p ns2:paraId="2DEDA018" ns2:textId="77777777">
+                              <w:pPr>
+                                <w:rPr>
+                                  <w:color w:val="000000"/>
+                                  <w:sz w:val="19"/>
+                                  <w:szCs w:val="19"/>
+                                </w:rPr>
+                              </w:pPr>
+                              <w:r>
+                                <w:rPr>
+                                  <w:color w:val="000000"/>
+                                  <w:sz w:val="19"/>
+                                  <w:szCs w:val="19"/>
+                                </w:rPr>
+                                <w:t>2</w:t>
+                              </w:r>
+                            </w:p>
+                          </w:txbxContent>
+                        </ns7:txbx>
+                        <ns7:bodyPr rot="0" spcFirstLastPara="0" vertOverflow="overflow" horzOverflow="overflow" vert="horz" wrap="square" lIns="0" tIns="0" rIns="0" bIns="0" numCol="1" spcCol="0" rtlCol="0" fromWordArt="0" anchor="ctr" anchorCtr="0" forceAA="0" compatLnSpc="1">
+                          <ns5:noAutofit/>
+                        </ns7:bodyPr>
+                      </ns7:wsp>
+                      <ns7:wsp>
+                        <ns7:cNvPr id="1377673951" name="dgvOrderItemsCell 7005480"/>
+                        <ns7:cNvSpPr/>
+                        <ns7:spPr>
+                          <ns5:xfrm>
+                            <ns5:off x="3816145" y="2570435"/>
+                            <ns5:ext cx="658476" cy="221037"/>
+                          </ns5:xfrm>
+                          <ns5:prstGeom prst="rect">
+                            <ns5:avLst/>
+                          </ns5:prstGeom>
+                          <ns5:noFill/>
+                          <ns5:ln>
+                            <ns5:noFill/>
+                          </ns5:ln>
+                        </ns7:spPr>
+                        <ns7:style>
+                          <ns5:lnRef idx="2">
+                            <ns5:schemeClr val="dk1"/>
+                          </ns5:lnRef>
+                          <ns5:fillRef idx="0">
+                            <ns5:schemeClr val="lt1"/>
+                          </ns5:fillRef>
+                          <ns5:effectRef idx="0">
+                            <ns5:schemeClr val="dk1"/>
+                          </ns5:effectRef>
+                          <ns5:fontRef idx="minor">
+                            <ns5:schemeClr val="dk1"/>
+                          </ns5:fontRef>
+                        </ns7:style>
+                        <ns7:txbx>
+                          <w:txbxContent>
+                            <w:p ns2:paraId="3D366697" ns2:textId="77777777">
+                              <w:pPr>
+                                <w:rPr>
+                                  <w:color w:val="000000"/>
+                                  <w:sz w:val="19"/>
+                                  <w:szCs w:val="19"/>
+                                </w:rPr>
+                              </w:pPr>
+                              <w:r>
+                                <w:rPr>
+                                  <w:color w:val="000000"/>
+                                  <w:sz w:val="19"/>
+                                  <w:szCs w:val="19"/>
+                                </w:rPr>
+                                <w:t>3</w:t>
+                              </w:r>
+                            </w:p>
+                          </w:txbxContent>
+                        </ns7:txbx>
+                        <ns7:bodyPr rot="0" spcFirstLastPara="0" vertOverflow="overflow" horzOverflow="overflow" vert="horz" wrap="square" lIns="0" tIns="0" rIns="0" bIns="0" numCol="1" spcCol="0" rtlCol="0" fromWordArt="0" anchor="ctr" anchorCtr="0" forceAA="0" compatLnSpc="1">
+                          <ns5:noAutofit/>
+                        </ns7:bodyPr>
+                      </ns7:wsp>
+                      <ns7:wsp>
+                        <ns7:cNvPr id="503092660" name="dgvOrderItemsVLine 7005617"/>
+                        <ns7:cNvSpPr/>
+                        <ns7:spPr>
+                          <ns5:xfrm>
+                            <ns5:off x="3772698" y="1465251"/>
+                            <ns5:ext cx="8689" cy="1326221"/>
+                          </ns5:xfrm>
+                          <ns5:prstGeom prst="rect">
+                            <ns5:avLst/>
+                          </ns5:prstGeom>
+                          <ns5:solidFill>
+                            <ns5:srgbClr val="D2D2D2"/>
+                          </ns5:solidFill>
+                          <ns5:ln>
+                            <ns5:noFill/>
+                          </ns5:ln>
+                        </ns7:spPr>
+                        <ns7:style>
+                          <ns5:lnRef idx="2">
+                            <ns5:schemeClr val="dk1"/>
+                          </ns5:lnRef>
+                          <ns5:fillRef idx="0">
+                            <ns5:schemeClr val="lt1"/>
+                          </ns5:fillRef>
+                          <ns5:effectRef idx="0">
+                            <ns5:schemeClr val="dk1"/>
+                          </ns5:effectRef>
+                          <ns5:fontRef idx="minor">
+                            <ns5:schemeClr val="dk1"/>
+                          </ns5:fontRef>
+                        </ns7:style>
+                        <ns7:bodyPr rot="0" spcFirstLastPara="0" vertOverflow="overflow" horzOverflow="overflow" vert="horz" wrap="square" lIns="43447" tIns="0" rIns="43447" bIns="0" numCol="1" spcCol="0" rtlCol="0" fromWordArt="0" anchor="ctr" anchorCtr="0" forceAA="0" compatLnSpc="1">
+                          <ns5:noAutofit/>
+                        </ns7:bodyPr>
+                      </ns7:wsp>
+                      <ns7:wsp>
+                        <ns7:cNvPr id="130739929" name="dgvOrderItemsHead 7005754"/>
+                        <ns7:cNvSpPr/>
+                        <ns7:spPr>
+                          <ns5:xfrm>
+                            <ns5:off x="4539792" y="1238240"/>
+                            <ns5:ext cx="1206078" cy="227011"/>
+                          </ns5:xfrm>
+                          <ns5:prstGeom prst="rect">
+                            <ns5:avLst/>
+                          </ns5:prstGeom>
+                          <ns5:noFill/>
+                          <ns5:ln>
+                            <ns5:noFill/>
+                          </ns5:ln>
+                        </ns7:spPr>
+                        <ns7:style>
+                          <ns5:lnRef idx="2">
+                            <ns5:schemeClr val="dk1"/>
+                          </ns5:lnRef>
+                          <ns5:fillRef idx="0">
+                            <ns5:schemeClr val="lt1"/>
+                          </ns5:fillRef>
+                          <ns5:effectRef idx="0">
+                            <ns5:schemeClr val="dk1"/>
+                          </ns5:effectRef>
+                          <ns5:fontRef idx="minor">
+                            <ns5:schemeClr val="dk1"/>
+                          </ns5:fontRef>
+                        </ns7:style>
+                        <ns7:txbx>
+                          <w:txbxContent>
+                            <w:p ns2:paraId="0E75A2FA" ns2:textId="77777777">
+                              <w:pPr>
+                                <w:rPr>
+                                  <w:b/>
+                                  <w:bCs/>
+                                  <w:color w:val="FFFFFF"/>
+                                  <w:sz w:val="19"/>
+                                  <w:szCs w:val="19"/>
+                                </w:rPr>
+                              </w:pPr>
+                              <w:r>
+                                <w:rPr>
+                                  <w:b/>
+                                  <w:bCs/>
+                                  <w:color w:val="FFFFFF"/>
+                                  <w:sz w:val="19"/>
+                                  <w:szCs w:val="19"/>
+                                </w:rPr>
+                                <w:t>Subtotal</w:t>
+                              </w:r>
+                            </w:p>
+                          </w:txbxContent>
+                        </ns7:txbx>
+                        <ns7:bodyPr rot="0" spcFirstLastPara="0" vertOverflow="overflow" horzOverflow="overflow" vert="horz" wrap="square" lIns="0" tIns="0" rIns="0" bIns="0" numCol="1" spcCol="0" rtlCol="0" fromWordArt="0" anchor="ctr" anchorCtr="0" forceAA="0" compatLnSpc="1">
+                          <ns5:noAutofit/>
+                        </ns7:bodyPr>
+                      </ns7:wsp>
+                      <ns7:wsp>
+                        <ns7:cNvPr id="114758151" name="dgvOrderItemsCell 7005891"/>
+                        <ns7:cNvSpPr/>
+                        <ns7:spPr>
+                          <ns5:xfrm>
+                            <ns5:off x="4539792" y="1465251"/>
+                            <ns5:ext cx="1140908" cy="221037"/>
+                          </ns5:xfrm>
+                          <ns5:prstGeom prst="rect">
+                            <ns5:avLst/>
+                          </ns5:prstGeom>
+                          <ns5:noFill/>
+                          <ns5:ln>
+                            <ns5:noFill/>
+                          </ns5:ln>
+                        </ns7:spPr>
+                        <ns7:style>
+                          <ns5:lnRef idx="2">
+                            <ns5:schemeClr val="dk1"/>
+                          </ns5:lnRef>
+                          <ns5:fillRef idx="0">
+                            <ns5:schemeClr val="lt1"/>
+                          </ns5:fillRef>
+                          <ns5:effectRef idx="0">
+                            <ns5:schemeClr val="dk1"/>
+                          </ns5:effectRef>
+                          <ns5:fontRef idx="minor">
+                            <ns5:schemeClr val="dk1"/>
+                          </ns5:fontRef>
+                        </ns7:style>
+                        <ns7:txbx>
+                          <w:txbxContent>
+                            <w:p ns2:paraId="00A31C5A" ns2:textId="77777777">
+                              <w:pPr>
+                                <w:rPr>
+                                  <w:color w:val="000000"/>
+                                  <w:sz w:val="19"/>
+                                  <w:szCs w:val="19"/>
+                                </w:rPr>
+                              </w:pPr>
+                              <w:r>
+                                <w:rPr>
+                                  <w:color w:val="000000"/>
+                                  <w:sz w:val="19"/>
+                                  <w:szCs w:val="19"/>
+                                </w:rPr>
+                                <w:t>£19.96</w:t>
+                              </w:r>
+                            </w:p>
+                          </w:txbxContent>
+                        </ns7:txbx>
+                        <ns7:bodyPr rot="0" spcFirstLastPara="0" vertOverflow="overflow" horzOverflow="overflow" vert="horz" wrap="square" lIns="0" tIns="0" rIns="0" bIns="0" numCol="1" spcCol="0" rtlCol="0" fromWordArt="0" anchor="ctr" anchorCtr="0" forceAA="0" compatLnSpc="1">
+                          <ns5:noAutofit/>
+                        </ns7:bodyPr>
+                      </ns7:wsp>
+                      <ns7:wsp>
+                        <ns7:cNvPr id="1527192349" name="dgvOrderItemsCell 7006028"/>
+                        <ns7:cNvSpPr/>
+                        <ns7:spPr>
+                          <ns5:xfrm>
+                            <ns5:off x="4539792" y="1686288"/>
+                            <ns5:ext cx="1140908" cy="221037"/>
+                          </ns5:xfrm>
+                          <ns5:prstGeom prst="rect">
+                            <ns5:avLst/>
+                          </ns5:prstGeom>
+                          <ns5:noFill/>
+                          <ns5:ln>
+                            <ns5:noFill/>
+                          </ns5:ln>
+                        </ns7:spPr>
+                        <ns7:style>
+                          <ns5:lnRef idx="2">
+                            <ns5:schemeClr val="dk1"/>
+                          </ns5:lnRef>
+                          <ns5:fillRef idx="0">
+                            <ns5:schemeClr val="lt1"/>
+                          </ns5:fillRef>
+                          <ns5:effectRef idx="0">
+                            <ns5:schemeClr val="dk1"/>
+                          </ns5:effectRef>
+                          <ns5:fontRef idx="minor">
+                            <ns5:schemeClr val="dk1"/>
+                          </ns5:fontRef>
+                        </ns7:style>
+                        <ns7:txbx>
+                          <w:txbxContent>
+                            <w:p ns2:paraId="27DE055D" ns2:textId="77777777">
+                              <w:pPr>
+                                <w:rPr>
+                                  <w:color w:val="000000"/>
+                                  <w:sz w:val="19"/>
+                                  <w:szCs w:val="19"/>
+                                </w:rPr>
+                              </w:pPr>
+                              <w:r>
+                                <w:rPr>
+                                  <w:color w:val="000000"/>
+                                  <w:sz w:val="19"/>
+                                  <w:szCs w:val="19"/>
+                                </w:rPr>
+                                <w:t>£7.98</w:t>
+                              </w:r>
+                            </w:p>
+                          </w:txbxContent>
+                        </ns7:txbx>
+                        <ns7:bodyPr rot="0" spcFirstLastPara="0" vertOverflow="overflow" horzOverflow="overflow" vert="horz" wrap="square" lIns="0" tIns="0" rIns="0" bIns="0" numCol="1" spcCol="0" rtlCol="0" fromWordArt="0" anchor="ctr" anchorCtr="0" forceAA="0" compatLnSpc="1">
+                          <ns5:noAutofit/>
+                        </ns7:bodyPr>
+                      </ns7:wsp>
+                      <ns7:wsp>
+                        <ns7:cNvPr id="1378350048" name="dgvOrderItemsCell 7006165"/>
+                        <ns7:cNvSpPr/>
+                        <ns7:spPr>
+                          <ns5:xfrm>
+                            <ns5:off x="4539792" y="1907325"/>
+                            <ns5:ext cx="1140908" cy="221037"/>
+                          </ns5:xfrm>
+                          <ns5:prstGeom prst="rect">
+                            <ns5:avLst/>
+                          </ns5:prstGeom>
+                          <ns5:noFill/>
+                          <ns5:ln>
+                            <ns5:noFill/>
+                          </ns5:ln>
+                        </ns7:spPr>
+                        <ns7:style>
+                          <ns5:lnRef idx="2">
+                            <ns5:schemeClr val="dk1"/>
+                          </ns5:lnRef>
+                          <ns5:fillRef idx="0">
+                            <ns5:schemeClr val="lt1"/>
+                          </ns5:fillRef>
+                          <ns5:effectRef idx="0">
+                            <ns5:schemeClr val="dk1"/>
+                          </ns5:effectRef>
+                          <ns5:fontRef idx="minor">
+                            <ns5:schemeClr val="dk1"/>
+                          </ns5:fontRef>
+                        </ns7:style>
+                        <ns7:txbx>
+                          <w:txbxContent>
+                            <w:p ns2:paraId="5E4D1E28" ns2:textId="77777777">
+                              <w:pPr>
+                                <w:rPr>
+                                  <w:color w:val="000000"/>
+                                  <w:sz w:val="19"/>
+                                  <w:szCs w:val="19"/>
+                                </w:rPr>
+                              </w:pPr>
+                              <w:r>
+                                <w:rPr>
+                                  <w:color w:val="000000"/>
+                                  <w:sz w:val="19"/>
+                                  <w:szCs w:val="19"/>
+                                </w:rPr>
+                                <w:t>£5.98</w:t>
+                              </w:r>
+                            </w:p>
+                          </w:txbxContent>
+                        </ns7:txbx>
+                        <ns7:bodyPr rot="0" spcFirstLastPara="0" vertOverflow="overflow" horzOverflow="overflow" vert="horz" wrap="square" lIns="0" tIns="0" rIns="0" bIns="0" numCol="1" spcCol="0" rtlCol="0" fromWordArt="0" anchor="ctr" anchorCtr="0" forceAA="0" compatLnSpc="1">
+                          <ns5:noAutofit/>
+                        </ns7:bodyPr>
+                      </ns7:wsp>
+                      <ns7:wsp>
+                        <ns7:cNvPr id="1462789507" name="dgvOrderItemsCell 7006302"/>
+                        <ns7:cNvSpPr/>
+                        <ns7:spPr>
+                          <ns5:xfrm>
+                            <ns5:off x="4539792" y="2128361"/>
+                            <ns5:ext cx="1140908" cy="221037"/>
+                          </ns5:xfrm>
+                          <ns5:prstGeom prst="rect">
+                            <ns5:avLst/>
+                          </ns5:prstGeom>
+                          <ns5:noFill/>
+                          <ns5:ln>
+                            <ns5:noFill/>
+                          </ns5:ln>
+                        </ns7:spPr>
+                        <ns7:style>
+                          <ns5:lnRef idx="2">
+                            <ns5:schemeClr val="dk1"/>
+                          </ns5:lnRef>
+                          <ns5:fillRef idx="0">
+                            <ns5:schemeClr val="lt1"/>
+                          </ns5:fillRef>
+                          <ns5:effectRef idx="0">
+                            <ns5:schemeClr val="dk1"/>
+                          </ns5:effectRef>
+                          <ns5:fontRef idx="minor">
+                            <ns5:schemeClr val="dk1"/>
+                          </ns5:fontRef>
+                        </ns7:style>
+                        <ns7:txbx>
+                          <w:txbxContent>
+                            <w:p ns2:paraId="19279F1E" ns2:textId="77777777">
+                              <w:pPr>
+                                <w:rPr>
+                                  <w:color w:val="000000"/>
+                                  <w:sz w:val="19"/>
+                                  <w:szCs w:val="19"/>
+                                </w:rPr>
+                              </w:pPr>
+                              <w:r>
+                                <w:rPr>
+                                  <w:color w:val="000000"/>
+                                  <w:sz w:val="19"/>
+                                  <w:szCs w:val="19"/>
+                                </w:rPr>
+                                <w:t>£3.98</w:t>
+                              </w:r>
+                            </w:p>
+                          </w:txbxContent>
+                        </ns7:txbx>
+                        <ns7:bodyPr rot="0" spcFirstLastPara="0" vertOverflow="overflow" horzOverflow="overflow" vert="horz" wrap="square" lIns="0" tIns="0" rIns="0" bIns="0" numCol="1" spcCol="0" rtlCol="0" fromWordArt="0" anchor="ctr" anchorCtr="0" forceAA="0" compatLnSpc="1">
+                          <ns5:noAutofit/>
+                        </ns7:bodyPr>
+                      </ns7:wsp>
+                      <ns7:wsp>
+                        <ns7:cNvPr id="1832946765" name="dgvOrderItemsCell 7006439"/>
+                        <ns7:cNvSpPr/>
+                        <ns7:spPr>
+                          <ns5:xfrm>
+                            <ns5:off x="4539792" y="2349398"/>
+                            <ns5:ext cx="1140908" cy="221037"/>
+                          </ns5:xfrm>
+                          <ns5:prstGeom prst="rect">
+                            <ns5:avLst/>
+                          </ns5:prstGeom>
+                          <ns5:noFill/>
+                          <ns5:ln>
+                            <ns5:noFill/>
+                          </ns5:ln>
+                        </ns7:spPr>
+                        <ns7:style>
+                          <ns5:lnRef idx="2">
+                            <ns5:schemeClr val="dk1"/>
+                          </ns5:lnRef>
+                          <ns5:fillRef idx="0">
+                            <ns5:schemeClr val="lt1"/>
+                          </ns5:fillRef>
+                          <ns5:effectRef idx="0">
+                            <ns5:schemeClr val="dk1"/>
+                          </ns5:effectRef>
+                          <ns5:fontRef idx="minor">
+                            <ns5:schemeClr val="dk1"/>
+                          </ns5:fontRef>
+                        </ns7:style>
+                        <ns7:txbx>
+                          <w:txbxContent>
+                            <w:p ns2:paraId="1E53C06A" ns2:textId="77777777">
+                              <w:pPr>
+                                <w:rPr>
+                                  <w:color w:val="000000"/>
+                                  <w:sz w:val="19"/>
+                                  <w:szCs w:val="19"/>
+                                </w:rPr>
+                              </w:pPr>
+                              <w:r>
+                                <w:rPr>
+                                  <w:color w:val="000000"/>
+                                  <w:sz w:val="19"/>
+                                  <w:szCs w:val="19"/>
+                                </w:rPr>
+                                <w:t>£8.98</w:t>
+                              </w:r>
+                            </w:p>
+                          </w:txbxContent>
+                        </ns7:txbx>
+                        <ns7:bodyPr rot="0" spcFirstLastPara="0" vertOverflow="overflow" horzOverflow="overflow" vert="horz" wrap="square" lIns="0" tIns="0" rIns="0" bIns="0" numCol="1" spcCol="0" rtlCol="0" fromWordArt="0" anchor="ctr" anchorCtr="0" forceAA="0" compatLnSpc="1">
+                          <ns5:noAutofit/>
+                        </ns7:bodyPr>
+                      </ns7:wsp>
+                      <ns7:wsp>
+                        <ns7:cNvPr id="1848615550" name="dgvOrderItemsCell 7006576"/>
+                        <ns7:cNvSpPr/>
+                        <ns7:spPr>
+                          <ns5:xfrm>
+                            <ns5:off x="4539792" y="2570435"/>
+                            <ns5:ext cx="1140908" cy="221037"/>
+                          </ns5:xfrm>
+                          <ns5:prstGeom prst="rect">
+                            <ns5:avLst/>
+                          </ns5:prstGeom>
+                          <ns5:noFill/>
+                          <ns5:ln>
+                            <ns5:noFill/>
+                          </ns5:ln>
+                        </ns7:spPr>
+                        <ns7:style>
+                          <ns5:lnRef idx="2">
+                            <ns5:schemeClr val="dk1"/>
+                          </ns5:lnRef>
+                          <ns5:fillRef idx="0">
+                            <ns5:schemeClr val="lt1"/>
+                          </ns5:fillRef>
+                          <ns5:effectRef idx="0">
+                            <ns5:schemeClr val="dk1"/>
+                          </ns5:effectRef>
+                          <ns5:fontRef idx="minor">
+                            <ns5:schemeClr val="dk1"/>
+                          </ns5:fontRef>
+                        </ns7:style>
+                        <ns7:txbx>
+                          <w:txbxContent>
+                            <w:p ns2:paraId="1745B572" ns2:textId="77777777">
+                              <w:pPr>
+                                <w:rPr>
+                                  <w:color w:val="000000"/>
+                                  <w:sz w:val="19"/>
+                                  <w:szCs w:val="19"/>
+                                </w:rPr>
+                              </w:pPr>
+                              <w:r>
+                                <w:rPr>
+                                  <w:color w:val="000000"/>
+                                  <w:sz w:val="19"/>
+                                  <w:szCs w:val="19"/>
+                                </w:rPr>
+                                <w:t>£5.97</w:t>
+                              </w:r>
+                            </w:p>
+                          </w:txbxContent>
+                        </ns7:txbx>
+                        <ns7:bodyPr rot="0" spcFirstLastPara="0" vertOverflow="overflow" horzOverflow="overflow" vert="horz" wrap="square" lIns="0" tIns="0" rIns="0" bIns="0" numCol="1" spcCol="0" rtlCol="0" fromWordArt="0" anchor="ctr" anchorCtr="0" forceAA="0" compatLnSpc="1">
+                          <ns5:noAutofit/>
+                        </ns7:bodyPr>
+                      </ns7:wsp>
+                      <ns7:wsp>
+                        <ns7:cNvPr id="218304506" name="dgvOrderItemsVLine 7006713"/>
+                        <ns7:cNvSpPr/>
+                        <ns7:spPr>
+                          <ns5:xfrm>
+                            <ns5:off x="4496345" y="1465251"/>
+                            <ns5:ext cx="8689" cy="1326221"/>
+                          </ns5:xfrm>
+                          <ns5:prstGeom prst="rect">
+                            <ns5:avLst/>
+                          </ns5:prstGeom>
+                          <ns5:solidFill>
+                            <ns5:srgbClr val="D2D2D2"/>
+                          </ns5:solidFill>
+                          <ns5:ln>
+                            <ns5:noFill/>
+                          </ns5:ln>
+                        </ns7:spPr>
+                        <ns7:style>
+                          <ns5:lnRef idx="2">
+                            <ns5:schemeClr val="dk1"/>
+                          </ns5:lnRef>
+                          <ns5:fillRef idx="0">
+                            <ns5:schemeClr val="lt1"/>
+                          </ns5:fillRef>
+                          <ns5:effectRef idx="0">
+                            <ns5:schemeClr val="dk1"/>
+                          </ns5:effectRef>
+                          <ns5:fontRef idx="minor">
+                            <ns5:schemeClr val="dk1"/>
+                          </ns5:fontRef>
+                        </ns7:style>
+                        <ns7:bodyPr rot="0" spcFirstLastPara="0" vertOverflow="overflow" horzOverflow="overflow" vert="horz" wrap="square" lIns="43447" tIns="0" rIns="43447" bIns="0" numCol="1" spcCol="0" rtlCol="0" fromWordArt="0" anchor="ctr" anchorCtr="0" forceAA="0" compatLnSpc="1">
+                          <ns5:noAutofit/>
+                        </ns7:bodyPr>
+                      </ns7:wsp>
+                      <ns7:wsp>
+                        <ns7:cNvPr id="2020712723" name="dgvOrderItemsHLine 7006850"/>
+                        <ns7:cNvSpPr/>
+                        <ns7:spPr>
+                          <ns5:xfrm>
+                            <ns5:off x="141203" y="1686288"/>
+                            <ns5:ext cx="5572082" cy="8689"/>
+                          </ns5:xfrm>
+                          <ns5:prstGeom prst="rect">
+                            <ns5:avLst/>
+                          </ns5:prstGeom>
+                          <ns5:solidFill>
+                            <ns5:srgbClr val="D2D2D2"/>
+                          </ns5:solidFill>
+                          <ns5:ln>
+                            <ns5:noFill/>
+                          </ns5:ln>
+                        </ns7:spPr>
+                        <ns7:style>
+                          <ns5:lnRef idx="2">
+                            <ns5:schemeClr val="dk1"/>
+                          </ns5:lnRef>
+                          <ns5:fillRef idx="0">
+                            <ns5:schemeClr val="lt1"/>
+                          </ns5:fillRef>
+                          <ns5:effectRef idx="0">
+                            <ns5:schemeClr val="dk1"/>
+                          </ns5:effectRef>
+                          <ns5:fontRef idx="minor">
+                            <ns5:schemeClr val="dk1"/>
+                          </ns5:fontRef>
+                        </ns7:style>
+                        <ns7:bodyPr rot="0" spcFirstLastPara="0" vertOverflow="overflow" horzOverflow="overflow" vert="horz" wrap="square" lIns="43447" tIns="0" rIns="43447" bIns="0" numCol="1" spcCol="0" rtlCol="0" fromWordArt="0" anchor="ctr" anchorCtr="0" forceAA="0" compatLnSpc="1">
+                          <ns5:noAutofit/>
+                        </ns7:bodyPr>
+                      </ns7:wsp>
+                      <ns7:wsp>
+                        <ns7:cNvPr id="71335638" name="dgvOrderItemsHLine 7006987"/>
+                        <ns7:cNvSpPr/>
+                        <ns7:spPr>
+                          <ns5:xfrm>
+                            <ns5:off x="141203" y="1907325"/>
+                            <ns5:ext cx="5572082" cy="8689"/>
+                          </ns5:xfrm>
+                          <ns5:prstGeom prst="rect">
+                            <ns5:avLst/>
+                          </ns5:prstGeom>
+                          <ns5:solidFill>
+                            <ns5:srgbClr val="D2D2D2"/>
+                          </ns5:solidFill>
+                          <ns5:ln>
+                            <ns5:noFill/>
+                          </ns5:ln>
+                        </ns7:spPr>
+                        <ns7:style>
+                          <ns5:lnRef idx="2">
+                            <ns5:schemeClr val="dk1"/>
+                          </ns5:lnRef>
+                          <ns5:fillRef idx="0">
+                            <ns5:schemeClr val="lt1"/>
+                          </ns5:fillRef>
+                          <ns5:effectRef idx="0">
+                            <ns5:schemeClr val="dk1"/>
+                          </ns5:effectRef>
+                          <ns5:fontRef idx="minor">
+                            <ns5:schemeClr val="dk1"/>
+                          </ns5:fontRef>
+                        </ns7:style>
+                        <ns7:bodyPr rot="0" spcFirstLastPara="0" vertOverflow="overflow" horzOverflow="overflow" vert="horz" wrap="square" lIns="43447" tIns="0" rIns="43447" bIns="0" numCol="1" spcCol="0" rtlCol="0" fromWordArt="0" anchor="ctr" anchorCtr="0" forceAA="0" compatLnSpc="1">
+                          <ns5:noAutofit/>
+                        </ns7:bodyPr>
+                      </ns7:wsp>
+                      <ns7:wsp>
+                        <ns7:cNvPr id="1961693809" name="dgvOrderItemsHLine 7007124"/>
+                        <ns7:cNvSpPr/>
+                        <ns7:spPr>
+                          <ns5:xfrm>
+                            <ns5:off x="141203" y="2128361"/>
+                            <ns5:ext cx="5572082" cy="8689"/>
+                          </ns5:xfrm>
+                          <ns5:prstGeom prst="rect">
+                            <ns5:avLst/>
+                          </ns5:prstGeom>
+                          <ns5:solidFill>
+                            <ns5:srgbClr val="D2D2D2"/>
+                          </ns5:solidFill>
+                          <ns5:ln>
+                            <ns5:noFill/>
+                          </ns5:ln>
+                        </ns7:spPr>
+                        <ns7:style>
+                          <ns5:lnRef idx="2">
+                            <ns5:schemeClr val="dk1"/>
+                          </ns5:lnRef>
+                          <ns5:fillRef idx="0">
+                            <ns5:schemeClr val="lt1"/>
+                          </ns5:fillRef>
+                          <ns5:effectRef idx="0">
+                            <ns5:schemeClr val="dk1"/>
+                          </ns5:effectRef>
+                          <ns5:fontRef idx="minor">
+                            <ns5:schemeClr val="dk1"/>
+                          </ns5:fontRef>
+                        </ns7:style>
+                        <ns7:bodyPr rot="0" spcFirstLastPara="0" vertOverflow="overflow" horzOverflow="overflow" vert="horz" wrap="square" lIns="43447" tIns="0" rIns="43447" bIns="0" numCol="1" spcCol="0" rtlCol="0" fromWordArt="0" anchor="ctr" anchorCtr="0" forceAA="0" compatLnSpc="1">
+                          <ns5:noAutofit/>
+                        </ns7:bodyPr>
+                      </ns7:wsp>
+                      <ns7:wsp>
+                        <ns7:cNvPr id="1090168244" name="dgvOrderItemsHLine 7007261"/>
+                        <ns7:cNvSpPr/>
+                        <ns7:spPr>
+                          <ns5:xfrm>
+                            <ns5:off x="141203" y="2349398"/>
+                            <ns5:ext cx="5572082" cy="8689"/>
+                          </ns5:xfrm>
+                          <ns5:prstGeom prst="rect">
+                            <ns5:avLst/>
+                          </ns5:prstGeom>
+                          <ns5:solidFill>
+                            <ns5:srgbClr val="D2D2D2"/>
+                          </ns5:solidFill>
+                          <ns5:ln>
+                            <ns5:noFill/>
+                          </ns5:ln>
+                        </ns7:spPr>
+                        <ns7:style>
+                          <ns5:lnRef idx="2">
+                            <ns5:schemeClr val="dk1"/>
+                          </ns5:lnRef>
+                          <ns5:fillRef idx="0">
+                            <ns5:schemeClr val="lt1"/>
+                          </ns5:fillRef>
+                          <ns5:effectRef idx="0">
+                            <ns5:schemeClr val="dk1"/>
+                          </ns5:effectRef>
+                          <ns5:fontRef idx="minor">
+                            <ns5:schemeClr val="dk1"/>
+                          </ns5:fontRef>
+                        </ns7:style>
+                        <ns7:bodyPr rot="0" spcFirstLastPara="0" vertOverflow="overflow" horzOverflow="overflow" vert="horz" wrap="square" lIns="43447" tIns="0" rIns="43447" bIns="0" numCol="1" spcCol="0" rtlCol="0" fromWordArt="0" anchor="ctr" anchorCtr="0" forceAA="0" compatLnSpc="1">
+                          <ns5:noAutofit/>
+                        </ns7:bodyPr>
+                      </ns7:wsp>
+                      <ns7:wsp>
+                        <ns7:cNvPr id="945644677" name="dgvOrderItemsHLine 7007398"/>
+                        <ns7:cNvSpPr/>
+                        <ns7:spPr>
+                          <ns5:xfrm>
+                            <ns5:off x="141203" y="2570435"/>
+                            <ns5:ext cx="5572082" cy="8689"/>
+                          </ns5:xfrm>
+                          <ns5:prstGeom prst="rect">
+                            <ns5:avLst/>
+                          </ns5:prstGeom>
+                          <ns5:solidFill>
+                            <ns5:srgbClr val="D2D2D2"/>
+                          </ns5:solidFill>
+                          <ns5:ln>
+                            <ns5:noFill/>
+                          </ns5:ln>
+                        </ns7:spPr>
+                        <ns7:style>
+                          <ns5:lnRef idx="2">
+                            <ns5:schemeClr val="dk1"/>
+                          </ns5:lnRef>
+                          <ns5:fillRef idx="0">
+                            <ns5:schemeClr val="lt1"/>
+                          </ns5:fillRef>
+                          <ns5:effectRef idx="0">
+                            <ns5:schemeClr val="dk1"/>
+                          </ns5:effectRef>
+                          <ns5:fontRef idx="minor">
+                            <ns5:schemeClr val="dk1"/>
+                          </ns5:fontRef>
+                        </ns7:style>
+                        <ns7:bodyPr rot="0" spcFirstLastPara="0" vertOverflow="overflow" horzOverflow="overflow" vert="horz" wrap="square" lIns="43447" tIns="0" rIns="43447" bIns="0" numCol="1" spcCol="0" rtlCol="0" fromWordArt="0" anchor="ctr" anchorCtr="0" forceAA="0" compatLnSpc="1">
+                          <ns5:noAutofit/>
+                        </ns7:bodyPr>
+                      </ns7:wsp>
+                      <ns7:wsp>
+                        <ns7:cNvPr id="1079567792" name="dgvOrderItemsHLine 7007535"/>
+                        <ns7:cNvSpPr/>
+                        <ns7:spPr>
+                          <ns5:xfrm>
+                            <ns5:off x="141203" y="2791472"/>
+                            <ns5:ext cx="5572082" cy="8689"/>
+                          </ns5:xfrm>
+                          <ns5:prstGeom prst="rect">
+                            <ns5:avLst/>
+                          </ns5:prstGeom>
+                          <ns5:solidFill>
+                            <ns5:srgbClr val="D2D2D2"/>
+                          </ns5:solidFill>
+                          <ns5:ln>
+                            <ns5:noFill/>
+                          </ns5:ln>
+                        </ns7:spPr>
+                        <ns7:style>
+                          <ns5:lnRef idx="2">
+                            <ns5:schemeClr val="dk1"/>
+                          </ns5:lnRef>
+                          <ns5:fillRef idx="0">
+                            <ns5:schemeClr val="lt1"/>
+                          </ns5:fillRef>
+                          <ns5:effectRef idx="0">
+                            <ns5:schemeClr val="dk1"/>
+                          </ns5:effectRef>
+                          <ns5:fontRef idx="minor">
+                            <ns5:schemeClr val="dk1"/>
+                          </ns5:fontRef>
+                        </ns7:style>
+                        <ns7:bodyPr rot="0" spcFirstLastPara="0" vertOverflow="overflow" horzOverflow="overflow" vert="horz" wrap="square" lIns="43447" tIns="0" rIns="43447" bIns="0" numCol="1" spcCol="0" rtlCol="0" fromWordArt="0" anchor="ctr" anchorCtr="0" forceAA="0" compatLnSpc="1">
+                          <ns5:noAutofit/>
+                        </ns7:bodyPr>
+                      </ns7:wsp>
+                      <ns7:wsp>
+                        <ns7:cNvPr id="1029190092" name="Button 7007672"/>
+                        <ns7:cNvSpPr/>
+                        <ns7:spPr>
+                          <ns5:xfrm>
+                            <ns5:off x="130341" y="3519210"/>
+                            <ns5:ext cx="1140485" cy="282406"/>
+                          </ns5:xfrm>
+                          <ns5:prstGeom prst="rect">
+                            <ns5:avLst/>
+                          </ns5:prstGeom>
+                          <ns5:solidFill>
+                            <ns5:srgbClr val="F0F0F0"/>
+                          </ns5:solidFill>
+                          <ns5:ln w="6350">
+                            <ns5:solidFill>
+                              <ns5:srgbClr val="B4B4B4"/>
+                            </ns5:solidFill>
+                          </ns5:ln>
+                        </ns7:spPr>
+                        <ns7:style>
+                          <ns5:lnRef idx="2">
+                            <ns5:schemeClr val="dk1"/>
+                          </ns5:lnRef>
+                          <ns5:fillRef idx="0">
+                            <ns5:schemeClr val="lt1"/>
+                          </ns5:fillRef>
+                          <ns5:effectRef idx="0">
+                            <ns5:schemeClr val="dk1"/>
+                          </ns5:effectRef>
+                          <ns5:fontRef idx="minor">
+                            <ns5:schemeClr val="dk1"/>
+                          </ns5:fontRef>
+                        </ns7:style>
+                        <ns7:txbx>
+                          <w:txbxContent>
+                            <w:p ns2:paraId="2A06AABE" ns2:textId="77777777">
+                              <w:pPr>
+                                <w:jc w:val="center"/>
+                                <w:rPr>
+                                  <w:color w:val="000000"/>
+                                  <w:sz w:val="17"/>
+                                  <w:szCs w:val="17"/>
+                                </w:rPr>
+                              </w:pPr>
+                              <w:r>
+                                <w:rPr>
+                                  <w:color w:val="000000"/>
+                                  <w:sz w:val="17"/>
+                                  <w:szCs w:val="17"/>
+                                </w:rPr>
+                                <w:t>Remove Selected</w:t>
+                              </w:r>
+                            </w:p>
+                          </w:txbxContent>
+                        </ns7:txbx>
+                        <ns7:bodyPr rot="0" spcFirstLastPara="0" vertOverflow="overflow" horzOverflow="overflow" vert="horz" wrap="square" lIns="21724" tIns="0" rIns="21724" bIns="0" numCol="1" spcCol="0" rtlCol="0" fromWordArt="0" anchor="ctr" anchorCtr="0" forceAA="0" compatLnSpc="1">
+                          <ns5:noAutofit/>
+                        </ns7:bodyPr>
+                      </ns7:wsp>
+                      <ns7:wsp>
+                        <ns7:cNvPr id="73073149" name="Label 7007809"/>
+                        <ns7:cNvSpPr/>
+                        <ns7:spPr>
+                          <ns5:xfrm>
+                            <ns5:off x="1466337" y="3562657"/>
+                            <ns5:ext cx="2606822" cy="168357"/>
+                          </ns5:xfrm>
+                          <ns5:prstGeom prst="rect">
+                            <ns5:avLst/>
+                          </ns5:prstGeom>
+                          <ns5:noFill/>
+                          <ns5:ln>
+                            <ns5:noFill/>
+                          </ns5:ln>
+                        </ns7:spPr>
+                        <ns7:style>
+                          <ns5:lnRef idx="2">
+                            <ns5:schemeClr val="dk1"/>
+                          </ns5:lnRef>
+                          <ns5:fillRef idx="0">
+                            <ns5:schemeClr val="lt1"/>
+                          </ns5:fillRef>
+                          <ns5:effectRef idx="0">
+                            <ns5:schemeClr val="dk1"/>
+                          </ns5:effectRef>
+                          <ns5:fontRef idx="minor">
+                            <ns5:schemeClr val="dk1"/>
+                          </ns5:fontRef>
+                        </ns7:style>
+                        <ns7:txbx>
+                          <w:txbxContent>
+                            <w:p ns2:paraId="56D330BD" ns2:textId="77777777">
+                              <w:pPr>
+                                <w:rPr>
+                                  <w:color w:val="808080"/>
+                                  <w:sz w:val="17"/>
+                                  <w:szCs w:val="17"/>
+                                </w:rPr>
+                              </w:pPr>
+                              <w:r>
+                                <w:rPr>
+                                  <w:color w:val="808080"/>
+                                  <w:sz w:val="17"/>
+                                  <w:szCs w:val="17"/>
+                                </w:rPr>
+                                <w:t>6 line(s), 15 item(s) to hand over</w:t>
+                              </w:r>
+                            </w:p>
+                          </w:txbxContent>
+                        </ns7:txbx>
+                        <ns7:bodyPr rot="0" spcFirstLastPara="0" vertOverflow="overflow" horzOverflow="overflow" vert="horz" wrap="square" lIns="0" tIns="0" rIns="0" bIns="0" numCol="1" spcCol="0" rtlCol="0" fromWordArt="0" anchor="ctr" anchorCtr="0" forceAA="0" compatLnSpc="1">
+                          <ns5:noAutofit/>
+                        </ns7:bodyPr>
+                      </ns7:wsp>
+                      <ns7:wsp>
+                        <ns7:cNvPr id="159522574" name="Label 7007946"/>
+                        <ns7:cNvSpPr/>
+                        <ns7:spPr>
+                          <ns5:xfrm>
+                            <ns5:off x="3910233" y="3497486"/>
+                            <ns5:ext cx="1737881" cy="235700"/>
+                          </ns5:xfrm>
+                          <ns5:prstGeom prst="rect">
+                            <ns5:avLst/>
+                          </ns5:prstGeom>
+                          <ns5:noFill/>
+                          <ns5:ln>
+                            <ns5:noFill/>
+                          </ns5:ln>
+                        </ns7:spPr>
+                        <ns7:style>
+                          <ns5:lnRef idx="2">
+                            <ns5:schemeClr val="dk1"/>
+                          </ns5:lnRef>
+                          <ns5:fillRef idx="0">
+                            <ns5:schemeClr val="lt1"/>
+                          </ns5:fillRef>
+                          <ns5:effectRef idx="0">
+                            <ns5:schemeClr val="dk1"/>
+                          </ns5:effectRef>
+                          <ns5:fontRef idx="minor">
+                            <ns5:schemeClr val="dk1"/>
+                          </ns5:fontRef>
+                        </ns7:style>
+                        <ns7:txbx>
+                          <w:txbxContent>
+                            <w:p ns2:paraId="7E9B0C9D" ns2:textId="77777777">
+                              <w:pPr>
+                                <w:jc w:val="right"/>
+                                <w:rPr>
+                                  <w:b/>
+                                  <w:bCs/>
+                                  <w:color w:val="000000"/>
+                                </w:rPr>
+                              </w:pPr>
+                              <w:r>
+                                <w:rPr>
+                                  <w:b/>
+                                  <w:bCs/>
+                                  <w:color w:val="000000"/>
+                                </w:rPr>
+                                <w:t>Total:  £52.85</w:t>
+                              </w:r>
+                            </w:p>
+                          </w:txbxContent>
+                        </ns7:txbx>
+                        <ns7:bodyPr rot="0" spcFirstLastPara="0" vertOverflow="overflow" horzOverflow="overflow" vert="horz" wrap="square" lIns="0" tIns="0" rIns="0" bIns="0" numCol="1" spcCol="0" rtlCol="0" fromWordArt="0" anchor="ctr" anchorCtr="0" forceAA="0" compatLnSpc="1">
+                          <ns5:noAutofit/>
+                        </ns7:bodyPr>
+                      </ns7:wsp>
+                      <ns7:wsp>
+                        <ns7:cNvPr id="331143790" name="Button 7008083"/>
+                        <ns7:cNvSpPr/>
+                        <ns7:spPr>
+                          <ns5:xfrm>
+                            <ns5:off x="4779173" y="3866786"/>
+                            <ns5:ext cx="944973" cy="282406"/>
+                          </ns5:xfrm>
+                          <ns5:prstGeom prst="rect">
+                            <ns5:avLst/>
+                          </ns5:prstGeom>
+                          <ns5:solidFill>
+                            <ns5:srgbClr val="F0F0F0"/>
+                          </ns5:solidFill>
+                          <ns5:ln w="6350">
+                            <ns5:solidFill>
+                              <ns5:srgbClr val="B4B4B4"/>
+                            </ns5:solidFill>
+                          </ns5:ln>
+                        </ns7:spPr>
+                        <ns7:style>
+                          <ns5:lnRef idx="2">
+                            <ns5:schemeClr val="dk1"/>
+                          </ns5:lnRef>
+                          <ns5:fillRef idx="0">
+                            <ns5:schemeClr val="lt1"/>
+                          </ns5:fillRef>
+                          <ns5:effectRef idx="0">
+                            <ns5:schemeClr val="dk1"/>
+                          </ns5:effectRef>
+                          <ns5:fontRef idx="minor">
+                            <ns5:schemeClr val="dk1"/>
+                          </ns5:fontRef>
+                        </ns7:style>
+                        <ns7:txbx>
+                          <w:txbxContent>
+                            <w:p ns2:paraId="35BB7B64" ns2:textId="77777777">
+                              <w:pPr>
+                                <w:jc w:val="center"/>
+                                <w:rPr>
+                                  <w:color w:val="000000"/>
+                                  <w:sz w:val="19"/>
+                                  <w:szCs w:val="19"/>
+                                </w:rPr>
+                              </w:pPr>
+                              <w:r>
+                                <w:rPr>
+                                  <w:color w:val="000000"/>
+                                  <w:sz w:val="19"/>
+                                  <w:szCs w:val="19"/>
+                                </w:rPr>
+                                <w:t>Close</w:t>
+                              </w:r>
+                            </w:p>
+                          </w:txbxContent>
+                        </ns7:txbx>
+                        <ns7:bodyPr rot="0" spcFirstLastPara="0" vertOverflow="overflow" horzOverflow="overflow" vert="horz" wrap="square" lIns="21724" tIns="0" rIns="21724" bIns="0" numCol="1" spcCol="0" rtlCol="0" fromWordArt="0" anchor="ctr" anchorCtr="0" forceAA="0" compatLnSpc="1">
+                          <ns5:noAutofit/>
+                        </ns7:bodyPr>
+                      </ns7:wsp>
+                      <ns7:wsp>
+                        <ns7:cNvPr id="504435325" name="Label 7008220"/>
+                        <ns7:cNvSpPr/>
+                        <ns7:spPr>
+                          <ns5:xfrm>
+                            <ns5:off x="130341" y="4084021"/>
+                            <ns5:ext cx="2498204" cy="151522"/>
+                          </ns5:xfrm>
+                          <ns5:prstGeom prst="rect">
+                            <ns5:avLst/>
+                          </ns5:prstGeom>
+                          <ns5:noFill/>
+                          <ns5:ln>
+                            <ns5:noFill/>
+                          </ns5:ln>
+                        </ns7:spPr>
+                        <ns7:style>
+                          <ns5:lnRef idx="2">
+                            <ns5:schemeClr val="dk1"/>
+                          </ns5:lnRef>
+                          <ns5:fillRef idx="0">
+                            <ns5:schemeClr val="lt1"/>
+                          </ns5:fillRef>
+                          <ns5:effectRef idx="0">
+                            <ns5:schemeClr val="dk1"/>
+                          </ns5:effectRef>
+                          <ns5:fontRef idx="minor">
+                            <ns5:schemeClr val="dk1"/>
+                          </ns5:fontRef>
+                        </ns7:style>
+                        <ns7:txbx>
+                          <w:txbxContent>
+                            <w:p ns2:paraId="761EA6F8" ns2:textId="77777777">
+                              <w:pPr>
+                                <w:rPr>
+                                  <w:color w:val="808080"/>
+                                  <w:sz w:val="15"/>
+                                  <w:szCs w:val="15"/>
+                                </w:rPr>
+                              </w:pPr>
+                              <w:r>
+                                <w:rPr>
+                                  <w:color w:val="808080"/>
+                                  <w:sz w:val="15"/>
+                                  <w:szCs w:val="15"/>
+                                </w:rPr>
+                                <w:t>Filmtopia Cinema Management System  v1.0</w:t>
+                              </w:r>
+                            </w:p>
+                          </w:txbxContent>
+                        </ns7:txbx>
+                        <ns7:bodyPr rot="0" spcFirstLastPara="0" vertOverflow="overflow" horzOverflow="overflow" vert="horz" wrap="square" lIns="0" tIns="0" rIns="0" bIns="0" numCol="1" spcCol="0" rtlCol="0" fromWordArt="0" anchor="ctr" anchorCtr="0" forceAA="0" compatLnSpc="1">
+                          <ns5:noAutofit/>
+                        </ns7:bodyPr>
+                      </ns7:wsp>
+                    </ns6:wpc>
+                  </ns5:graphicData>
+                </ns5:graphic>
+              </ns3:inline>
+            </w:drawing>
+          </ns1:Choice>
+          <ns1:Fallback>
+            <w:pict>
+              <ns8:group ns2:anchorId="413ED887" id="Food Order Form (frmFoodOrder)" ns9:spid="_x0000_s1161" editas="canvas" style="width:459.25pt;height:342.1pt;mso-position-horizontal-relative:char;mso-position-vertical-relative:line" coordsize="58324,43446" ns9:gfxdata="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">
+                <ns8:shape id="_x0000_s1162" type="#_x0000_t75" style="position:absolute;width:58324;height:43446;visibility:visible;mso-wrap-style:square" filled="t">
+                  <ns8:fill ns9:detectmouseclick="t"/>
+                  <ns8:path ns9:connecttype="none"/>
+                </ns8:shape>
+                <ns8:rect id="Window 7000137" ns9:spid="_x0000_s1163" style="position:absolute;width:58327;height:43447;visibility:visible;mso-wrap-style:square;v-text-anchor:middle" ns9:gfxdata="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" fillcolor="#f0f0f0" stroked="f" strokeweight="1pt">
+                  <ns8:textbox inset="1.2069mm,0,1.2069mm,0"/>
+                </ns8:rect>
+                <ns8:rect id="Label 7000274" ns9:spid="_x0000_s1164" style="position:absolute;left:1303;top:1194;width:56481;height:2189;visibility:visible;mso-wrap-style:square;v-text-anchor:middle" ns9:gfxdata="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" filled="f" stroked="f" strokeweight="1pt">
+                  <ns8:textbox inset="0,0,0,0">
+                    <w:txbxContent>
+                      <w:p ns2:paraId="6F36CCBC" ns2:textId="77777777">
+                        <w:pPr>
+                          <w:rPr>
+                            <w:b/>
+                            <w:bCs/>
+                            <w:color w:val="000000"/>
+                            <w:sz w:val="22"/>
+                            <w:szCs w:val="22"/>
+                          </w:rPr>
+                        </w:pPr>
+                        <w:r>
+                          <w:rPr>
+                            <w:b/>
+                            <w:bCs/>
+                            <w:color w:val="000000"/>
+                            <w:sz w:val="22"/>
+                            <w:szCs w:val="22"/>
+                          </w:rPr>
+                          <w:t>Booking #78  -  Walk-in Customer  -  The Dark Knight (21/08/2026 21:14)</w:t>
+                        </w:r>
+                      </w:p>
+                    </w:txbxContent>
+                  </ns8:textbox>
+                </ns8:rect>
+                <ns8:rect id="Label 7000411" ns9:spid="_x0000_s1165" style="position:absolute;left:1303;top:4779;width:6517;height:1852;visibility:visible;mso-wrap-style:square;v-text-anchor:middle" ns9:gfxdata="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" filled="f" stroked="f" strokeweight="1pt">
+                  <ns8:textbox inset="0,0,0,0">
+                    <w:txbxContent>
+                      <w:p ns2:paraId="0F2574ED" ns2:textId="77777777">
+                        <w:pPr>
+                          <w:rPr>
+                            <w:color w:val="000000"/>
+                            <w:sz w:val="19"/>
+                            <w:szCs w:val="19"/>
+                          </w:rPr>
+                        </w:pPr>
+                        <w:r>
+                          <w:rPr>
+                            <w:color w:val="000000"/>
+                            <w:sz w:val="19"/>
+                            <w:szCs w:val="19"/>
+                          </w:rPr>
+                          <w:t>Food Item</w:t>
+                        </w:r>
+                      </w:p>
+                    </w:txbxContent>
+                  </ns8:textbox>
+                </ns8:rect>
+                <ns8:rect id="ComboBox 7000548" ns9:spid="_x0000_s1166" style="position:absolute;left:8906;top:4561;width:24548;height:2173;visibility:visible;mso-wrap-style:square;v-text-anchor:middle" ns9:gfxdata="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" strokecolor="#b4b4b4" strokeweight=".5pt">
+                  <ns8:textbox inset="1.2069mm,0,1.2069mm,0">
+                    <w:txbxContent>
+                      <w:p ns2:paraId="391F5C1F" ns2:textId="77777777">
+                        <w:pPr>
+                          <w:rPr>
+                            <w:color w:val="000000"/>
+                            <w:sz w:val="19"/>
+                            <w:szCs w:val="19"/>
+                          </w:rPr>
+                        </w:pPr>
+                        <w:r>
+                          <w:rPr>
+                            <w:color w:val="000000"/>
+                            <w:sz w:val="19"/>
+                            <w:szCs w:val="19"/>
+                          </w:rPr>
+                          <w:t>Large Popcorn</w:t>
+                        </w:r>
+                      </w:p>
+                    </w:txbxContent>
+                  </ns8:textbox>
+                </ns8:rect>
+                <ns8:shape id="ComboArrow 7000685" ns9:spid="_x0000_s1167" type="#_x0000_t5" style="position:absolute;left:31890;top:5474;width:912;height:521;visibility:visible;mso-wrap-style:square;v-text-anchor:middle" ns9:gfxdata="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" fillcolor="#595959" stroked="f" strokeweight="1pt">
+                  <ns8:textbox inset="1.2069mm,0,1.2069mm,0"/>
+                </ns8:shape>
+                <ns8:rect id="Label 7000822" ns9:spid="_x0000_s1168" style="position:absolute;left:34214;top:4779;width:6517;height:1852;visibility:visible;mso-wrap-style:square;v-text-anchor:middle" ns9:gfxdata="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" filled="f" stroked="f" strokeweight="1pt">
+                  <ns8:textbox inset="0,0,0,0">
+                    <w:txbxContent>
+                      <w:p ns2:paraId="2BBD4E0B" ns2:textId="77777777">
+                        <w:pPr>
+                          <w:rPr>
+                            <w:b/>
+                            <w:bCs/>
+                            <w:color w:val="000000"/>
+                            <w:sz w:val="19"/>
+                            <w:szCs w:val="19"/>
+                          </w:rPr>
+                        </w:pPr>
+                        <w:r>
+                          <w:rPr>
+                            <w:b/>
+                            <w:bCs/>
+                            <w:color w:val="000000"/>
+                            <w:sz w:val="19"/>
+                            <w:szCs w:val="19"/>
+                          </w:rPr>
+                          <w:t>£4.99</w:t>
+                        </w:r>
+                      </w:p>
+                    </w:txbxContent>
+                  </ns8:textbox>
+                </ns8:rect>
+                <ns8:rect id="Label 7000959" ns9:spid="_x0000_s1169" style="position:absolute;left:34214;top:6734;width:9776;height:1683;visibility:visible;mso-wrap-style:square;v-text-anchor:middle" ns9:gfxdata="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" filled="f" stroked="f" strokeweight="1pt">
+                  <ns8:textbox inset="0,0,0,0">
+                    <w:txbxContent>
+                      <w:p ns2:paraId="61B74499" ns2:textId="77777777">
+                        <w:pPr>
+                          <w:rPr>
+                            <w:color w:val="808080"/>
+                            <w:sz w:val="17"/>
+                            <w:szCs w:val="17"/>
+                          </w:rPr>
+                        </w:pPr>
+                        <w:r>
+                          <w:rPr>
+                            <w:color w:val="808080"/>
+                            <w:sz w:val="17"/>
+                            <w:szCs w:val="17"/>
+                          </w:rPr>
+                          <w:t>Snacks</w:t>
+                        </w:r>
+                      </w:p>
+                    </w:txbxContent>
+                  </ns8:textbox>
+                </ns8:rect>
+                <ns8:rect id="picFoodItem 7001096" ns9:spid="_x0000_s1170" style="position:absolute;left:48877;top:2280;width:7821;height:8473;visibility:visible;mso-wrap-style:square;v-text-anchor:middle" ns9:gfxdata="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" strokecolor="#b4b4b4" strokeweight=".5pt">
+                  <ns8:textbox inset="1.2069mm,0,1.2069mm,0"/>
+                </ns8:rect>
+                <ns8:rect id="Label 7001233" ns9:spid="_x0000_s1171" style="position:absolute;left:49095;top:5648;width:7386;height:1515;visibility:visible;mso-wrap-style:square;v-text-anchor:middle" ns9:gfxdata="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" filled="f" stroked="f" strokeweight="1pt">
+                  <ns8:textbox inset="0,0,0,0">
+                    <w:txbxContent>
+                      <w:p ns2:paraId="0AEC56D2" ns2:textId="77777777">
+                        <w:pPr>
+                          <w:jc w:val="center"/>
+                          <w:rPr>
+                            <w:color w:val="808080"/>
+                            <w:sz w:val="15"/>
+                            <w:szCs w:val="15"/>
+                          </w:rPr>
+                        </w:pPr>
+                        <w:r>
+                          <w:rPr>
+                            <w:color w:val="808080"/>
+                            <w:sz w:val="15"/>
+                            <w:szCs w:val="15"/>
+                          </w:rPr>
+                          <w:t>picture of</w:t>
+                        </w:r>
+                      </w:p>
+                    </w:txbxContent>
+                  </ns8:textbox>
+                </ns8:rect>
+                <ns8:rect id="Label 7001370" ns9:spid="_x0000_s1172" style="position:absolute;left:49095;top:6951;width:7386;height:1515;visibility:visible;mso-wrap-style:square;v-text-anchor:middle" ns9:gfxdata="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" filled="f" stroked="f" strokeweight="1pt">
+                  <ns8:textbox inset="0,0,0,0">
+                    <w:txbxContent>
+                      <w:p ns2:paraId="427FCC0C" ns2:textId="77777777">
+                        <w:pPr>
+                          <w:jc w:val="center"/>
+                          <w:rPr>
+                            <w:color w:val="808080"/>
+                            <w:sz w:val="15"/>
+                            <w:szCs w:val="15"/>
+                          </w:rPr>
+                        </w:pPr>
+                        <w:r>
+                          <w:rPr>
+                            <w:color w:val="808080"/>
+                            <w:sz w:val="15"/>
+                            <w:szCs w:val="15"/>
+                          </w:rPr>
+                          <w:t>the item</w:t>
+                        </w:r>
+                      </w:p>
+                    </w:txbxContent>
+                  </ns8:textbox>
+                </ns8:rect>
+                <ns8:rect id="Label 7001507" ns9:spid="_x0000_s1173" style="position:absolute;left:1303;top:7929;width:6517;height:1852;visibility:visible;mso-wrap-style:square;v-text-anchor:middle" ns9:gfxdata="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" filled="f" stroked="f" strokeweight="1pt">
+                  <ns8:textbox inset="0,0,0,0">
+                    <w:txbxContent>
+                      <w:p ns2:paraId="5EFB3BD6" ns2:textId="77777777">
+                        <w:pPr>
+                          <w:rPr>
+                            <w:color w:val="000000"/>
+                            <w:sz w:val="19"/>
+                            <w:szCs w:val="19"/>
+                          </w:rPr>
+                        </w:pPr>
+                        <w:r>
+                          <w:rPr>
+                            <w:color w:val="000000"/>
+                            <w:sz w:val="19"/>
+                            <w:szCs w:val="19"/>
+                          </w:rPr>
+                          <w:t>Quantity</w:t>
+                        </w:r>
+                      </w:p>
+                    </w:txbxContent>
+                  </ns8:textbox>
+                </ns8:rect>
+                <ns8:rect id="TextBox 7001644" ns9:spid="_x0000_s1174" style="position:absolute;left:8906;top:7711;width:4997;height:2173;visibility:visible;mso-wrap-style:square;v-text-anchor:middle" ns9:gfxdata="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" strokecolor="#b4b4b4" strokeweight=".5pt">
+                  <ns8:textbox inset="1.2069mm,0,1.2069mm,0">
+                    <w:txbxContent>
+                      <w:p ns2:paraId="3BECAC59" ns2:textId="77777777">
+                        <w:pPr>
+                          <w:rPr>
+                            <w:color w:val="000000"/>
+                            <w:sz w:val="19"/>
+                            <w:szCs w:val="19"/>
+                          </w:rPr>
+                        </w:pPr>
+                        <w:r>
+                          <w:rPr>
+                            <w:color w:val="000000"/>
+                            <w:sz w:val="19"/>
+                            <w:szCs w:val="19"/>
+                          </w:rPr>
+                          <w:t>1</w:t>
+                        </w:r>
+                      </w:p>
+                    </w:txbxContent>
+                  </ns8:textbox>
+                </ns8:rect>
+                <ns8:rect id="Button 7001781" ns9:spid="_x0000_s1175" style="position:absolute;left:14989;top:7603;width:11405;height:2389;visibility:visible;mso-wrap-style:square;v-text-anchor:middle" ns9:gfxdata="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" fillcolor="#f0f0f0" strokecolor="#b4b4b4" strokeweight=".5pt">
+                  <ns8:textbox inset=".60344mm,0,.60344mm,0">
+                    <w:txbxContent>
+                      <w:p ns2:paraId="71EAACA3" ns2:textId="77777777">
+                        <w:pPr>
+                          <w:jc w:val="center"/>
+                          <w:rPr>
+                            <w:color w:val="000000"/>
+                            <w:sz w:val="19"/>
+                            <w:szCs w:val="19"/>
+                          </w:rPr>
+                        </w:pPr>
+                        <w:r>
+                          <w:rPr>
+                            <w:color w:val="000000"/>
+                            <w:sz w:val="19"/>
+                            <w:szCs w:val="19"/>
+                          </w:rPr>
+                          <w:t>Add To Order</w:t>
+                        </w:r>
+                      </w:p>
+                    </w:txbxContent>
+                  </ns8:textbox>
+                </ns8:rect>
+                <ns8:rect id="dgvOrderItemsFrame 7001918" ns9:spid="_x0000_s1176" style="position:absolute;left:1303;top:12382;width:55938;height:21723;visibility:visible;mso-wrap-style:square;v-text-anchor:middle" ns9:gfxdata="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" strokecolor="#b4b4b4" strokeweight=".5pt">
+                  <ns8:textbox inset="1.2069mm,0,1.2069mm,0"/>
+                </ns8:rect>
+                <ns8:rect id="dgvOrderItemsHeader 7002055" ns9:spid="_x0000_s1177" style="position:absolute;left:1303;top:12382;width:55938;height:2270;visibility:visible;mso-wrap-style:square;v-text-anchor:middle" ns9:gfxdata="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" fillcolor="#400040" stroked="f" strokeweight="1pt">
+                  <ns8:textbox inset="1.2069mm,0,1.2069mm,0"/>
+                </ns8:rect>
+                <ns8:rect id="dgvOrderItemsAlt 7002192" ns9:spid="_x0000_s1178" style="position:absolute;left:1412;top:16862;width:55720;height:2211;visibility:visible;mso-wrap-style:square;v-text-anchor:middle" ns9:gfxdata="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" fillcolor="#f5f5f8" stroked="f" strokeweight="1pt">
+                  <ns8:textbox inset="1.2069mm,0,1.2069mm,0"/>
+                </ns8:rect>
+                <ns8:rect id="dgvOrderItemsAlt 7002329" ns9:spid="_x0000_s1179" style="position:absolute;left:1412;top:21283;width:55720;height:2210;visibility:visible;mso-wrap-style:square;v-text-anchor:middle" ns9:gfxdata="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" fillcolor="#f5f5f8" stroked="f" strokeweight="1pt">
+                  <ns8:textbox inset="1.2069mm,0,1.2069mm,0"/>
+                </ns8:rect>
+                <ns8:rect id="dgvOrderItemsAlt 7002466" ns9:spid="_x0000_s1180" style="position:absolute;left:1412;top:25704;width:55720;height:2210;visibility:visible;mso-wrap-style:square;v-text-anchor:middle" ns9:gfxdata="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" fillcolor="#f5f5f8" stroked="f" strokeweight="1pt">
+                  <ns8:textbox inset="1.2069mm,0,1.2069mm,0"/>
+                </ns8:rect>
+                <ns8:rect id="dgvOrderItemsHead 7002603" ns9:spid="_x0000_s1181" style="position:absolute;left:1737;top:12382;width:25569;height:2270;visibility:visible;mso-wrap-style:square;v-text-anchor:middle" ns9:gfxdata="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" filled="f" stroked="f" strokeweight="1pt">
+                  <ns8:textbox inset="0,0,0,0">
+                    <w:txbxContent>
+                      <w:p ns2:paraId="0AEA1921" ns2:textId="77777777">
+                        <w:pPr>
+                          <w:rPr>
+                            <w:b/>
+                            <w:bCs/>
+                            <w:color w:val="FFFFFF"/>
+                            <w:sz w:val="19"/>
+                            <w:szCs w:val="19"/>
+                          </w:rPr>
+                        </w:pPr>
+                        <w:r>
+                          <w:rPr>
+                            <w:b/>
+                            <w:bCs/>
+                            <w:color w:val="FFFFFF"/>
+                            <w:sz w:val="19"/>
+                            <w:szCs w:val="19"/>
+                          </w:rPr>
+                          <w:t>Item</w:t>
+                        </w:r>
+                      </w:p>
+                    </w:txbxContent>
+                  </ns8:textbox>
+                </ns8:rect>
+                <ns8:rect id="dgvOrderItemsCell 7002740" ns9:spid="_x0000_s1182" style="position:absolute;left:1737;top:14652;width:24918;height:2210;visibility:visible;mso-wrap-style:square;v-text-anchor:middle" ns9:gfxdata="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" filled="f" stroked="f" strokeweight="1pt">
+                  <ns8:textbox inset="0,0,0,0">
+                    <w:txbxContent>
+                      <w:p ns2:paraId="1ACFA9D9" ns2:textId="77777777">
+                        <w:pPr>
+                          <w:rPr>
+                            <w:color w:val="000000"/>
+                            <w:sz w:val="19"/>
+                            <w:szCs w:val="19"/>
+                          </w:rPr>
+                        </w:pPr>
+                        <w:r>
+                          <w:rPr>
+                            <w:color w:val="000000"/>
+                            <w:sz w:val="19"/>
+                            <w:szCs w:val="19"/>
+                          </w:rPr>
+                          <w:t>Large Popcorn</w:t>
+                        </w:r>
+                      </w:p>
+                    </w:txbxContent>
+                  </ns8:textbox>
+                </ns8:rect>
+                <ns8:rect id="dgvOrderItemsCell 7002877" ns9:spid="_x0000_s1183" style="position:absolute;left:1737;top:16862;width:24918;height:2211;visibility:visible;mso-wrap-style:square;v-text-anchor:middle" ns9:gfxdata="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" filled="f" stroked="f" strokeweight="1pt">
+                  <ns8:textbox inset="0,0,0,0">
+                    <w:txbxContent>
+                      <w:p ns2:paraId="24FFCD5D" ns2:textId="77777777">
+                        <w:pPr>
+                          <w:rPr>
+                            <w:color w:val="000000"/>
+                            <w:sz w:val="19"/>
+                            <w:szCs w:val="19"/>
+                          </w:rPr>
+                        </w:pPr>
+                        <w:r>
+                          <w:rPr>
+                            <w:color w:val="000000"/>
+                            <w:sz w:val="19"/>
+                            <w:szCs w:val="19"/>
+                          </w:rPr>
+                          <w:t>Medium Popcorn</w:t>
+                        </w:r>
+                      </w:p>
+                    </w:txbxContent>
+                  </ns8:textbox>
+                </ns8:rect>
+                <ns8:rect id="dgvOrderItemsCell 7003014" ns9:spid="_x0000_s1184" style="position:absolute;left:1737;top:19073;width:24918;height:2210;visibility:visible;mso-wrap-style:square;v-text-anchor:middle" ns9:gfxdata="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" filled="f" stroked="f" strokeweight="1pt">
+                  <ns8:textbox inset="0,0,0,0">
+                    <w:txbxContent>
+                      <w:p ns2:paraId="45EFBC6E" ns2:textId="77777777">
+                        <w:pPr>
+                          <w:rPr>
+                            <w:color w:val="000000"/>
+                            <w:sz w:val="19"/>
+                            <w:szCs w:val="19"/>
+                          </w:rPr>
+                        </w:pPr>
+                        <w:r>
+                          <w:rPr>
+                            <w:color w:val="000000"/>
+                            <w:sz w:val="19"/>
+                            <w:szCs w:val="19"/>
+                          </w:rPr>
+                          <w:t>Coca Cola</w:t>
+                        </w:r>
+                      </w:p>
+                    </w:txbxContent>
+                  </ns8:textbox>
+                </ns8:rect>
+                <ns8:rect id="dgvOrderItemsCell 7003151" ns9:spid="_x0000_s1185" style="position:absolute;left:1737;top:21283;width:24918;height:2210;visibility:visible;mso-wrap-style:square;v-text-anchor:middle" ns9:gfxdata="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" filled="f" stroked="f" strokeweight="1pt">
+                  <ns8:textbox inset="0,0,0,0">
+                    <w:txbxContent>
+                      <w:p ns2:paraId="793EB53D" ns2:textId="77777777">
+                        <w:pPr>
+                          <w:rPr>
+                            <w:color w:val="000000"/>
+                            <w:sz w:val="19"/>
+                            <w:szCs w:val="19"/>
+                          </w:rPr>
+                        </w:pPr>
+                        <w:r>
+                          <w:rPr>
+                            <w:color w:val="000000"/>
+                            <w:sz w:val="19"/>
+                            <w:szCs w:val="19"/>
+                          </w:rPr>
+                          <w:t>Water</w:t>
+                        </w:r>
+                      </w:p>
+                    </w:txbxContent>
+                  </ns8:textbox>
+                </ns8:rect>
+                <ns8:rect id="dgvOrderItemsCell 7003288" ns9:spid="_x0000_s1186" style="position:absolute;left:1737;top:23493;width:24918;height:2211;visibility:visible;mso-wrap-style:square;v-text-anchor:middle" ns9:gfxdata="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" filled="f" stroked="f" strokeweight="1pt">
+                  <ns8:textbox inset="0,0,0,0">
+                    <w:txbxContent>
+                      <w:p ns2:paraId="429D6681" ns2:textId="77777777">
+                        <w:pPr>
+                          <w:rPr>
+                            <w:color w:val="000000"/>
+                            <w:sz w:val="19"/>
+                            <w:szCs w:val="19"/>
+                          </w:rPr>
+                        </w:pPr>
+                        <w:r>
+                          <w:rPr>
+                            <w:color w:val="000000"/>
+                            <w:sz w:val="19"/>
+                            <w:szCs w:val="19"/>
+                          </w:rPr>
+                          <w:t>Nachos</w:t>
+                        </w:r>
+                      </w:p>
+                    </w:txbxContent>
+                  </ns8:textbox>
+                </ns8:rect>
+                <ns8:rect id="dgvOrderItemsCell 7003425" ns9:spid="_x0000_s1187" style="position:absolute;left:1737;top:25704;width:24918;height:2210;visibility:visible;mso-wrap-style:square;v-text-anchor:middle" ns9:gfxdata="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" filled="f" stroked="f" strokeweight="1pt">
+                  <ns8:textbox inset="0,0,0,0">
+                    <w:txbxContent>
+                      <w:p ns2:paraId="567EAEDB" ns2:textId="77777777">
+                        <w:pPr>
+                          <w:rPr>
+                            <w:color w:val="000000"/>
+                            <w:sz w:val="19"/>
+                            <w:szCs w:val="19"/>
+                          </w:rPr>
+                        </w:pPr>
+                        <w:r>
+                          <w:rPr>
+                            <w:color w:val="000000"/>
+                            <w:sz w:val="19"/>
+                            <w:szCs w:val="19"/>
+                          </w:rPr>
+                          <w:t>Small Popcorn</w:t>
+                        </w:r>
+                      </w:p>
+                    </w:txbxContent>
+                  </ns8:textbox>
+                </ns8:rect>
+                <ns8:rect id="dgvOrderItemsHead 7003562" ns9:spid="_x0000_s1188" style="position:absolute;left:27306;top:12382;width:10855;height:2270;visibility:visible;mso-wrap-style:square;v-text-anchor:middle" ns9:gfxdata="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" filled="f" stroked="f" strokeweight="1pt">
+                  <ns8:textbox inset="0,0,0,0">
+                    <w:txbxContent>
+                      <w:p ns2:paraId="085765CF" ns2:textId="77777777">
+                        <w:pPr>
+                          <w:rPr>
+                            <w:b/>
+                            <w:bCs/>
+                            <w:color w:val="FFFFFF"/>
+                            <w:sz w:val="19"/>
+                            <w:szCs w:val="19"/>
+                          </w:rPr>
+                        </w:pPr>
+                        <w:r>
+                          <w:rPr>
+                            <w:b/>
+                            <w:bCs/>
+                            <w:color w:val="FFFFFF"/>
+                            <w:sz w:val="19"/>
+                            <w:szCs w:val="19"/>
+                          </w:rPr>
+                          <w:t>Price</w:t>
+                        </w:r>
+                      </w:p>
+                    </w:txbxContent>
+                  </ns8:textbox>
+                </ns8:rect>
+                <ns8:rect id="dgvOrderItemsCell 7003699" ns9:spid="_x0000_s1189" style="position:absolute;left:27306;top:14652;width:10203;height:2210;visibility:visible;mso-wrap-style:square;v-text-anchor:middle" ns9:gfxdata="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" filled="f" stroked="f" strokeweight="1pt">
+                  <ns8:textbox inset="0,0,0,0">
+                    <w:txbxContent>
+                      <w:p ns2:paraId="678A40DC" ns2:textId="77777777">
+                        <w:pPr>
+                          <w:rPr>
+                            <w:color w:val="000000"/>
+                            <w:sz w:val="19"/>
+                            <w:szCs w:val="19"/>
+                          </w:rPr>
+                        </w:pPr>
+                        <w:r>
+                          <w:rPr>
+                            <w:color w:val="000000"/>
+                            <w:sz w:val="19"/>
+                            <w:szCs w:val="19"/>
+                          </w:rPr>
+                          <w:t>£4.99</w:t>
+                        </w:r>
+                      </w:p>
+                    </w:txbxContent>
+                  </ns8:textbox>
+                </ns8:rect>
+                <ns8:rect id="dgvOrderItemsCell 7003836" ns9:spid="_x0000_s1190" style="position:absolute;left:27306;top:16862;width:10203;height:2211;visibility:visible;mso-wrap-style:square;v-text-anchor:middle" ns9:gfxdata="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" filled="f" stroked="f" strokeweight="1pt">
+                  <ns8:textbox inset="0,0,0,0">
+                    <w:txbxContent>
+                      <w:p ns2:paraId="65C66A52" ns2:textId="77777777">
+                        <w:pPr>
+                          <w:rPr>
+                            <w:color w:val="000000"/>
+                            <w:sz w:val="19"/>
+                            <w:szCs w:val="19"/>
+                          </w:rPr>
+                        </w:pPr>
+                        <w:r>
+                          <w:rPr>
+                            <w:color w:val="000000"/>
+                            <w:sz w:val="19"/>
+                            <w:szCs w:val="19"/>
+                          </w:rPr>
+                          <w:t>£3.99</w:t>
+                        </w:r>
+                      </w:p>
+                    </w:txbxContent>
+                  </ns8:textbox>
+                </ns8:rect>
+                <ns8:rect id="dgvOrderItemsCell 7003973" ns9:spid="_x0000_s1191" style="position:absolute;left:27306;top:19073;width:10203;height:2210;visibility:visible;mso-wrap-style:square;v-text-anchor:middle" ns9:gfxdata="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" filled="f" stroked="f" strokeweight="1pt">
+                  <ns8:textbox inset="0,0,0,0">
+                    <w:txbxContent>
+                      <w:p ns2:paraId="29B1E118" ns2:textId="77777777">
+                        <w:pPr>
+                          <w:rPr>
+                            <w:color w:val="000000"/>
+                            <w:sz w:val="19"/>
+                            <w:szCs w:val="19"/>
+                          </w:rPr>
+                        </w:pPr>
+                        <w:r>
+                          <w:rPr>
+                            <w:color w:val="000000"/>
+                            <w:sz w:val="19"/>
+                            <w:szCs w:val="19"/>
+                          </w:rPr>
+                          <w:t>£2.99</w:t>
+                        </w:r>
+                      </w:p>
+                    </w:txbxContent>
+                  </ns8:textbox>
+                </ns8:rect>
+                <ns8:rect id="dgvOrderItemsCell 7004110" ns9:spid="_x0000_s1192" style="position:absolute;left:27306;top:21283;width:10203;height:2210;visibility:visible;mso-wrap-style:square;v-text-anchor:middle" ns9:gfxdata="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" filled="f" stroked="f" strokeweight="1pt">
+                  <ns8:textbox inset="0,0,0,0">
+                    <w:txbxContent>
+                      <w:p ns2:paraId="4B9B42FD" ns2:textId="77777777">
+                        <w:pPr>
+                          <w:rPr>
+                            <w:color w:val="000000"/>
+                            <w:sz w:val="19"/>
+                            <w:szCs w:val="19"/>
+                          </w:rPr>
+                        </w:pPr>
+                        <w:r>
+                          <w:rPr>
+                            <w:color w:val="000000"/>
+                            <w:sz w:val="19"/>
+                            <w:szCs w:val="19"/>
+                          </w:rPr>
+                          <w:t>£1.99</w:t>
+                        </w:r>
+                      </w:p>
+                    </w:txbxContent>
+                  </ns8:textbox>
+                </ns8:rect>
+                <ns8:rect id="dgvOrderItemsCell 7004247" ns9:spid="_x0000_s1193" style="position:absolute;left:27306;top:23493;width:10203;height:2211;visibility:visible;mso-wrap-style:square;v-text-anchor:middle" ns9:gfxdata="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" filled="f" stroked="f" strokeweight="1pt">
+                  <ns8:textbox inset="0,0,0,0">
+                    <w:txbxContent>
+                      <w:p ns2:paraId="411EB58F" ns2:textId="77777777">
+                        <w:pPr>
+                          <w:rPr>
+                            <w:color w:val="000000"/>
+                            <w:sz w:val="19"/>
+                            <w:szCs w:val="19"/>
+                          </w:rPr>
+                        </w:pPr>
+                        <w:r>
+                          <w:rPr>
+                            <w:color w:val="000000"/>
+                            <w:sz w:val="19"/>
+                            <w:szCs w:val="19"/>
+                          </w:rPr>
+                          <w:t>£4.49</w:t>
+                        </w:r>
+                      </w:p>
+                    </w:txbxContent>
+                  </ns8:textbox>
+                </ns8:rect>
+                <ns8:rect id="dgvOrderItemsCell 7004384" ns9:spid="_x0000_s1194" style="position:absolute;left:27306;top:25704;width:10203;height:2210;visibility:visible;mso-wrap-style:square;v-text-anchor:middle" ns9:gfxdata="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" filled="f" stroked="f" strokeweight="1pt">
+                  <ns8:textbox inset="0,0,0,0">
+                    <w:txbxContent>
+                      <w:p ns2:paraId="64B24161" ns2:textId="77777777">
+                        <w:pPr>
+                          <w:rPr>
+                            <w:color w:val="000000"/>
+                            <w:sz w:val="19"/>
+                            <w:szCs w:val="19"/>
+                          </w:rPr>
+                        </w:pPr>
+                        <w:r>
+                          <w:rPr>
+                            <w:color w:val="000000"/>
+                            <w:sz w:val="19"/>
+                            <w:szCs w:val="19"/>
+                          </w:rPr>
+                          <w:t>£1.99</w:t>
+                        </w:r>
+                      </w:p>
+                    </w:txbxContent>
+                  </ns8:textbox>
+                </ns8:rect>
+                <ns8:rect id="dgvOrderItemsVLine 7004521" ns9:spid="_x0000_s1195" style="position:absolute;left:26872;top:14652;width:87;height:13262;visibility:visible;mso-wrap-style:square;v-text-anchor:middle" ns9:gfxdata="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" fillcolor="#d2d2d2" stroked="f" strokeweight="1pt">
+                  <ns8:textbox inset="1.2069mm,0,1.2069mm,0"/>
+                </ns8:rect>
+                <ns8:rect id="dgvOrderItemsHead 7004658" ns9:spid="_x0000_s1196" style="position:absolute;left:38161;top:12382;width:7236;height:2270;visibility:visible;mso-wrap-style:square;v-text-anchor:middle" ns9:gfxdata="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" filled="f" stroked="f" strokeweight="1pt">
+                  <ns8:textbox inset="0,0,0,0">
+                    <w:txbxContent>
+                      <w:p ns2:paraId="32F393E6" ns2:textId="77777777">
+                        <w:pPr>
+                          <w:rPr>
+                            <w:b/>
+                            <w:bCs/>
+                            <w:color w:val="FFFFFF"/>
+                            <w:sz w:val="19"/>
+                            <w:szCs w:val="19"/>
+                          </w:rPr>
+                        </w:pPr>
+                        <w:r>
+                          <w:rPr>
+                            <w:b/>
+                            <w:bCs/>
+                            <w:color w:val="FFFFFF"/>
+                            <w:sz w:val="19"/>
+                            <w:szCs w:val="19"/>
+                          </w:rPr>
+                          <w:t>Qty</w:t>
+                        </w:r>
+                      </w:p>
+                    </w:txbxContent>
+                  </ns8:textbox>
+                </ns8:rect>
+                <ns8:rect id="dgvOrderItemsCell 7004795" ns9:spid="_x0000_s1197" style="position:absolute;left:38161;top:14652;width:6585;height:2210;visibility:visible;mso-wrap-style:square;v-text-anchor:middle" ns9:gfxdata="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" filled="f" stroked="f" strokeweight="1pt">
+                  <ns8:textbox inset="0,0,0,0">
+                    <w:txbxContent>
+                      <w:p ns2:paraId="7EFBBBB1" ns2:textId="77777777">
+                        <w:pPr>
+                          <w:rPr>
+                            <w:color w:val="000000"/>
+                            <w:sz w:val="19"/>
+                            <w:szCs w:val="19"/>
+                          </w:rPr>
+                        </w:pPr>
+                        <w:r>
+                          <w:rPr>
+                            <w:color w:val="000000"/>
+                            <w:sz w:val="19"/>
+                            <w:szCs w:val="19"/>
+                          </w:rPr>
+                          <w:t>4</w:t>
+                        </w:r>
+                      </w:p>
+                    </w:txbxContent>
+                  </ns8:textbox>
+                </ns8:rect>
+                <ns8:rect id="dgvOrderItemsCell 7004932" ns9:spid="_x0000_s1198" style="position:absolute;left:38161;top:16862;width:6585;height:2211;visibility:visible;mso-wrap-style:square;v-text-anchor:middle" ns9:gfxdata="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" filled="f" stroked="f" strokeweight="1pt">
+                  <ns8:textbox inset="0,0,0,0">
+                    <w:txbxContent>
+                      <w:p ns2:paraId="69D5136F" ns2:textId="77777777">
+                        <w:pPr>
+                          <w:rPr>
+                            <w:color w:val="000000"/>
+                            <w:sz w:val="19"/>
+                            <w:szCs w:val="19"/>
+                          </w:rPr>
+                        </w:pPr>
+                        <w:r>
+                          <w:rPr>
+                            <w:color w:val="000000"/>
+                            <w:sz w:val="19"/>
+                            <w:szCs w:val="19"/>
+                          </w:rPr>
+                          <w:t>2</w:t>
+                        </w:r>
+                      </w:p>
+                    </w:txbxContent>
+                  </ns8:textbox>
+                </ns8:rect>
+                <ns8:rect id="dgvOrderItemsCell 7005069" ns9:spid="_x0000_s1199" style="position:absolute;left:38161;top:19073;width:6585;height:2210;visibility:visible;mso-wrap-style:square;v-text-anchor:middle" ns9:gfxdata="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" filled="f" stroked="f" strokeweight="1pt">
+                  <ns8:textbox inset="0,0,0,0">
+                    <w:txbxContent>
+                      <w:p ns2:paraId="6BE298A4" ns2:textId="77777777">
+                        <w:pPr>
+                          <w:rPr>
+                            <w:color w:val="000000"/>
+                            <w:sz w:val="19"/>
+                            <w:szCs w:val="19"/>
+                          </w:rPr>
+                        </w:pPr>
+                        <w:r>
+                          <w:rPr>
+                            <w:color w:val="000000"/>
+                            <w:sz w:val="19"/>
+                            <w:szCs w:val="19"/>
+                          </w:rPr>
+                          <w:t>2</w:t>
+                        </w:r>
+                      </w:p>
+                    </w:txbxContent>
+                  </ns8:textbox>
+                </ns8:rect>
+                <ns8:rect id="dgvOrderItemsCell 7005206" ns9:spid="_x0000_s1200" style="position:absolute;left:38161;top:21283;width:6585;height:2210;visibility:visible;mso-wrap-style:square;v-text-anchor:middle" ns9:gfxdata="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" filled="f" stroked="f" strokeweight="1pt">
+                  <ns8:textbox inset="0,0,0,0">
+                    <w:txbxContent>
+                      <w:p ns2:paraId="6EDF1634" ns2:textId="77777777">
+                        <w:pPr>
+                          <w:rPr>
+                            <w:color w:val="000000"/>
+                            <w:sz w:val="19"/>
+                            <w:szCs w:val="19"/>
+                          </w:rPr>
+                        </w:pPr>
+                        <w:r>
+                          <w:rPr>
+                            <w:color w:val="000000"/>
+                            <w:sz w:val="19"/>
+                            <w:szCs w:val="19"/>
+                          </w:rPr>
+                          <w:t>2</w:t>
+                        </w:r>
+                      </w:p>
+                    </w:txbxContent>
+                  </ns8:textbox>
+                </ns8:rect>
+                <ns8:rect id="dgvOrderItemsCell 7005343" ns9:spid="_x0000_s1201" style="position:absolute;left:38161;top:23493;width:6585;height:2211;visibility:visible;mso-wrap-style:square;v-text-anchor:middle" ns9:gfxdata="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" filled="f" stroked="f" strokeweight="1pt">
+                  <ns8:textbox inset="0,0,0,0">
+                    <w:txbxContent>
+                      <w:p ns2:paraId="2DEDA018" ns2:textId="77777777">
+                        <w:pPr>
+                          <w:rPr>
+                            <w:color w:val="000000"/>
+                            <w:sz w:val="19"/>
+                            <w:szCs w:val="19"/>
+                          </w:rPr>
+                        </w:pPr>
+                        <w:r>
+                          <w:rPr>
+                            <w:color w:val="000000"/>
+                            <w:sz w:val="19"/>
+                            <w:szCs w:val="19"/>
+                          </w:rPr>
+                          <w:t>2</w:t>
+                        </w:r>
+                      </w:p>
+                    </w:txbxContent>
+                  </ns8:textbox>
+                </ns8:rect>
+                <ns8:rect id="dgvOrderItemsCell 7005480" ns9:spid="_x0000_s1202" style="position:absolute;left:38161;top:25704;width:6585;height:2210;visibility:visible;mso-wrap-style:square;v-text-anchor:middle" ns9:gfxdata="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" filled="f" stroked="f" strokeweight="1pt">
+                  <ns8:textbox inset="0,0,0,0">
+                    <w:txbxContent>
+                      <w:p ns2:paraId="3D366697" ns2:textId="77777777">
+                        <w:pPr>
+                          <w:rPr>
+                            <w:color w:val="000000"/>
+                            <w:sz w:val="19"/>
+                            <w:szCs w:val="19"/>
+                          </w:rPr>
+                        </w:pPr>
+                        <w:r>
+                          <w:rPr>
+                            <w:color w:val="000000"/>
+                            <w:sz w:val="19"/>
+                            <w:szCs w:val="19"/>
+                          </w:rPr>
+                          <w:t>3</w:t>
+                        </w:r>
+                      </w:p>
+                    </w:txbxContent>
+                  </ns8:textbox>
+                </ns8:rect>
+                <ns8:rect id="dgvOrderItemsVLine 7005617" ns9:spid="_x0000_s1203" style="position:absolute;left:37726;top:14652;width:87;height:13262;visibility:visible;mso-wrap-style:square;v-text-anchor:middle" ns9:gfxdata="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" fillcolor="#d2d2d2" stroked="f" strokeweight="1pt">
+                  <ns8:textbox inset="1.2069mm,0,1.2069mm,0"/>
+                </ns8:rect>
+                <ns8:rect id="dgvOrderItemsHead 7005754" ns9:spid="_x0000_s1204" style="position:absolute;left:45397;top:12382;width:12061;height:2270;visibility:visible;mso-wrap-style:square;v-text-anchor:middle" ns9:gfxdata="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" filled="f" stroked="f" strokeweight="1pt">
+                  <ns8:textbox inset="0,0,0,0">
+                    <w:txbxContent>
+                      <w:p ns2:paraId="0E75A2FA" ns2:textId="77777777">
+                        <w:pPr>
+                          <w:rPr>
+                            <w:b/>
+                            <w:bCs/>
+                            <w:color w:val="FFFFFF"/>
+                            <w:sz w:val="19"/>
+                            <w:szCs w:val="19"/>
+                          </w:rPr>
+                        </w:pPr>
+                        <w:r>
+                          <w:rPr>
+                            <w:b/>
+                            <w:bCs/>
+                            <w:color w:val="FFFFFF"/>
+                            <w:sz w:val="19"/>
+                            <w:szCs w:val="19"/>
+                          </w:rPr>
+                          <w:t>Subtotal</w:t>
+                        </w:r>
+                      </w:p>
+                    </w:txbxContent>
+                  </ns8:textbox>
+                </ns8:rect>
+                <ns8:rect id="dgvOrderItemsCell 7005891" ns9:spid="_x0000_s1205" style="position:absolute;left:45397;top:14652;width:11410;height:2210;visibility:visible;mso-wrap-style:square;v-text-anchor:middle" ns9:gfxdata="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" filled="f" stroked="f" strokeweight="1pt">
+                  <ns8:textbox inset="0,0,0,0">
+                    <w:txbxContent>
+                      <w:p ns2:paraId="00A31C5A" ns2:textId="77777777">
+                        <w:pPr>
+                          <w:rPr>
+                            <w:color w:val="000000"/>
+                            <w:sz w:val="19"/>
+                            <w:szCs w:val="19"/>
+                          </w:rPr>
+                        </w:pPr>
+                        <w:r>
+                          <w:rPr>
+                            <w:color w:val="000000"/>
+                            <w:sz w:val="19"/>
+                            <w:szCs w:val="19"/>
+                          </w:rPr>
+                          <w:t>£19.96</w:t>
+                        </w:r>
+                      </w:p>
+                    </w:txbxContent>
+                  </ns8:textbox>
+                </ns8:rect>
+                <ns8:rect id="dgvOrderItemsCell 7006028" ns9:spid="_x0000_s1206" style="position:absolute;left:45397;top:16862;width:11410;height:2211;visibility:visible;mso-wrap-style:square;v-text-anchor:middle" ns9:gfxdata="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" filled="f" stroked="f" strokeweight="1pt">
+                  <ns8:textbox inset="0,0,0,0">
+                    <w:txbxContent>
+                      <w:p ns2:paraId="27DE055D" ns2:textId="77777777">
+                        <w:pPr>
+                          <w:rPr>
+                            <w:color w:val="000000"/>
+                            <w:sz w:val="19"/>
+                            <w:szCs w:val="19"/>
+                          </w:rPr>
+                        </w:pPr>
+                        <w:r>
+                          <w:rPr>
+                            <w:color w:val="000000"/>
+                            <w:sz w:val="19"/>
+                            <w:szCs w:val="19"/>
+                          </w:rPr>
+                          <w:t>£7.98</w:t>
+                        </w:r>
+                      </w:p>
+                    </w:txbxContent>
+                  </ns8:textbox>
+                </ns8:rect>
+                <ns8:rect id="dgvOrderItemsCell 7006165" ns9:spid="_x0000_s1207" style="position:absolute;left:45397;top:19073;width:11410;height:2210;visibility:visible;mso-wrap-style:square;v-text-anchor:middle" ns9:gfxdata="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" filled="f" stroked="f" strokeweight="1pt">
+                  <ns8:textbox inset="0,0,0,0">
+                    <w:txbxContent>
+                      <w:p ns2:paraId="5E4D1E28" ns2:textId="77777777">
+                        <w:pPr>
+                          <w:rPr>
+                            <w:color w:val="000000"/>
+                            <w:sz w:val="19"/>
+                            <w:szCs w:val="19"/>
+                          </w:rPr>
+                        </w:pPr>
+                        <w:r>
+                          <w:rPr>
+                            <w:color w:val="000000"/>
+                            <w:sz w:val="19"/>
+                            <w:szCs w:val="19"/>
+                          </w:rPr>
+                          <w:t>£5.98</w:t>
+                        </w:r>
+                      </w:p>
+                    </w:txbxContent>
+                  </ns8:textbox>
+                </ns8:rect>
+                <ns8:rect id="dgvOrderItemsCell 7006302" ns9:spid="_x0000_s1208" style="position:absolute;left:45397;top:21283;width:11410;height:2210;visibility:visible;mso-wrap-style:square;v-text-anchor:middle" ns9:gfxdata="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" filled="f" stroked="f" strokeweight="1pt">
+                  <ns8:textbox inset="0,0,0,0">
+                    <w:txbxContent>
+                      <w:p ns2:paraId="19279F1E" ns2:textId="77777777">
+                        <w:pPr>
+                          <w:rPr>
+                            <w:color w:val="000000"/>
+                            <w:sz w:val="19"/>
+                            <w:szCs w:val="19"/>
+                          </w:rPr>
+                        </w:pPr>
+                        <w:r>
+                          <w:rPr>
+                            <w:color w:val="000000"/>
+                            <w:sz w:val="19"/>
+                            <w:szCs w:val="19"/>
+                          </w:rPr>
+                          <w:t>£3.98</w:t>
+                        </w:r>
+                      </w:p>
+                    </w:txbxContent>
+                  </ns8:textbox>
+                </ns8:rect>
+                <ns8:rect id="dgvOrderItemsCell 7006439" ns9:spid="_x0000_s1209" style="position:absolute;left:45397;top:23493;width:11410;height:2211;visibility:visible;mso-wrap-style:square;v-text-anchor:middle" ns9:gfxdata="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" filled="f" stroked="f" strokeweight="1pt">
+                  <ns8:textbox inset="0,0,0,0">
+                    <w:txbxContent>
+                      <w:p ns2:paraId="1E53C06A" ns2:textId="77777777">
+                        <w:pPr>
+                          <w:rPr>
+                            <w:color w:val="000000"/>
+                            <w:sz w:val="19"/>
+                            <w:szCs w:val="19"/>
+                          </w:rPr>
+                        </w:pPr>
+                        <w:r>
+                          <w:rPr>
+                            <w:color w:val="000000"/>
+                            <w:sz w:val="19"/>
+                            <w:szCs w:val="19"/>
+                          </w:rPr>
+                          <w:t>£8.98</w:t>
+                        </w:r>
+                      </w:p>
+                    </w:txbxContent>
+                  </ns8:textbox>
+                </ns8:rect>
+                <ns8:rect id="dgvOrderItemsCell 7006576" ns9:spid="_x0000_s1210" style="position:absolute;left:45397;top:25704;width:11410;height:2210;visibility:visible;mso-wrap-style:square;v-text-anchor:middle" ns9:gfxdata="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" filled="f" stroked="f" strokeweight="1pt">
+                  <ns8:textbox inset="0,0,0,0">
+                    <w:txbxContent>
+                      <w:p ns2:paraId="1745B572" ns2:textId="77777777">
+                        <w:pPr>
+                          <w:rPr>
+                            <w:color w:val="000000"/>
+                            <w:sz w:val="19"/>
+                            <w:szCs w:val="19"/>
+                          </w:rPr>
+                        </w:pPr>
+                        <w:r>
+                          <w:rPr>
+                            <w:color w:val="000000"/>
+                            <w:sz w:val="19"/>
+                            <w:szCs w:val="19"/>
+                          </w:rPr>
+                          <w:t>£5.97</w:t>
+                        </w:r>
+                      </w:p>
+                    </w:txbxContent>
+                  </ns8:textbox>
+                </ns8:rect>
+                <ns8:rect id="dgvOrderItemsVLine 7006713" ns9:spid="_x0000_s1211" style="position:absolute;left:44963;top:14652;width:87;height:13262;visibility:visible;mso-wrap-style:square;v-text-anchor:middle" ns9:gfxdata="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" fillcolor="#d2d2d2" stroked="f" strokeweight="1pt">
+                  <ns8:textbox inset="1.2069mm,0,1.2069mm,0"/>
+                </ns8:rect>
+                <ns8:rect id="dgvOrderItemsHLine 7006850" ns9:spid="_x0000_s1212" style="position:absolute;left:1412;top:16862;width:55720;height:87;visibility:visible;mso-wrap-style:square;v-text-anchor:middle" ns9:gfxdata="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" fillcolor="#d2d2d2" stroked="f" strokeweight="1pt">
+                  <ns8:textbox inset="1.2069mm,0,1.2069mm,0"/>
+                </ns8:rect>
+                <ns8:rect id="dgvOrderItemsHLine 7006987" ns9:spid="_x0000_s1213" style="position:absolute;left:1412;top:19073;width:55720;height:87;visibility:visible;mso-wrap-style:square;v-text-anchor:middle" ns9:gfxdata="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" fillcolor="#d2d2d2" stroked="f" strokeweight="1pt">
+                  <ns8:textbox inset="1.2069mm,0,1.2069mm,0"/>
+                </ns8:rect>
+                <ns8:rect id="dgvOrderItemsHLine 7007124" ns9:spid="_x0000_s1214" style="position:absolute;left:1412;top:21283;width:55720;height:87;visibility:visible;mso-wrap-style:square;v-text-anchor:middle" ns9:gfxdata="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" fillcolor="#d2d2d2" stroked="f" strokeweight="1pt">
+                  <ns8:textbox inset="1.2069mm,0,1.2069mm,0"/>
+                </ns8:rect>
+                <ns8:rect id="dgvOrderItemsHLine 7007261" ns9:spid="_x0000_s1215" style="position:absolute;left:1412;top:23493;width:55720;height:87;visibility:visible;mso-wrap-style:square;v-text-anchor:middle" ns9:gfxdata="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" fillcolor="#d2d2d2" stroked="f" strokeweight="1pt">
+                  <ns8:textbox inset="1.2069mm,0,1.2069mm,0"/>
+                </ns8:rect>
+                <ns8:rect id="dgvOrderItemsHLine 7007398" ns9:spid="_x0000_s1216" style="position:absolute;left:1412;top:25704;width:55720;height:87;visibility:visible;mso-wrap-style:square;v-text-anchor:middle" ns9:gfxdata="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" fillcolor="#d2d2d2" stroked="f" strokeweight="1pt">
+                  <ns8:textbox inset="1.2069mm,0,1.2069mm,0"/>
+                </ns8:rect>
+                <ns8:rect id="dgvOrderItemsHLine 7007535" ns9:spid="_x0000_s1217" style="position:absolute;left:1412;top:27914;width:55720;height:87;visibility:visible;mso-wrap-style:square;v-text-anchor:middle" ns9:gfxdata="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" fillcolor="#d2d2d2" stroked="f" strokeweight="1pt">
+                  <ns8:textbox inset="1.2069mm,0,1.2069mm,0"/>
+                </ns8:rect>
+                <ns8:rect id="Button 7007672" ns9:spid="_x0000_s1218" style="position:absolute;left:1303;top:35192;width:11405;height:2824;visibility:visible;mso-wrap-style:square;v-text-anchor:middle" ns9:gfxdata="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" fillcolor="#f0f0f0" strokecolor="#b4b4b4" strokeweight=".5pt">
+                  <ns8:textbox inset=".60344mm,0,.60344mm,0">
+                    <w:txbxContent>
+                      <w:p ns2:paraId="2A06AABE" ns2:textId="77777777">
+                        <w:pPr>
+                          <w:jc w:val="center"/>
+                          <w:rPr>
+                            <w:color w:val="000000"/>
+                            <w:sz w:val="17"/>
+                            <w:szCs w:val="17"/>
+                          </w:rPr>
+                        </w:pPr>
+                        <w:r>
+                          <w:rPr>
+                            <w:color w:val="000000"/>
+                            <w:sz w:val="17"/>
+                            <w:szCs w:val="17"/>
+                          </w:rPr>
+                          <w:t>Remove Selected</w:t>
+                        </w:r>
+                      </w:p>
+                    </w:txbxContent>
+                  </ns8:textbox>
+                </ns8:rect>
+                <ns8:rect id="Label 7007809" ns9:spid="_x0000_s1219" style="position:absolute;left:14663;top:35626;width:26068;height:1684;visibility:visible;mso-wrap-style:square;v-text-anchor:middle" ns9:gfxdata="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" filled="f" stroked="f" strokeweight="1pt">
+                  <ns8:textbox inset="0,0,0,0">
+                    <w:txbxContent>
+                      <w:p ns2:paraId="56D330BD" ns2:textId="77777777">
+                        <w:pPr>
+                          <w:rPr>
+                            <w:color w:val="808080"/>
+                            <w:sz w:val="17"/>
+                            <w:szCs w:val="17"/>
+                          </w:rPr>
+                        </w:pPr>
+                        <w:r>
+                          <w:rPr>
+                            <w:color w:val="808080"/>
+                            <w:sz w:val="17"/>
+                            <w:szCs w:val="17"/>
+                          </w:rPr>
+                          <w:t>6 line(s), 15 item(s) to hand over</w:t>
+                        </w:r>
+                      </w:p>
+                    </w:txbxContent>
+                  </ns8:textbox>
+                </ns8:rect>
+                <ns8:rect id="Label 7007946" ns9:spid="_x0000_s1220" style="position:absolute;left:39102;top:34974;width:17379;height:2357;visibility:visible;mso-wrap-style:square;v-text-anchor:middle" ns9:gfxdata="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" filled="f" stroked="f" strokeweight="1pt">
+                  <ns8:textbox inset="0,0,0,0">
+                    <w:txbxContent>
+                      <w:p ns2:paraId="7E9B0C9D" ns2:textId="77777777">
+                        <w:pPr>
+                          <w:jc w:val="right"/>
+                          <w:rPr>
+                            <w:b/>
+                            <w:bCs/>
+                            <w:color w:val="000000"/>
+                          </w:rPr>
+                        </w:pPr>
+                        <w:r>
+                          <w:rPr>
+                            <w:b/>
+                            <w:bCs/>
+                            <w:color w:val="000000"/>
+                          </w:rPr>
+                          <w:t>Total:  £52.85</w:t>
+                        </w:r>
+                      </w:p>
+                    </w:txbxContent>
+                  </ns8:textbox>
+                </ns8:rect>
+                <ns8:rect id="Button 7008083" ns9:spid="_x0000_s1221" style="position:absolute;left:47791;top:38667;width:9450;height:2824;visibility:visible;mso-wrap-style:square;v-text-anchor:middle" ns9:gfxdata="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" fillcolor="#f0f0f0" strokecolor="#b4b4b4" strokeweight=".5pt">
+                  <ns8:textbox inset=".60344mm,0,.60344mm,0">
+                    <w:txbxContent>
+                      <w:p ns2:paraId="35BB7B64" ns2:textId="77777777">
+                        <w:pPr>
+                          <w:jc w:val="center"/>
+                          <w:rPr>
+                            <w:color w:val="000000"/>
+                            <w:sz w:val="19"/>
+                            <w:szCs w:val="19"/>
+                          </w:rPr>
+                        </w:pPr>
+                        <w:r>
+                          <w:rPr>
+                            <w:color w:val="000000"/>
+                            <w:sz w:val="19"/>
+                            <w:szCs w:val="19"/>
+                          </w:rPr>
+                          <w:t>Close</w:t>
+                        </w:r>
+                      </w:p>
+                    </w:txbxContent>
+                  </ns8:textbox>
+                </ns8:rect>
+                <ns8:rect id="Label 7008220" ns9:spid="_x0000_s1222" style="position:absolute;left:1303;top:40840;width:24982;height:1515;visibility:visible;mso-wrap-style:square;v-text-anchor:middle" ns9:gfxdata="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" filled="f" stroked="f" strokeweight="1pt">
+                  <ns8:textbox inset="0,0,0,0">
+                    <w:txbxContent>
+                      <w:p ns2:paraId="761EA6F8" ns2:textId="77777777">
+                        <w:pPr>
+                          <w:rPr>
+                            <w:color w:val="808080"/>
+                            <w:sz w:val="15"/>
+                            <w:szCs w:val="15"/>
+                          </w:rPr>
+                        </w:pPr>
+                        <w:r>
+                          <w:rPr>
+                            <w:color w:val="808080"/>
+                            <w:sz w:val="15"/>
+                            <w:szCs w:val="15"/>
+                          </w:rPr>
+                          <w:t>Filmtopia Cinema Management System  v1.0</w:t>
+                        </w:r>
+                      </w:p>
+                    </w:txbxContent>
+                  </ns8:textbox>
+                </ns8:rect>
+                <ns10:anchorlock/>
+              </ns8:group>
+            </w:pict>
+          </ns1:Fallback>
+        </ns1:AlternateContent>
+      </w:r>
+    </w:p>
+    <w:p ns2:paraId="021916F1" ns2:textId="77777777"/>
     <w:sectPr>
       <w:headerReference w:type="even" ns11:id="rId7"/>
       <w:headerReference w:type="default" ns11:id="rId8"/>

</xml_diff>

<commit_message>
added leaving kiosk mode (objective 38)
</commit_message>
<xml_diff>
--- a/Post-Prototype Refinement of Design.docx
+++ b/Post-Prototype Refinement of Design.docx
@@ -22592,6 +22592,1227 @@
       </w:r>
     </w:p>
     <w:p ns2:paraId="53F8B623" ns2:textId="77777777"/>
+    <w:p ns2:paraId="07704E4F" ns2:textId="77777777">
+      <w:pPr>
+        <w:pStyle w:val="Heading3"/>
+        <w:rPr>
+          <w:rFonts w:ascii="Aptos Display" w:eastAsia="Aptos Display" w:hAnsi="Aptos Display" w:cs="Aptos Display"/>
+          <w:b/>
+          <w:bCs/>
+          <w:color w:val="000000" w:themeColor="text1"/>
+        </w:rPr>
+      </w:pPr>
+      <w:r>
+        <w:rPr>
+          <w:rFonts w:ascii="Aptos Display" w:eastAsia="Aptos Display" w:hAnsi="Aptos Display" w:cs="Aptos Display"/>
+          <w:b/>
+          <w:bCs/>
+          <w:color w:val="000000" w:themeColor="text1"/>
+        </w:rPr>
+        <w:t>Leaving Kiosk Mode (Objective 38)</w:t>
+      </w:r>
+    </w:p>
+    <w:p ns2:paraId="7A78EE42" ns2:textId="77777777">
+      <w:pPr>
+        <w:spacing w:after="160" w:line="276" w:lineRule="auto"/>
+      </w:pPr>
+      <w:r>
+        <w:rPr>
+          <w:rFonts w:ascii="Aptos" w:eastAsia="Aptos" w:hAnsi="Aptos" w:cs="Aptos"/>
+        </w:rPr>
+        <w:t>In my first design the staff exit was a simple confirmation box, which meant a curious customer could tap through it and land in a fully logged in staff account. My teacher spotted this immediately when I demonstrated it. The refined design asks for the password of the account that put the machine into kiosk mode before it will close, and a failed attempt is written to the audit log as a security event. It is a small change to the interface and a large one to how much the system can be trusted unattended in a foyer.</w:t>
+      </w:r>
+    </w:p>
+    <w:p ns2:paraId="0C5957B6" ns2:textId="77777777">
+      <w:pPr>
+        <w:keepNext/>
+        <w:pBdr>
+          <w:top w:val="single" w:sz="6" w:space="6" w:color="A02B93"/>
+          <w:left w:val="single" w:sz="6" w:space="0" w:color="A02B93"/>
+          <w:bottom w:val="single" w:sz="6" w:space="6" w:color="A02B93"/>
+          <w:right w:val="single" w:sz="6" w:space="0" w:color="A02B93"/>
+        </w:pBdr>
+        <w:shd w:val="clear" w:color="auto" w:fill="F7E9F3"/>
+        <w:spacing w:before="120" w:after="200"/>
+        <w:rPr>
+          <w:rFonts w:ascii="Aptos" w:eastAsia="Aptos" w:hAnsi="Aptos" w:cs="Aptos"/>
+          <w:b/>
+          <w:bCs/>
+          <w:color w:val="A02B93"/>
+          <w:sz w:val="22"/>
+          <w:szCs w:val="22"/>
+        </w:rPr>
+      </w:pPr>
+      <w:r>
+        <w:rPr>
+          <w:rFonts w:ascii="Aptos" w:eastAsia="Aptos" w:hAnsi="Aptos" w:cs="Aptos"/>
+          <w:b/>
+          <w:bCs/>
+          <w:color w:val="A02B93"/>
+          <w:sz w:val="22"/>
+          <w:szCs w:val="22"/>
+        </w:rPr>
+        <w:lastRenderedPageBreak/>
+        <w:t>Staff Exit from Kiosk Mode (frmKiosk)</w:t>
+      </w:r>
+    </w:p>
+    <w:p ns2:paraId="5A868CCD" ns2:textId="77777777">
+      <w:pPr>
+        <w:pBdr>
+          <w:top w:val="single" w:sz="6" w:space="6" w:color="A02B93"/>
+          <w:left w:val="single" w:sz="6" w:space="0" w:color="A02B93"/>
+          <w:bottom w:val="single" w:sz="6" w:space="6" w:color="A02B93"/>
+          <w:right w:val="single" w:sz="6" w:space="0" w:color="A02B93"/>
+        </w:pBdr>
+        <w:shd w:val="clear" w:color="auto" w:fill="F7E9F3"/>
+        <w:spacing w:before="120" w:after="200"/>
+      </w:pPr>
+      <w:r>
+        <ns1:AlternateContent>
+          <ns1:Choice Requires="wpc">
+            <w:drawing>
+              <ns3:inline distT="0" distB="0" distL="0" distR="0" ns4:anchorId="2594A5E5" ns4:editId="52AD17D5">
+                <ns3:extent cx="5832764" cy="2916382"/>
+                <ns3:effectExtent l="0" t="0" r="0" b="0"/>
+                <ns3:docPr id="824706923" name="Staff Exit from Kiosk Mode (frmKiosk)"/>
+                <ns3:cNvGraphicFramePr/>
+                <ns5:graphic>
+                  <ns5:graphicData uri="http://schemas.microsoft.com/office/word/2010/wordprocessingCanvas">
+                    <ns6:wpc>
+                      <ns6:bg>
+                        <ns5:solidFill>
+                          <ns5:prstClr val="white"/>
+                        </ns5:solidFill>
+                      </ns6:bg>
+                      <ns6:whole/>
+                      <ns7:wsp>
+                        <ns7:cNvPr id="924168506" name="Window 7000137"/>
+                        <ns7:cNvSpPr/>
+                        <ns7:spPr>
+                          <ns5:xfrm>
+                            <ns5:off x="0" y="0"/>
+                            <ns5:ext cx="5832764" cy="2916382"/>
+                          </ns5:xfrm>
+                          <ns5:prstGeom prst="rect">
+                            <ns5:avLst/>
+                          </ns5:prstGeom>
+                          <ns5:solidFill>
+                            <ns5:srgbClr val="F0F0F0"/>
+                          </ns5:solidFill>
+                          <ns5:ln>
+                            <ns5:noFill/>
+                          </ns5:ln>
+                        </ns7:spPr>
+                        <ns7:style>
+                          <ns5:lnRef idx="2">
+                            <ns5:schemeClr val="dk1"/>
+                          </ns5:lnRef>
+                          <ns5:fillRef idx="0">
+                            <ns5:schemeClr val="lt1"/>
+                          </ns5:fillRef>
+                          <ns5:effectRef idx="0">
+                            <ns5:schemeClr val="dk1"/>
+                          </ns5:effectRef>
+                          <ns5:fontRef idx="minor">
+                            <ns5:schemeClr val="dk1"/>
+                          </ns5:fontRef>
+                        </ns7:style>
+                        <ns7:bodyPr rot="0" spcFirstLastPara="0" vertOverflow="overflow" horzOverflow="overflow" vert="horz" wrap="square" lIns="38885" tIns="0" rIns="38885" bIns="0" numCol="1" spcCol="0" rtlCol="0" fromWordArt="0" anchor="ctr" anchorCtr="0" forceAA="0" compatLnSpc="1">
+                          <ns5:noAutofit/>
+                        </ns7:bodyPr>
+                      </ns7:wsp>
+                      <ns7:wsp>
+                        <ns7:cNvPr id="1968039129" name="pnlHeader 7000274"/>
+                        <ns7:cNvSpPr/>
+                        <ns7:spPr>
+                          <ns5:xfrm>
+                            <ns5:off x="0" y="0"/>
+                            <ns5:ext cx="5832764" cy="388851"/>
+                          </ns5:xfrm>
+                          <ns5:prstGeom prst="rect">
+                            <ns5:avLst/>
+                          </ns5:prstGeom>
+                          <ns5:solidFill>
+                            <ns5:srgbClr val="400040"/>
+                          </ns5:solidFill>
+                          <ns5:ln>
+                            <ns5:noFill/>
+                          </ns5:ln>
+                        </ns7:spPr>
+                        <ns7:style>
+                          <ns5:lnRef idx="2">
+                            <ns5:schemeClr val="dk1"/>
+                          </ns5:lnRef>
+                          <ns5:fillRef idx="0">
+                            <ns5:schemeClr val="lt1"/>
+                          </ns5:fillRef>
+                          <ns5:effectRef idx="0">
+                            <ns5:schemeClr val="dk1"/>
+                          </ns5:effectRef>
+                          <ns5:fontRef idx="minor">
+                            <ns5:schemeClr val="dk1"/>
+                          </ns5:fontRef>
+                        </ns7:style>
+                        <ns7:bodyPr rot="0" spcFirstLastPara="0" vertOverflow="overflow" horzOverflow="overflow" vert="horz" wrap="square" lIns="38885" tIns="0" rIns="38885" bIns="0" numCol="1" spcCol="0" rtlCol="0" fromWordArt="0" anchor="ctr" anchorCtr="0" forceAA="0" compatLnSpc="1">
+                          <ns5:noAutofit/>
+                        </ns7:bodyPr>
+                      </ns7:wsp>
+                      <ns7:wsp>
+                        <ns7:cNvPr id="1853029616" name="Label 7000411"/>
+                        <ns7:cNvSpPr/>
+                        <ns7:spPr>
+                          <ns5:xfrm>
+                            <ns5:off x="116655" y="58328"/>
+                            <ns5:ext cx="1749829" cy="256156"/>
+                          </ns5:xfrm>
+                          <ns5:prstGeom prst="rect">
+                            <ns5:avLst/>
+                          </ns5:prstGeom>
+                          <ns5:noFill/>
+                          <ns5:ln>
+                            <ns5:noFill/>
+                          </ns5:ln>
+                        </ns7:spPr>
+                        <ns7:style>
+                          <ns5:lnRef idx="2">
+                            <ns5:schemeClr val="dk1"/>
+                          </ns5:lnRef>
+                          <ns5:fillRef idx="0">
+                            <ns5:schemeClr val="lt1"/>
+                          </ns5:fillRef>
+                          <ns5:effectRef idx="0">
+                            <ns5:schemeClr val="dk1"/>
+                          </ns5:effectRef>
+                          <ns5:fontRef idx="minor">
+                            <ns5:schemeClr val="dk1"/>
+                          </ns5:fontRef>
+                        </ns7:style>
+                        <ns7:txbx>
+                          <w:txbxContent>
+                            <w:p ns2:paraId="3D8A5817" ns2:textId="77777777">
+                              <w:pPr>
+                                <w:rPr>
+                                  <w:b/>
+                                  <w:bCs/>
+                                  <w:color w:val="FFFFFF"/>
+                                  <w:sz w:val="26"/>
+                                  <w:szCs w:val="26"/>
+                                </w:rPr>
+                              </w:pPr>
+                              <w:r>
+                                <w:rPr>
+                                  <w:b/>
+                                  <w:bCs/>
+                                  <w:color w:val="FFFFFF"/>
+                                  <w:sz w:val="26"/>
+                                  <w:szCs w:val="26"/>
+                                </w:rPr>
+                                <w:t>Filmtopia</w:t>
+                              </w:r>
+                            </w:p>
+                          </w:txbxContent>
+                        </ns7:txbx>
+                        <ns7:bodyPr rot="0" spcFirstLastPara="0" vertOverflow="overflow" horzOverflow="overflow" vert="horz" wrap="square" lIns="0" tIns="0" rIns="0" bIns="0" numCol="1" spcCol="0" rtlCol="0" fromWordArt="0" anchor="ctr" anchorCtr="0" forceAA="0" compatLnSpc="1">
+                          <ns5:noAutofit/>
+                        </ns7:bodyPr>
+                      </ns7:wsp>
+                      <ns7:wsp>
+                        <ns7:cNvPr id="1044957771" name="Label 7000548"/>
+                        <ns7:cNvSpPr/>
+                        <ns7:spPr>
+                          <ns5:xfrm>
+                            <ns5:off x="116655" y="233311"/>
+                            <ns5:ext cx="1944255" cy="150680"/>
+                          </ns5:xfrm>
+                          <ns5:prstGeom prst="rect">
+                            <ns5:avLst/>
+                          </ns5:prstGeom>
+                          <ns5:noFill/>
+                          <ns5:ln>
+                            <ns5:noFill/>
+                          </ns5:ln>
+                        </ns7:spPr>
+                        <ns7:style>
+                          <ns5:lnRef idx="2">
+                            <ns5:schemeClr val="dk1"/>
+                          </ns5:lnRef>
+                          <ns5:fillRef idx="0">
+                            <ns5:schemeClr val="lt1"/>
+                          </ns5:fillRef>
+                          <ns5:effectRef idx="0">
+                            <ns5:schemeClr val="dk1"/>
+                          </ns5:effectRef>
+                          <ns5:fontRef idx="minor">
+                            <ns5:schemeClr val="dk1"/>
+                          </ns5:fontRef>
+                        </ns7:style>
+                        <ns7:txbx>
+                          <w:txbxContent>
+                            <w:p ns2:paraId="7896FB8E" ns2:textId="77777777">
+                              <w:pPr>
+                                <w:rPr>
+                                  <w:color w:val="D79ED7"/>
+                                  <w:sz w:val="15"/>
+                                  <w:szCs w:val="15"/>
+                                </w:rPr>
+                              </w:pPr>
+                              <w:r>
+                                <w:rPr>
+                                  <w:color w:val="D79ED7"/>
+                                  <w:sz w:val="15"/>
+                                  <w:szCs w:val="15"/>
+                                </w:rPr>
+                                <w:t>Self service</w:t>
+                              </w:r>
+                            </w:p>
+                          </w:txbxContent>
+                        </ns7:txbx>
+                        <ns7:bodyPr rot="0" spcFirstLastPara="0" vertOverflow="overflow" horzOverflow="overflow" vert="horz" wrap="square" lIns="0" tIns="0" rIns="0" bIns="0" numCol="1" spcCol="0" rtlCol="0" fromWordArt="0" anchor="ctr" anchorCtr="0" forceAA="0" compatLnSpc="1">
+                          <ns5:noAutofit/>
+                        </ns7:bodyPr>
+                      </ns7:wsp>
+                      <ns7:wsp>
+                        <ns7:cNvPr id="461847727" name="btnExitKiosk 7000685"/>
+                        <ns7:cNvSpPr/>
+                        <ns7:spPr>
+                          <ns5:xfrm>
+                            <ns5:off x="5132832" y="97213"/>
+                            <ns5:ext cx="583276" cy="194425"/>
+                          </ns5:xfrm>
+                          <ns5:prstGeom prst="rect">
+                            <ns5:avLst/>
+                          </ns5:prstGeom>
+                          <ns5:noFill/>
+                          <ns5:ln w="6350">
+                            <ns5:solidFill>
+                              <ns5:srgbClr val="8E5A8E"/>
+                            </ns5:solidFill>
+                          </ns5:ln>
+                        </ns7:spPr>
+                        <ns7:style>
+                          <ns5:lnRef idx="2">
+                            <ns5:schemeClr val="dk1"/>
+                          </ns5:lnRef>
+                          <ns5:fillRef idx="0">
+                            <ns5:schemeClr val="lt1"/>
+                          </ns5:fillRef>
+                          <ns5:effectRef idx="0">
+                            <ns5:schemeClr val="dk1"/>
+                          </ns5:effectRef>
+                          <ns5:fontRef idx="minor">
+                            <ns5:schemeClr val="dk1"/>
+                          </ns5:fontRef>
+                        </ns7:style>
+                        <ns7:txbx>
+                          <w:txbxContent>
+                            <w:p ns2:paraId="78AF6D5E" ns2:textId="77777777">
+                              <w:pPr>
+                                <w:jc w:val="center"/>
+                                <w:rPr>
+                                  <w:color w:val="D79ED7"/>
+                                  <w:sz w:val="15"/>
+                                  <w:szCs w:val="15"/>
+                                </w:rPr>
+                              </w:pPr>
+                              <w:r>
+                                <w:rPr>
+                                  <w:color w:val="D79ED7"/>
+                                  <w:sz w:val="15"/>
+                                  <w:szCs w:val="15"/>
+                                </w:rPr>
+                                <w:t>Staff exit</w:t>
+                              </w:r>
+                            </w:p>
+                          </w:txbxContent>
+                        </ns7:txbx>
+                        <ns7:bodyPr rot="0" spcFirstLastPara="0" vertOverflow="overflow" horzOverflow="overflow" vert="horz" wrap="square" lIns="19443" tIns="0" rIns="19443" bIns="0" numCol="1" spcCol="0" rtlCol="0" fromWordArt="0" anchor="ctr" anchorCtr="0" forceAA="0" compatLnSpc="1">
+                          <ns5:noAutofit/>
+                        </ns7:bodyPr>
+                      </ns7:wsp>
+                      <ns7:wsp>
+                        <ns7:cNvPr id="734766245" name="Label 7000822"/>
+                        <ns7:cNvSpPr/>
+                        <ns7:spPr>
+                          <ns5:xfrm>
+                            <ns5:off x="194425" y="563834"/>
+                            <ns5:ext cx="3110807" cy="271224"/>
+                          </ns5:xfrm>
+                          <ns5:prstGeom prst="rect">
+                            <ns5:avLst/>
+                          </ns5:prstGeom>
+                          <ns5:noFill/>
+                          <ns5:ln>
+                            <ns5:noFill/>
+                          </ns5:ln>
+                        </ns7:spPr>
+                        <ns7:style>
+                          <ns5:lnRef idx="2">
+                            <ns5:schemeClr val="dk1"/>
+                          </ns5:lnRef>
+                          <ns5:fillRef idx="0">
+                            <ns5:schemeClr val="lt1"/>
+                          </ns5:fillRef>
+                          <ns5:effectRef idx="0">
+                            <ns5:schemeClr val="dk1"/>
+                          </ns5:effectRef>
+                          <ns5:fontRef idx="minor">
+                            <ns5:schemeClr val="dk1"/>
+                          </ns5:fontRef>
+                        </ns7:style>
+                        <ns7:txbx>
+                          <w:txbxContent>
+                            <w:p ns2:paraId="0FD593C1" ns2:textId="77777777">
+                              <w:pPr>
+                                <w:rPr>
+                                  <w:b/>
+                                  <w:bCs/>
+                                  <w:color w:val="BFBFBF"/>
+                                  <w:sz w:val="28"/>
+                                  <w:szCs w:val="28"/>
+                                </w:rPr>
+                              </w:pPr>
+                              <w:r>
+                                <w:rPr>
+                                  <w:b/>
+                                  <w:bCs/>
+                                  <w:color w:val="BFBFBF"/>
+                                  <w:sz w:val="28"/>
+                                  <w:szCs w:val="28"/>
+                                </w:rPr>
+                                <w:t>Buy your tickets here</w:t>
+                              </w:r>
+                            </w:p>
+                          </w:txbxContent>
+                        </ns7:txbx>
+                        <ns7:bodyPr rot="0" spcFirstLastPara="0" vertOverflow="overflow" horzOverflow="overflow" vert="horz" wrap="square" lIns="0" tIns="0" rIns="0" bIns="0" numCol="1" spcCol="0" rtlCol="0" fromWordArt="0" anchor="ctr" anchorCtr="0" forceAA="0" compatLnSpc="1">
+                          <ns5:noAutofit/>
+                        </ns7:bodyPr>
+                      </ns7:wsp>
+                      <ns7:wsp>
+                        <ns7:cNvPr id="582792852" name="Label 7000959"/>
+                        <ns7:cNvSpPr/>
+                        <ns7:spPr>
+                          <ns5:xfrm>
+                            <ns5:off x="194425" y="816587"/>
+                            <ns5:ext cx="3305233" cy="180816"/>
+                          </ns5:xfrm>
+                          <ns5:prstGeom prst="rect">
+                            <ns5:avLst/>
+                          </ns5:prstGeom>
+                          <ns5:noFill/>
+                          <ns5:ln>
+                            <ns5:noFill/>
+                          </ns5:ln>
+                        </ns7:spPr>
+                        <ns7:style>
+                          <ns5:lnRef idx="2">
+                            <ns5:schemeClr val="dk1"/>
+                          </ns5:lnRef>
+                          <ns5:fillRef idx="0">
+                            <ns5:schemeClr val="lt1"/>
+                          </ns5:fillRef>
+                          <ns5:effectRef idx="0">
+                            <ns5:schemeClr val="dk1"/>
+                          </ns5:effectRef>
+                          <ns5:fontRef idx="minor">
+                            <ns5:schemeClr val="dk1"/>
+                          </ns5:fontRef>
+                        </ns7:style>
+                        <ns7:txbx>
+                          <w:txbxContent>
+                            <w:p ns2:paraId="72F37F6B" ns2:textId="77777777">
+                              <w:pPr>
+                                <w:rPr>
+                                  <w:color w:val="CFCFCF"/>
+                                  <w:sz w:val="18"/>
+                                  <w:szCs w:val="18"/>
+                                </w:rPr>
+                              </w:pPr>
+                              <w:r>
+                                <w:rPr>
+                                  <w:color w:val="CFCFCF"/>
+                                  <w:sz w:val="18"/>
+                                  <w:szCs w:val="18"/>
+                                </w:rPr>
+                                <w:t>Pick a film, pick your seats, pay at the machine</w:t>
+                              </w:r>
+                            </w:p>
+                          </w:txbxContent>
+                        </ns7:txbx>
+                        <ns7:bodyPr rot="0" spcFirstLastPara="0" vertOverflow="overflow" horzOverflow="overflow" vert="horz" wrap="square" lIns="0" tIns="0" rIns="0" bIns="0" numCol="1" spcCol="0" rtlCol="0" fromWordArt="0" anchor="ctr" anchorCtr="0" forceAA="0" compatLnSpc="1">
+                          <ns5:noAutofit/>
+                        </ns7:bodyPr>
+                      </ns7:wsp>
+                      <ns7:wsp>
+                        <ns7:cNvPr id="1294568594" name="pnlExit 7001096"/>
+                        <ns7:cNvSpPr/>
+                        <ns7:spPr>
+                          <ns5:xfrm>
+                            <ns5:off x="1069340" y="1030455"/>
+                            <ns5:ext cx="3694084" cy="1477634"/>
+                          </ns5:xfrm>
+                          <ns5:prstGeom prst="rect">
+                            <ns5:avLst/>
+                          </ns5:prstGeom>
+                          <ns5:solidFill>
+                            <ns5:srgbClr val="FFFFFF"/>
+                          </ns5:solidFill>
+                          <ns5:ln w="12700">
+                            <ns5:solidFill>
+                              <ns5:srgbClr val="400040"/>
+                            </ns5:solidFill>
+                          </ns5:ln>
+                        </ns7:spPr>
+                        <ns7:style>
+                          <ns5:lnRef idx="2">
+                            <ns5:schemeClr val="dk1"/>
+                          </ns5:lnRef>
+                          <ns5:fillRef idx="0">
+                            <ns5:schemeClr val="lt1"/>
+                          </ns5:fillRef>
+                          <ns5:effectRef idx="0">
+                            <ns5:schemeClr val="dk1"/>
+                          </ns5:effectRef>
+                          <ns5:fontRef idx="minor">
+                            <ns5:schemeClr val="dk1"/>
+                          </ns5:fontRef>
+                        </ns7:style>
+                        <ns7:bodyPr rot="0" spcFirstLastPara="0" vertOverflow="overflow" horzOverflow="overflow" vert="horz" wrap="square" lIns="38885" tIns="0" rIns="38885" bIns="0" numCol="1" spcCol="0" rtlCol="0" fromWordArt="0" anchor="ctr" anchorCtr="0" forceAA="0" compatLnSpc="1">
+                          <ns5:noAutofit/>
+                        </ns7:bodyPr>
+                      </ns7:wsp>
+                      <ns7:wsp>
+                        <ns7:cNvPr id="705771087" name="Label 7001233"/>
+                        <ns7:cNvSpPr/>
+                        <ns7:spPr>
+                          <ns5:xfrm>
+                            <ns5:off x="1263766" y="1185995"/>
+                            <ns5:ext cx="2430318" cy="256156"/>
+                          </ns5:xfrm>
+                          <ns5:prstGeom prst="rect">
+                            <ns5:avLst/>
+                          </ns5:prstGeom>
+                          <ns5:noFill/>
+                          <ns5:ln>
+                            <ns5:noFill/>
+                          </ns5:ln>
+                        </ns7:spPr>
+                        <ns7:style>
+                          <ns5:lnRef idx="2">
+                            <ns5:schemeClr val="dk1"/>
+                          </ns5:lnRef>
+                          <ns5:fillRef idx="0">
+                            <ns5:schemeClr val="lt1"/>
+                          </ns5:fillRef>
+                          <ns5:effectRef idx="0">
+                            <ns5:schemeClr val="dk1"/>
+                          </ns5:effectRef>
+                          <ns5:fontRef idx="minor">
+                            <ns5:schemeClr val="dk1"/>
+                          </ns5:fontRef>
+                        </ns7:style>
+                        <ns7:txbx>
+                          <w:txbxContent>
+                            <w:p ns2:paraId="07F28889" ns2:textId="77777777">
+                              <w:pPr>
+                                <w:rPr>
+                                  <w:b/>
+                                  <w:bCs/>
+                                  <w:color w:val="000000"/>
+                                  <w:sz w:val="26"/>
+                                  <w:szCs w:val="26"/>
+                                </w:rPr>
+                              </w:pPr>
+                              <w:r>
+                                <w:rPr>
+                                  <w:b/>
+                                  <w:bCs/>
+                                  <w:color w:val="000000"/>
+                                  <w:sz w:val="26"/>
+                                  <w:szCs w:val="26"/>
+                                </w:rPr>
+                                <w:t>Staff exit</w:t>
+                              </w:r>
+                            </w:p>
+                          </w:txbxContent>
+                        </ns7:txbx>
+                        <ns7:bodyPr rot="0" spcFirstLastPara="0" vertOverflow="overflow" horzOverflow="overflow" vert="horz" wrap="square" lIns="0" tIns="0" rIns="0" bIns="0" numCol="1" spcCol="0" rtlCol="0" fromWordArt="0" anchor="ctr" anchorCtr="0" forceAA="0" compatLnSpc="1">
+                          <ns5:noAutofit/>
+                        </ns7:bodyPr>
+                      </ns7:wsp>
+                      <ns7:wsp>
+                        <ns7:cNvPr id="259665849" name="Label 7001370"/>
+                        <ns7:cNvSpPr/>
+                        <ns7:spPr>
+                          <ns5:xfrm>
+                            <ns5:off x="1263766" y="1458191"/>
+                            <ns5:ext cx="3305233" cy="180816"/>
+                          </ns5:xfrm>
+                          <ns5:prstGeom prst="rect">
+                            <ns5:avLst/>
+                          </ns5:prstGeom>
+                          <ns5:noFill/>
+                          <ns5:ln>
+                            <ns5:noFill/>
+                          </ns5:ln>
+                        </ns7:spPr>
+                        <ns7:style>
+                          <ns5:lnRef idx="2">
+                            <ns5:schemeClr val="dk1"/>
+                          </ns5:lnRef>
+                          <ns5:fillRef idx="0">
+                            <ns5:schemeClr val="lt1"/>
+                          </ns5:fillRef>
+                          <ns5:effectRef idx="0">
+                            <ns5:schemeClr val="dk1"/>
+                          </ns5:effectRef>
+                          <ns5:fontRef idx="minor">
+                            <ns5:schemeClr val="dk1"/>
+                          </ns5:fontRef>
+                        </ns7:style>
+                        <ns7:txbx>
+                          <w:txbxContent>
+                            <w:p ns2:paraId="2A8E5BBB" ns2:textId="77777777">
+                              <w:pPr>
+                                <w:rPr>
+                                  <w:color w:val="000000"/>
+                                  <w:sz w:val="18"/>
+                                  <w:szCs w:val="18"/>
+                                </w:rPr>
+                              </w:pPr>
+                              <w:r>
+                                <w:rPr>
+                                  <w:color w:val="000000"/>
+                                  <w:sz w:val="18"/>
+                                  <w:szCs w:val="18"/>
+                                </w:rPr>
+                                <w:t>Enter your password to close the kiosk and go back to the</w:t>
+                              </w:r>
+                            </w:p>
+                          </w:txbxContent>
+                        </ns7:txbx>
+                        <ns7:bodyPr rot="0" spcFirstLastPara="0" vertOverflow="overflow" horzOverflow="overflow" vert="horz" wrap="square" lIns="0" tIns="0" rIns="0" bIns="0" numCol="1" spcCol="0" rtlCol="0" fromWordArt="0" anchor="ctr" anchorCtr="0" forceAA="0" compatLnSpc="1">
+                          <ns5:noAutofit/>
+                        </ns7:bodyPr>
+                      </ns7:wsp>
+                      <ns7:wsp>
+                        <ns7:cNvPr id="1607611395" name="Label 7001507"/>
+                        <ns7:cNvSpPr/>
+                        <ns7:spPr>
+                          <ns5:xfrm>
+                            <ns5:off x="1263766" y="1613731"/>
+                            <ns5:ext cx="3305233" cy="180816"/>
+                          </ns5:xfrm>
+                          <ns5:prstGeom prst="rect">
+                            <ns5:avLst/>
+                          </ns5:prstGeom>
+                          <ns5:noFill/>
+                          <ns5:ln>
+                            <ns5:noFill/>
+                          </ns5:ln>
+                        </ns7:spPr>
+                        <ns7:style>
+                          <ns5:lnRef idx="2">
+                            <ns5:schemeClr val="dk1"/>
+                          </ns5:lnRef>
+                          <ns5:fillRef idx="0">
+                            <ns5:schemeClr val="lt1"/>
+                          </ns5:fillRef>
+                          <ns5:effectRef idx="0">
+                            <ns5:schemeClr val="dk1"/>
+                          </ns5:effectRef>
+                          <ns5:fontRef idx="minor">
+                            <ns5:schemeClr val="dk1"/>
+                          </ns5:fontRef>
+                        </ns7:style>
+                        <ns7:txbx>
+                          <w:txbxContent>
+                            <w:p ns2:paraId="726DEF76" ns2:textId="77777777">
+                              <w:pPr>
+                                <w:rPr>
+                                  <w:color w:val="000000"/>
+                                  <w:sz w:val="18"/>
+                                  <w:szCs w:val="18"/>
+                                </w:rPr>
+                              </w:pPr>
+                              <w:r>
+                                <w:rPr>
+                                  <w:color w:val="000000"/>
+                                  <w:sz w:val="18"/>
+                                  <w:szCs w:val="18"/>
+                                </w:rPr>
+                                <w:t>main menu.</w:t>
+                              </w:r>
+                            </w:p>
+                          </w:txbxContent>
+                        </ns7:txbx>
+                        <ns7:bodyPr rot="0" spcFirstLastPara="0" vertOverflow="overflow" horzOverflow="overflow" vert="horz" wrap="square" lIns="0" tIns="0" rIns="0" bIns="0" numCol="1" spcCol="0" rtlCol="0" fromWordArt="0" anchor="ctr" anchorCtr="0" forceAA="0" compatLnSpc="1">
+                          <ns5:noAutofit/>
+                        </ns7:bodyPr>
+                      </ns7:wsp>
+                      <ns7:wsp>
+                        <ns7:cNvPr id="385453909" name="TextBox 7001644"/>
+                        <ns7:cNvSpPr/>
+                        <ns7:spPr>
+                          <ns5:xfrm>
+                            <ns5:off x="1263766" y="1847042"/>
+                            <ns5:ext cx="3305233" cy="213868"/>
+                          </ns5:xfrm>
+                          <ns5:prstGeom prst="rect">
+                            <ns5:avLst/>
+                          </ns5:prstGeom>
+                          <ns5:solidFill>
+                            <ns5:srgbClr val="FFFFFF"/>
+                          </ns5:solidFill>
+                          <ns5:ln w="6350">
+                            <ns5:solidFill>
+                              <ns5:srgbClr val="B4B4B4"/>
+                            </ns5:solidFill>
+                          </ns5:ln>
+                        </ns7:spPr>
+                        <ns7:style>
+                          <ns5:lnRef idx="2">
+                            <ns5:schemeClr val="dk1"/>
+                          </ns5:lnRef>
+                          <ns5:fillRef idx="0">
+                            <ns5:schemeClr val="lt1"/>
+                          </ns5:fillRef>
+                          <ns5:effectRef idx="0">
+                            <ns5:schemeClr val="dk1"/>
+                          </ns5:effectRef>
+                          <ns5:fontRef idx="minor">
+                            <ns5:schemeClr val="dk1"/>
+                          </ns5:fontRef>
+                        </ns7:style>
+                        <ns7:txbx>
+                          <w:txbxContent>
+                            <w:p ns2:paraId="535D9C08" ns2:textId="77777777">
+                              <w:pPr>
+                                <w:rPr>
+                                  <w:color w:val="000000"/>
+                                  <w:sz w:val="18"/>
+                                  <w:szCs w:val="18"/>
+                                </w:rPr>
+                              </w:pPr>
+                              <w:r>
+                                <w:rPr>
+                                  <w:color w:val="000000"/>
+                                  <w:sz w:val="18"/>
+                                  <w:szCs w:val="18"/>
+                                </w:rPr>
+                                <w:t>●●●●●●●●</w:t>
+                              </w:r>
+                            </w:p>
+                          </w:txbxContent>
+                        </ns7:txbx>
+                        <ns7:bodyPr rot="0" spcFirstLastPara="0" vertOverflow="overflow" horzOverflow="overflow" vert="horz" wrap="square" lIns="38885" tIns="0" rIns="38885" bIns="0" numCol="1" spcCol="0" rtlCol="0" fromWordArt="0" anchor="ctr" anchorCtr="0" forceAA="0" compatLnSpc="1">
+                          <ns5:noAutofit/>
+                        </ns7:bodyPr>
+                      </ns7:wsp>
+                      <ns7:wsp>
+                        <ns7:cNvPr id="976617997" name="Button 7001781"/>
+                        <ns7:cNvSpPr/>
+                        <ns7:spPr>
+                          <ns5:xfrm>
+                            <ns5:off x="2916382" y="2177565"/>
+                            <ns5:ext cx="758259" cy="213868"/>
+                          </ns5:xfrm>
+                          <ns5:prstGeom prst="rect">
+                            <ns5:avLst/>
+                          </ns5:prstGeom>
+                          <ns5:solidFill>
+                            <ns5:srgbClr val="F0F0F0"/>
+                          </ns5:solidFill>
+                          <ns5:ln w="6350">
+                            <ns5:solidFill>
+                              <ns5:srgbClr val="B4B4B4"/>
+                            </ns5:solidFill>
+                          </ns5:ln>
+                        </ns7:spPr>
+                        <ns7:style>
+                          <ns5:lnRef idx="2">
+                            <ns5:schemeClr val="dk1"/>
+                          </ns5:lnRef>
+                          <ns5:fillRef idx="0">
+                            <ns5:schemeClr val="lt1"/>
+                          </ns5:fillRef>
+                          <ns5:effectRef idx="0">
+                            <ns5:schemeClr val="dk1"/>
+                          </ns5:effectRef>
+                          <ns5:fontRef idx="minor">
+                            <ns5:schemeClr val="dk1"/>
+                          </ns5:fontRef>
+                        </ns7:style>
+                        <ns7:txbx>
+                          <w:txbxContent>
+                            <w:p ns2:paraId="79051113" ns2:textId="77777777">
+                              <w:pPr>
+                                <w:jc w:val="center"/>
+                                <w:rPr>
+                                  <w:color w:val="000000"/>
+                                  <w:sz w:val="17"/>
+                                  <w:szCs w:val="17"/>
+                                </w:rPr>
+                              </w:pPr>
+                              <w:r>
+                                <w:rPr>
+                                  <w:color w:val="000000"/>
+                                  <w:sz w:val="17"/>
+                                  <w:szCs w:val="17"/>
+                                </w:rPr>
+                                <w:t>Cancel</w:t>
+                              </w:r>
+                            </w:p>
+                          </w:txbxContent>
+                        </ns7:txbx>
+                        <ns7:bodyPr rot="0" spcFirstLastPara="0" vertOverflow="overflow" horzOverflow="overflow" vert="horz" wrap="square" lIns="19443" tIns="0" rIns="19443" bIns="0" numCol="1" spcCol="0" rtlCol="0" fromWordArt="0" anchor="ctr" anchorCtr="0" forceAA="0" compatLnSpc="1">
+                          <ns5:noAutofit/>
+                        </ns7:bodyPr>
+                      </ns7:wsp>
+                      <ns7:wsp>
+                        <ns7:cNvPr id="819834411" name="Button 7001918"/>
+                        <ns7:cNvSpPr/>
+                        <ns7:spPr>
+                          <ns5:xfrm>
+                            <ns5:off x="3771854" y="2177565"/>
+                            <ns5:ext cx="797144" cy="213868"/>
+                          </ns5:xfrm>
+                          <ns5:prstGeom prst="rect">
+                            <ns5:avLst/>
+                          </ns5:prstGeom>
+                          <ns5:solidFill>
+                            <ns5:srgbClr val="A02B93"/>
+                          </ns5:solidFill>
+                          <ns5:ln w="6350">
+                            <ns5:solidFill>
+                              <ns5:srgbClr val="A02B93"/>
+                            </ns5:solidFill>
+                          </ns5:ln>
+                        </ns7:spPr>
+                        <ns7:style>
+                          <ns5:lnRef idx="2">
+                            <ns5:schemeClr val="dk1"/>
+                          </ns5:lnRef>
+                          <ns5:fillRef idx="0">
+                            <ns5:schemeClr val="lt1"/>
+                          </ns5:fillRef>
+                          <ns5:effectRef idx="0">
+                            <ns5:schemeClr val="dk1"/>
+                          </ns5:effectRef>
+                          <ns5:fontRef idx="minor">
+                            <ns5:schemeClr val="dk1"/>
+                          </ns5:fontRef>
+                        </ns7:style>
+                        <ns7:txbx>
+                          <w:txbxContent>
+                            <w:p ns2:paraId="398AA2D6" ns2:textId="77777777">
+                              <w:pPr>
+                                <w:jc w:val="center"/>
+                                <w:rPr>
+                                  <w:b/>
+                                  <w:bCs/>
+                                  <w:color w:val="FFFFFF"/>
+                                  <w:sz w:val="17"/>
+                                  <w:szCs w:val="17"/>
+                                </w:rPr>
+                              </w:pPr>
+                              <w:r>
+                                <w:rPr>
+                                  <w:b/>
+                                  <w:bCs/>
+                                  <w:color w:val="FFFFFF"/>
+                                  <w:sz w:val="17"/>
+                                  <w:szCs w:val="17"/>
+                                </w:rPr>
+                                <w:t>Close kiosk</w:t>
+                              </w:r>
+                            </w:p>
+                          </w:txbxContent>
+                        </ns7:txbx>
+                        <ns7:bodyPr rot="0" spcFirstLastPara="0" vertOverflow="overflow" horzOverflow="overflow" vert="horz" wrap="square" lIns="19443" tIns="0" rIns="19443" bIns="0" numCol="1" spcCol="0" rtlCol="0" fromWordArt="0" anchor="ctr" anchorCtr="0" forceAA="0" compatLnSpc="1">
+                          <ns5:noAutofit/>
+                        </ns7:bodyPr>
+                      </ns7:wsp>
+                      <ns7:wsp>
+                        <ns7:cNvPr id="1409248721" name="Label 7002055"/>
+                        <ns7:cNvSpPr/>
+                        <ns7:spPr>
+                          <ns5:xfrm>
+                            <ns5:off x="194425" y="2663629"/>
+                            <ns5:ext cx="5541126" cy="150680"/>
+                          </ns5:xfrm>
+                          <ns5:prstGeom prst="rect">
+                            <ns5:avLst/>
+                          </ns5:prstGeom>
+                          <ns5:noFill/>
+                          <ns5:ln>
+                            <ns5:noFill/>
+                          </ns5:ln>
+                        </ns7:spPr>
+                        <ns7:style>
+                          <ns5:lnRef idx="2">
+                            <ns5:schemeClr val="dk1"/>
+                          </ns5:lnRef>
+                          <ns5:fillRef idx="0">
+                            <ns5:schemeClr val="lt1"/>
+                          </ns5:fillRef>
+                          <ns5:effectRef idx="0">
+                            <ns5:schemeClr val="dk1"/>
+                          </ns5:effectRef>
+                          <ns5:fontRef idx="minor">
+                            <ns5:schemeClr val="dk1"/>
+                          </ns5:fontRef>
+                        </ns7:style>
+                        <ns7:txbx>
+                          <w:txbxContent>
+                            <w:p ns2:paraId="07F27786" ns2:textId="77777777">
+                              <w:pPr>
+                                <w:rPr>
+                                  <w:color w:val="808080"/>
+                                  <w:sz w:val="15"/>
+                                  <w:szCs w:val="15"/>
+                                </w:rPr>
+                              </w:pPr>
+                              <w:r>
+                                <w:rPr>
+                                  <w:color w:val="808080"/>
+                                  <w:sz w:val="15"/>
+                                  <w:szCs w:val="15"/>
+                                </w:rPr>
+                                <w:t>A wrong password leaves the kiosk exactly where it was and writes a Security entry to the audit log.</w:t>
+                              </w:r>
+                            </w:p>
+                          </w:txbxContent>
+                        </ns7:txbx>
+                        <ns7:bodyPr rot="0" spcFirstLastPara="0" vertOverflow="overflow" horzOverflow="overflow" vert="horz" wrap="square" lIns="0" tIns="0" rIns="0" bIns="0" numCol="1" spcCol="0" rtlCol="0" fromWordArt="0" anchor="ctr" anchorCtr="0" forceAA="0" compatLnSpc="1">
+                          <ns5:noAutofit/>
+                        </ns7:bodyPr>
+                      </ns7:wsp>
+                    </ns6:wpc>
+                  </ns5:graphicData>
+                </ns5:graphic>
+              </ns3:inline>
+            </w:drawing>
+          </ns1:Choice>
+          <ns1:Fallback>
+            <w:pict>
+              <ns8:group ns2:anchorId="2594A5E5" id="Staff Exit from Kiosk Mode (frmKiosk)" ns9:spid="_x0000_s1315" editas="canvas" style="width:459.25pt;height:229.65pt;mso-position-horizontal-relative:char;mso-position-vertical-relative:line" coordsize="58324,29159" ns9:gfxdata="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">
+                <ns8:shape id="_x0000_s1316" type="#_x0000_t75" style="position:absolute;width:58324;height:29159;visibility:visible;mso-wrap-style:square" filled="t">
+                  <ns8:fill ns9:detectmouseclick="t"/>
+                  <ns8:path ns9:connecttype="none"/>
+                </ns8:shape>
+                <ns8:rect id="Window 7000137" ns9:spid="_x0000_s1317" style="position:absolute;width:58327;height:29163;visibility:visible;mso-wrap-style:square;v-text-anchor:middle" ns9:gfxdata="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" fillcolor="#f0f0f0" stroked="f" strokeweight="1pt">
+                  <ns8:textbox inset="1.0801mm,0,1.0801mm,0"/>
+                </ns8:rect>
+                <ns8:rect id="pnlHeader 7000274" ns9:spid="_x0000_s1318" style="position:absolute;width:58327;height:3888;visibility:visible;mso-wrap-style:square;v-text-anchor:middle" ns9:gfxdata="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" fillcolor="#400040" stroked="f" strokeweight="1pt">
+                  <ns8:textbox inset="1.0801mm,0,1.0801mm,0"/>
+                </ns8:rect>
+                <ns8:rect id="Label 7000411" ns9:spid="_x0000_s1319" style="position:absolute;left:1166;top:583;width:17498;height:2561;visibility:visible;mso-wrap-style:square;v-text-anchor:middle" ns9:gfxdata="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" filled="f" stroked="f" strokeweight="1pt">
+                  <ns8:textbox inset="0,0,0,0">
+                    <w:txbxContent>
+                      <w:p ns2:paraId="3D8A5817" ns2:textId="77777777">
+                        <w:pPr>
+                          <w:rPr>
+                            <w:b/>
+                            <w:bCs/>
+                            <w:color w:val="FFFFFF"/>
+                            <w:sz w:val="26"/>
+                            <w:szCs w:val="26"/>
+                          </w:rPr>
+                        </w:pPr>
+                        <w:r>
+                          <w:rPr>
+                            <w:b/>
+                            <w:bCs/>
+                            <w:color w:val="FFFFFF"/>
+                            <w:sz w:val="26"/>
+                            <w:szCs w:val="26"/>
+                          </w:rPr>
+                          <w:t>Filmtopia</w:t>
+                        </w:r>
+                      </w:p>
+                    </w:txbxContent>
+                  </ns8:textbox>
+                </ns8:rect>
+                <ns8:rect id="Label 7000548" ns9:spid="_x0000_s1320" style="position:absolute;left:1166;top:2333;width:19443;height:1506;visibility:visible;mso-wrap-style:square;v-text-anchor:middle" ns9:gfxdata="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" filled="f" stroked="f" strokeweight="1pt">
+                  <ns8:textbox inset="0,0,0,0">
+                    <w:txbxContent>
+                      <w:p ns2:paraId="7896FB8E" ns2:textId="77777777">
+                        <w:pPr>
+                          <w:rPr>
+                            <w:color w:val="D79ED7"/>
+                            <w:sz w:val="15"/>
+                            <w:szCs w:val="15"/>
+                          </w:rPr>
+                        </w:pPr>
+                        <w:r>
+                          <w:rPr>
+                            <w:color w:val="D79ED7"/>
+                            <w:sz w:val="15"/>
+                            <w:szCs w:val="15"/>
+                          </w:rPr>
+                          <w:t>Self service</w:t>
+                        </w:r>
+                      </w:p>
+                    </w:txbxContent>
+                  </ns8:textbox>
+                </ns8:rect>
+                <ns8:rect id="btnExitKiosk 7000685" ns9:spid="_x0000_s1321" style="position:absolute;left:51328;top:972;width:5833;height:1944;visibility:visible;mso-wrap-style:square;v-text-anchor:middle" ns9:gfxdata="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" filled="f" strokecolor="#8e5a8e" strokeweight=".5pt">
+                  <ns8:textbox inset=".54008mm,0,.54008mm,0">
+                    <w:txbxContent>
+                      <w:p ns2:paraId="78AF6D5E" ns2:textId="77777777">
+                        <w:pPr>
+                          <w:jc w:val="center"/>
+                          <w:rPr>
+                            <w:color w:val="D79ED7"/>
+                            <w:sz w:val="15"/>
+                            <w:szCs w:val="15"/>
+                          </w:rPr>
+                        </w:pPr>
+                        <w:r>
+                          <w:rPr>
+                            <w:color w:val="D79ED7"/>
+                            <w:sz w:val="15"/>
+                            <w:szCs w:val="15"/>
+                          </w:rPr>
+                          <w:t>Staff exit</w:t>
+                        </w:r>
+                      </w:p>
+                    </w:txbxContent>
+                  </ns8:textbox>
+                </ns8:rect>
+                <ns8:rect id="Label 7000822" ns9:spid="_x0000_s1322" style="position:absolute;left:1944;top:5638;width:31108;height:2712;visibility:visible;mso-wrap-style:square;v-text-anchor:middle" ns9:gfxdata="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" filled="f" stroked="f" strokeweight="1pt">
+                  <ns8:textbox inset="0,0,0,0">
+                    <w:txbxContent>
+                      <w:p ns2:paraId="0FD593C1" ns2:textId="77777777">
+                        <w:pPr>
+                          <w:rPr>
+                            <w:b/>
+                            <w:bCs/>
+                            <w:color w:val="BFBFBF"/>
+                            <w:sz w:val="28"/>
+                            <w:szCs w:val="28"/>
+                          </w:rPr>
+                        </w:pPr>
+                        <w:r>
+                          <w:rPr>
+                            <w:b/>
+                            <w:bCs/>
+                            <w:color w:val="BFBFBF"/>
+                            <w:sz w:val="28"/>
+                            <w:szCs w:val="28"/>
+                          </w:rPr>
+                          <w:t>Buy your tickets here</w:t>
+                        </w:r>
+                      </w:p>
+                    </w:txbxContent>
+                  </ns8:textbox>
+                </ns8:rect>
+                <ns8:rect id="Label 7000959" ns9:spid="_x0000_s1323" style="position:absolute;left:1944;top:8165;width:33052;height:1809;visibility:visible;mso-wrap-style:square;v-text-anchor:middle" ns9:gfxdata="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" filled="f" stroked="f" strokeweight="1pt">
+                  <ns8:textbox inset="0,0,0,0">
+                    <w:txbxContent>
+                      <w:p ns2:paraId="72F37F6B" ns2:textId="77777777">
+                        <w:pPr>
+                          <w:rPr>
+                            <w:color w:val="CFCFCF"/>
+                            <w:sz w:val="18"/>
+                            <w:szCs w:val="18"/>
+                          </w:rPr>
+                        </w:pPr>
+                        <w:r>
+                          <w:rPr>
+                            <w:color w:val="CFCFCF"/>
+                            <w:sz w:val="18"/>
+                            <w:szCs w:val="18"/>
+                          </w:rPr>
+                          <w:t>Pick a film, pick your seats, pay at the machine</w:t>
+                        </w:r>
+                      </w:p>
+                    </w:txbxContent>
+                  </ns8:textbox>
+                </ns8:rect>
+                <ns8:rect id="pnlExit 7001096" ns9:spid="_x0000_s1324" style="position:absolute;left:10693;top:10304;width:36941;height:14776;visibility:visible;mso-wrap-style:square;v-text-anchor:middle" ns9:gfxdata="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" strokecolor="#400040" strokeweight="1pt">
+                  <ns8:textbox inset="1.0801mm,0,1.0801mm,0"/>
+                </ns8:rect>
+                <ns8:rect id="Label 7001233" ns9:spid="_x0000_s1325" style="position:absolute;left:12637;top:11859;width:24303;height:2562;visibility:visible;mso-wrap-style:square;v-text-anchor:middle" ns9:gfxdata="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" filled="f" stroked="f" strokeweight="1pt">
+                  <ns8:textbox inset="0,0,0,0">
+                    <w:txbxContent>
+                      <w:p ns2:paraId="07F28889" ns2:textId="77777777">
+                        <w:pPr>
+                          <w:rPr>
+                            <w:b/>
+                            <w:bCs/>
+                            <w:color w:val="000000"/>
+                            <w:sz w:val="26"/>
+                            <w:szCs w:val="26"/>
+                          </w:rPr>
+                        </w:pPr>
+                        <w:r>
+                          <w:rPr>
+                            <w:b/>
+                            <w:bCs/>
+                            <w:color w:val="000000"/>
+                            <w:sz w:val="26"/>
+                            <w:szCs w:val="26"/>
+                          </w:rPr>
+                          <w:t>Staff exit</w:t>
+                        </w:r>
+                      </w:p>
+                    </w:txbxContent>
+                  </ns8:textbox>
+                </ns8:rect>
+                <ns8:rect id="Label 7001370" ns9:spid="_x0000_s1326" style="position:absolute;left:12637;top:14581;width:33052;height:1809;visibility:visible;mso-wrap-style:square;v-text-anchor:middle" ns9:gfxdata="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" filled="f" stroked="f" strokeweight="1pt">
+                  <ns8:textbox inset="0,0,0,0">
+                    <w:txbxContent>
+                      <w:p ns2:paraId="2A8E5BBB" ns2:textId="77777777">
+                        <w:pPr>
+                          <w:rPr>
+                            <w:color w:val="000000"/>
+                            <w:sz w:val="18"/>
+                            <w:szCs w:val="18"/>
+                          </w:rPr>
+                        </w:pPr>
+                        <w:r>
+                          <w:rPr>
+                            <w:color w:val="000000"/>
+                            <w:sz w:val="18"/>
+                            <w:szCs w:val="18"/>
+                          </w:rPr>
+                          <w:t>Enter your password to close the kiosk and go back to the</w:t>
+                        </w:r>
+                      </w:p>
+                    </w:txbxContent>
+                  </ns8:textbox>
+                </ns8:rect>
+                <ns8:rect id="Label 7001507" ns9:spid="_x0000_s1327" style="position:absolute;left:12637;top:16137;width:33052;height:1808;visibility:visible;mso-wrap-style:square;v-text-anchor:middle" ns9:gfxdata="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" filled="f" stroked="f" strokeweight="1pt">
+                  <ns8:textbox inset="0,0,0,0">
+                    <w:txbxContent>
+                      <w:p ns2:paraId="726DEF76" ns2:textId="77777777">
+                        <w:pPr>
+                          <w:rPr>
+                            <w:color w:val="000000"/>
+                            <w:sz w:val="18"/>
+                            <w:szCs w:val="18"/>
+                          </w:rPr>
+                        </w:pPr>
+                        <w:r>
+                          <w:rPr>
+                            <w:color w:val="000000"/>
+                            <w:sz w:val="18"/>
+                            <w:szCs w:val="18"/>
+                          </w:rPr>
+                          <w:t>main menu.</w:t>
+                        </w:r>
+                      </w:p>
+                    </w:txbxContent>
+                  </ns8:textbox>
+                </ns8:rect>
+                <ns8:rect id="TextBox 7001644" ns9:spid="_x0000_s1328" style="position:absolute;left:12637;top:18470;width:33052;height:2139;visibility:visible;mso-wrap-style:square;v-text-anchor:middle" ns9:gfxdata="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" strokecolor="#b4b4b4" strokeweight=".5pt">
+                  <ns8:textbox inset="1.0801mm,0,1.0801mm,0">
+                    <w:txbxContent>
+                      <w:p ns2:paraId="535D9C08" ns2:textId="77777777">
+                        <w:pPr>
+                          <w:rPr>
+                            <w:color w:val="000000"/>
+                            <w:sz w:val="18"/>
+                            <w:szCs w:val="18"/>
+                          </w:rPr>
+                        </w:pPr>
+                        <w:r>
+                          <w:rPr>
+                            <w:color w:val="000000"/>
+                            <w:sz w:val="18"/>
+                            <w:szCs w:val="18"/>
+                          </w:rPr>
+                          <w:t>●●●●●●●●</w:t>
+                        </w:r>
+                      </w:p>
+                    </w:txbxContent>
+                  </ns8:textbox>
+                </ns8:rect>
+                <ns8:rect id="Button 7001781" ns9:spid="_x0000_s1329" style="position:absolute;left:29163;top:21775;width:7583;height:2139;visibility:visible;mso-wrap-style:square;v-text-anchor:middle" ns9:gfxdata="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" fillcolor="#f0f0f0" strokecolor="#b4b4b4" strokeweight=".5pt">
+                  <ns8:textbox inset=".54008mm,0,.54008mm,0">
+                    <w:txbxContent>
+                      <w:p ns2:paraId="79051113" ns2:textId="77777777">
+                        <w:pPr>
+                          <w:jc w:val="center"/>
+                          <w:rPr>
+                            <w:color w:val="000000"/>
+                            <w:sz w:val="17"/>
+                            <w:szCs w:val="17"/>
+                          </w:rPr>
+                        </w:pPr>
+                        <w:r>
+                          <w:rPr>
+                            <w:color w:val="000000"/>
+                            <w:sz w:val="17"/>
+                            <w:szCs w:val="17"/>
+                          </w:rPr>
+                          <w:t>Cancel</w:t>
+                        </w:r>
+                      </w:p>
+                    </w:txbxContent>
+                  </ns8:textbox>
+                </ns8:rect>
+                <ns8:rect id="Button 7001918" ns9:spid="_x0000_s1330" style="position:absolute;left:37718;top:21775;width:7971;height:2139;visibility:visible;mso-wrap-style:square;v-text-anchor:middle" ns9:gfxdata="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" fillcolor="#a02b93" strokecolor="#a02b93" strokeweight=".5pt">
+                  <ns8:textbox inset=".54008mm,0,.54008mm,0">
+                    <w:txbxContent>
+                      <w:p ns2:paraId="398AA2D6" ns2:textId="77777777">
+                        <w:pPr>
+                          <w:jc w:val="center"/>
+                          <w:rPr>
+                            <w:b/>
+                            <w:bCs/>
+                            <w:color w:val="FFFFFF"/>
+                            <w:sz w:val="17"/>
+                            <w:szCs w:val="17"/>
+                          </w:rPr>
+                        </w:pPr>
+                        <w:r>
+                          <w:rPr>
+                            <w:b/>
+                            <w:bCs/>
+                            <w:color w:val="FFFFFF"/>
+                            <w:sz w:val="17"/>
+                            <w:szCs w:val="17"/>
+                          </w:rPr>
+                          <w:t>Close kiosk</w:t>
+                        </w:r>
+                      </w:p>
+                    </w:txbxContent>
+                  </ns8:textbox>
+                </ns8:rect>
+                <ns8:rect id="Label 7002055" ns9:spid="_x0000_s1331" style="position:absolute;left:1944;top:26636;width:55411;height:1507;visibility:visible;mso-wrap-style:square;v-text-anchor:middle" ns9:gfxdata="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" filled="f" stroked="f" strokeweight="1pt">
+                  <ns8:textbox inset="0,0,0,0">
+                    <w:txbxContent>
+                      <w:p ns2:paraId="07F27786" ns2:textId="77777777">
+                        <w:pPr>
+                          <w:rPr>
+                            <w:color w:val="808080"/>
+                            <w:sz w:val="15"/>
+                            <w:szCs w:val="15"/>
+                          </w:rPr>
+                        </w:pPr>
+                        <w:r>
+                          <w:rPr>
+                            <w:color w:val="808080"/>
+                            <w:sz w:val="15"/>
+                            <w:szCs w:val="15"/>
+                          </w:rPr>
+                          <w:t>A wrong password leaves the kiosk exactly where it was and writes a Security entry to the audit log.</w:t>
+                        </w:r>
+                      </w:p>
+                    </w:txbxContent>
+                  </ns8:textbox>
+                </ns8:rect>
+                <ns10:anchorlock/>
+              </ns8:group>
+            </w:pict>
+          </ns1:Fallback>
+        </ns1:AlternateContent>
+      </w:r>
+    </w:p>
+    <w:p ns2:paraId="76D46A56" ns2:textId="77777777"/>
     <w:sectPr>
       <w:headerReference w:type="even" ns11:id="rId7"/>
       <w:headerReference w:type="default" ns11:id="rId8"/>

</xml_diff>